<commit_message>
Document measured GMP square boundary and refresh four manuscripts
</commit_message>
<xml_diff>
--- a/papers/2026-10-16/en/manuscript.docx
+++ b/papers/2026-10-16/en/manuscript.docx
@@ -58,7 +58,16 @@
     </w:p>
     <w:p>
       <w:r>
-        <w:t>This study examines a reproducible workflow for computing and writing the ten billionth Fibonacci number on a 32 GB home computer. Established two-square recurrence and bounded-leaf decimal conversion are combined with isolated execution and explicit validation. New experiments used an Intel Core i5-14400F host, Windows 11 and WSL2 Ubuntu. Four arithmetic implementations were measured five times at each of four index sizes. Native Windows Python/GMP failed reproducibly at the same final square for n=8 billion in both gmpy2 2.2.1 and 2.3.1. WSL2 completed that index in three trials. At n=10 billion, three WSL2 trials had median arithmetic and conversion-with-close times of 56.95 s and 551.98 s; the median process peak RSS was 5.10 GiB. One native Windows MPIR v1.1.0 full-output run completed with process wall time 2592.93 s and observed peak working set 8.05 GiB. All four repair-path outputs and a newly generated native Linux GMP reference contain 2,089,876,403 digits and share one SHA-256 digest. Isolated probes identify a wrapped allocation size in the examined Windows GMP DLL; the exact internal expression remains unlocated.</w:t>
+        <w:t>We tested complete computation and decimal output of F(10</w:t>
+      </w:r>
+      <w:r>
+        <w:rPr>
+          <w:vertAlign w:val="superscript"/>
+        </w:rPr>
+        <w:t>10</w:t>
+      </w:r>
+      <w:r>
+        <w:t>) on a 32 GB home computer using repeated WSL2/Linux trials and a native Windows MPIR run. Two different Windows GMP DLLs failed at the last F(8 billion) square. Independent sparse-square and C probes found the same adjacent outcomes in both DLLs: 2,147,352,576 operand bits succeeded and 2,147,352,577 failed with a wrapped 64-bit allocation request. Three WSL2 outputs and one MPIR output each contain 2,089,876,403 digits and match a new direct Linux GMP reference by SHA-256. The source expression behind the wrapped request remains unlocated; the observed boundary applies to the tested builds and sparse inputs.</w:t>
       </w:r>
     </w:p>
     <w:p>
@@ -114,7 +123,7 @@
     </w:p>
     <w:p>
       <w:r>
-        <w:t>The project began with naive recursion and matrix exponentiation, followed by fast doubling, Lucas and two-square algorithms. Despite repeated algorithmic improvements, attempts to compute and write the ten-billionth term failed for an extended period. The author's GitHub searches at that time did not find a directly usable record of complete computation and output at the same scale. Layer diagnostics eventually placed the native Windows failure at a large-integer square. The error appeared to request about 4 GiB, but a full-width allocator trace later showed a request of 2</w:t>
+        <w:t>The project began with naive recursion and matrix exponentiation, followed by fast doubling, Lucas and two-square algorithms. Despite repeated algorithmic improvements, attempts to compute and write the ten-billionth term failed for an extended period. The author's exploratory GitHub search did not locate a directly usable same-scale output record; its queries and date were not retained, so no priority claim follows. Layer diagnostics eventually placed the native Windows failure at a large-integer square. The error appeared to request about 4 GiB, but a full-width allocator trace later showed a request of 2</w:t>
       </w:r>
       <w:r>
         <w:rPr>
@@ -367,7 +376,16 @@
     </w:p>
     <w:p>
       <w:r>
-        <w:t>The code applies an explicit floor before integer conversion. This avoids depending on the conversion rounding behavior of the installed binding. gmpy2 documents that num_digits can overestimate a non-power-of-two radix width by one [9]; such a width is unsuitable for padding output without further checking. The computed width is confirmed against the archived target file in this study. A fixed MPFR precision is not presented as a formal certification for arbitrarily large input indices.</w:t>
+        <w:t>The code applies an explicit floor before integer conversion. This avoids depending on the conversion rounding behavior of the installed binding. gmpy2 documents that num_digits can overestimate a non-power-of-two radix width by one [9]; such a width is unsuitable for padding output without further checking. At n=10</w:t>
+      </w:r>
+      <w:r>
+        <w:rPr>
+          <w:vertAlign w:val="superscript"/>
+        </w:rPr>
+        <w:t>10</w:t>
+      </w:r>
+      <w:r>
+        <w:t>, 256-bit and 1024-bit MPFR evaluations both give 2,089,876,402 before adding one; the 1024-bit fractional part is 0.1503023355... and the two values differ by about 1.11e-68. This numerical cross-check is not a formal interval proof. The output length agrees with the resulting 2,089,876,403 digits. A fixed MPFR precision is not presented as a formal certification for arbitrarily large input indices.</w:t>
       </w:r>
     </w:p>
     <w:p>
@@ -522,7 +540,7 @@
     </w:p>
     <w:p>
       <w:r>
-        <w:t>Experiments were run on 15 October 2026 on an Intel Core i5-14400F host with 10 physical cores, 16 logical processors and 34,072,674,304 bytes of visible physical memory. Windows reported build 27766. The failing native path used Python 3.13.7 and gmpy2 2.3.1 with GMP 6.3.0; an isolated official PyPI wheel supplied gmpy2 2.2.1 for two further failure trials. WSL2 Ubuntu used Python 3.12.3, gmpy2 2.1.5 and GMP 6.3.0, with a 5.15.167.4 WSL2 kernel. Its visible memory was 16,240,976 KiB and swap 4 GiB. These are distinct runtime builds, not an operating-system-only controlled comparison. Raw environment records accompany every Linux trial.</w:t>
+        <w:t>Experiments were run on 15 October 2026 on an Intel Core i5-14400F host with 10 physical cores, 16 logical processors and 34,072,674,304 bytes of visible physical memory. Windows reported build 27766. The failing native path used Python 3.13.7 and gmpy2 2.3.1 with GMP 6.3.0; a downloaded PyPI wheel (SHA-256 74235fcce8a1bee207bf8d43955cb04563f71ba8231a3bbafc6dd7869503d05c) supplied gmpy2 2.2.1 for two further failure trials. Its bundled `libgmp-10.dll` has SHA-256 `fb2d312ca861c18e8b23648ac8440b0b613b1930ceff58f48b48ba2d3bd6b186`, distinct from the 2.3.1 DLL. Both report GMP 6.3.0; compiler and build flags are not established by wheel metadata. WSL2 Ubuntu used Python 3.12.3, gmpy2 2.1.5 and GMP 6.3.0, with a 5.15.167.4 WSL2 kernel. Its visible memory was 16,240,976 KiB and swap 4 GiB. These are distinct runtime builds, not an operating-system-only controlled comparison. Raw environment records accompany every Linux trial.</w:t>
       </w:r>
     </w:p>
     <w:p>
@@ -614,7 +632,7 @@
         <w:t>100</w:t>
       </w:r>
       <w:r>
-        <w:t xml:space="preserve"> by a bounded-integer fast-doubling implementation. These checks test arithmetic consistency but do not prove every digit correct. Each complete decimal output is counted, checked for non-digits and hashed in bounded chunks. Primary byte comparisons use the new native GMP file and the four new repair-path outputs, removing documented headers and ASCII whitespace. Retained 2024 artifacts are compared separately for the historical audit. Full agreement is a stronger artifact check than endpoints alone; shared algorithms and libraries still limit implementation independence.</w:t>
+        <w:t xml:space="preserve"> by a bounded-integer fast-doubling implementation. These checks test arithmetic consistency but do not prove every digit correct. The new native reference was streamed once more: decimal digit sums gave mod 9 = 6 and mod 11 = 0, matching bounded Fibonacci residues. Cassini's identity held modulo 1,000,000,007, 1,000,000,009 and 2,147,483,647; a period-based check gave last five digits 46875 and a separate 90-digit logarithm gave first five digits 14135. The other four new payloads share the reference's SHA-256. Each complete output is counted, checked for non-digits and hashed in bounded chunks. Primary byte comparisons use the new native GMP file and the four new repair-path outputs, removing documented headers and ASCII whitespace. Retained 2024 artifacts are compared separately for the historical audit. Full agreement is a stronger artifact check than endpoints alone; shared algorithms and libraries still limit implementation independence.</w:t>
       </w:r>
     </w:p>
     <w:p>
@@ -1776,7 +1794,12 @@
     </w:p>
     <w:p>
       <w:r>
-        <w:t>The two native gmpy2 2.3.1 trials and two isolated gmpy2 2.2.1 trials failed at layer 32/32, the first square of a 2,776,967,654-bit operand, before decimal conversion. The preserved stderr contains GNU MP: Cannot allocate memory (size=4294597664). The current 2.3.1 trials exited with code 3 rather than the historical report's 0xC0000409. No watchdog termination was involved. For the two gmpy2 2.3.1 failures, the median observed peak working set was 1.82 GiB and median peak private commitment was 2.46 GiB; these are distinct Windows counters. In the two gmpy2 2.3.1 runs, more than 10 GiB of physical memory remained available at the last pre-failure diagnostic. Available physical memory alone does not identify the failure; the full-width allocation trace and isolated tests below resolve the nature of the requested size. A separate allocator trace delegated to the original GMP allocation functions and recorded full-width size_t arguments before gmpy2 initialization. Its allocation values and log are supplied separately; traced timings are excluded from performance summaries. The largest recorded request was 18,446,744,073,709,181,984 bytes. This near-limit 64-bit size_t value has low 32 bits equal to 4,294,597,664, matching the displayed stderr size. The displayed value therefore must not be interpreted as the full allocation request. The request equals 2</w:t>
+        <w:t>The two native gmpy2 2.3.1 trials and two isolated gmpy2 2.2.1 trials failed at layer 32/32, the first square of a 2,776,967,654-bit operand, before decimal conversion. The preserved stderr contains GNU MP: Cannot allocate memory (size=4294597664). The current 2.3.1 trials exited with code 3 rather than the historical report's 0xC0000409. No watchdog termination was involved. Median peak working set and private commitment were 1.82 and 2.46 GiB for gmpy2 2.3.1, and 1.81 and 2.46 GiB for 2.2.1, respectively; these are distinct Windows counters. In the two gmpy2 2.3.1 runs, more than 10 GiB of physical memory remained available at the last pre-failure diagnostic. Available physical memory alone does not identify the failure; the full-width allocation trace and isolated tests below resolve the nature of the requested size.</w:t>
+      </w:r>
+    </w:p>
+    <w:p>
+      <w:r>
+        <w:t>A separate allocator trace delegated to the original GMP allocation functions and recorded full-width size_t arguments before gmpy2 initialization. Its allocation values and log are supplied separately; traced timings are excluded from performance summaries. The largest recorded request was 18,446,744,073,709,181,984 bytes. This near-limit 64-bit size_t value has low 32 bits equal to 4,294,597,664, matching the displayed stderr size. The request equals 2</w:t>
       </w:r>
       <w:r>
         <w:rPr>
@@ -1785,7 +1808,30 @@
         <w:t>64</w:t>
       </w:r>
       <w:r>
-        <w:t xml:space="preserve"> minus 369,632 bytes; interpreted as a signed 64-bit integer, the same bit pattern is -369,632. Its low 32 bits explain the misleading near-4-GiB error text. On 16 October 2026, a separate process squared a b-bit integer with only its highest bit set: b=2,140,000,000 succeeded, whereas b=2,147,483,647 failed with a near-2</w:t>
+        <w:t xml:space="preserve"> minus 369,632 bytes; interpreted as a signed 64-bit integer, the same bit pattern is -369,632.</w:t>
+      </w:r>
+    </w:p>
+    <w:p>
+      <w:r>
+        <w:t>On 16 October 2026, protected processes squared b-bit sparse operands with only the highest bit set. Binary search recorded adjacent outcomes: b=2,147,352,576 succeeded and b=2,147,352,577 failed. The first failed input equals 2</w:t>
+      </w:r>
+      <w:r>
+        <w:rPr>
+          <w:vertAlign w:val="superscript"/>
+        </w:rPr>
+        <w:t>31</w:t>
+      </w:r>
+      <w:r>
+        <w:t>-2</w:t>
+      </w:r>
+      <w:r>
+        <w:rPr>
+          <w:vertAlign w:val="superscript"/>
+        </w:rPr>
+        <w:t>17</w:t>
+      </w:r>
+      <w:r>
+        <w:t>+1 bits; its mathematical square has 4,294,705,153 bits or 67,104,769 64-bit limbs. GMP documents 32-bit `mpz_t` size fields in limb units [13]; 67,104,769 is far below 2,147,483,647 limbs, so that generic capacity does not explain the observed boundary. The same adjacent outcomes were reproduced by direct DLL calls and by a separately compiled Visual Studio 2019 x64 C program. Its core calls are `mpz_init_set_ui(x,1); mpz_init(y); mpz_mul_2exp(x,x,b-1); mpz_mul(y,x,x);`; the complete guarded reproducer is supplied. The installed 2.3.1 binary was `C:/Users/lusun/AppData/Roaming/Python/Python313/site-packages/gmpy2.libs/libgmp-10.dll` (SHA-256 `829adcf025d22e641c6816b431fbe5b226a39b390c7205192d480151646fe9c9`). The distinct 2.2.1 wheel DLL (SHA-256 `fb2d312ca861c18e8b23648ac8440b0b613b1930ceff58f48b48ba2d3bd6b186`) had the same adjacent outcomes and a full-width failed request of 2</w:t>
       </w:r>
       <w:r>
         <w:rPr>
@@ -1794,9 +1840,502 @@
         <w:t>64</w:t>
       </w:r>
       <w:r>
-        <w:t xml:space="preserve"> allocation request. Calling mpz_mul directly in the same Windows GMP DLL, without importing gmpy2, gave the same two outcomes. The fault is therefore in this DLL's large-operand square/multiplication path or its allocation-size propagation, rather than requiring the Fibonacci recurrence, decimal conversion or Python binding. The observed wraparound supports a size-arithmetic fault; its specific expression and internal multiplication branch remain unlocated. The isolated probes, full-width traces and DLL hash are supplied with the supplementary evidence.</w:t>
+        <w:t>-523,232 bytes. The C runs confirmed both binaries, but did not measure the internal FFT rounded length or identify a source expression. The fault is therefore in the examined DLLs' large-operand square/multiplication paths or allocation-size propagation, rather than requiring the Fibonacci recurrence, decimal conversion or Python binding. The observed wraparound supports a size-arithmetic fault; its specific expression and internal multiplication branch remain unlocated. The isolated probes, full-width traces and both DLL hashes are supplied with the supplementary evidence. The adjacent pair is an observed sparse-input transition, not a proven universal minimum; FFT rounding length remains unmeasured.</w:t>
       </w:r>
     </w:p>
+    <w:p>
+      <w:pPr>
+        <w:pStyle w:val="Caption"/>
+      </w:pPr>
+      <w:r>
+        <w:t>Table 2. Adjacent observed outcomes for sparse-operand squaring in the tested DLL</w:t>
+      </w:r>
+    </w:p>
+    <w:tbl>
+      <w:tblPr>
+        <w:tblW w:type="auto" w:w="0"/>
+        <w:tblLayout w:type="fixed"/>
+        <w:tblLook w:firstColumn="1" w:firstRow="1" w:lastColumn="0" w:lastRow="0" w:noHBand="0" w:noVBand="1" w:val="04A0"/>
+      </w:tblPr>
+      <w:tblGrid>
+        <w:gridCol w:w="2256"/>
+        <w:gridCol w:w="2256"/>
+        <w:gridCol w:w="2256"/>
+        <w:gridCol w:w="2256"/>
+      </w:tblGrid>
+      <w:tr>
+        <w:trPr>
+          <w:cantSplit/>
+          <w:tblHeader/>
+        </w:trPr>
+        <w:tc>
+          <w:tcPr>
+            <w:tcW w:type="dxa" w:w="1710"/>
+            <w:tcBorders>
+              <w:top w:val="single" w:sz="4" w:color="D9D9D9"/>
+              <w:left w:val="single" w:sz="4" w:color="D9D9D9"/>
+              <w:bottom w:val="single" w:sz="4" w:color="D9D9D9"/>
+              <w:right w:val="single" w:sz="4" w:color="D9D9D9"/>
+              <w:insideH w:val="single" w:sz="4" w:color="D9D9D9"/>
+              <w:insideV w:val="single" w:sz="4" w:color="D9D9D9"/>
+            </w:tcBorders>
+            <w:tcMar>
+              <w:top w:w="65" w:type="dxa"/>
+              <w:left w:w="65" w:type="dxa"/>
+              <w:bottom w:w="65" w:type="dxa"/>
+              <w:right w:w="65" w:type="dxa"/>
+            </w:tcMar>
+            <w:shd w:fill="EDF0F2"/>
+          </w:tcPr>
+          <w:p>
+            <w:pPr>
+              <w:spacing w:after="40" w:before="40" w:line="240" w:lineRule="auto"/>
+              <w:jc w:val="center"/>
+            </w:pPr>
+            <w:r>
+              <w:rPr>
+                <w:rFonts w:ascii="Times New Roman" w:hAnsi="Times New Roman"/>
+                <w:b/>
+                <w:sz w:val="20"/>
+              </w:rPr>
+              <w:t>Operand bits b</w:t>
+            </w:r>
+          </w:p>
+        </w:tc>
+        <w:tc>
+          <w:tcPr>
+            <w:tcW w:type="dxa" w:w="2430"/>
+            <w:tcBorders>
+              <w:top w:val="single" w:sz="4" w:color="D9D9D9"/>
+              <w:left w:val="single" w:sz="4" w:color="D9D9D9"/>
+              <w:bottom w:val="single" w:sz="4" w:color="D9D9D9"/>
+              <w:right w:val="single" w:sz="4" w:color="D9D9D9"/>
+              <w:insideH w:val="single" w:sz="4" w:color="D9D9D9"/>
+              <w:insideV w:val="single" w:sz="4" w:color="D9D9D9"/>
+            </w:tcBorders>
+            <w:tcMar>
+              <w:top w:w="65" w:type="dxa"/>
+              <w:left w:w="65" w:type="dxa"/>
+              <w:bottom w:w="65" w:type="dxa"/>
+              <w:right w:w="65" w:type="dxa"/>
+            </w:tcMar>
+            <w:shd w:fill="EDF0F2"/>
+          </w:tcPr>
+          <w:p>
+            <w:pPr>
+              <w:spacing w:after="40" w:before="40" w:line="240" w:lineRule="auto"/>
+              <w:jc w:val="center"/>
+            </w:pPr>
+            <w:r>
+              <w:rPr>
+                <w:rFonts w:ascii="Times New Roman" w:hAnsi="Times New Roman"/>
+                <w:b/>
+                <w:sz w:val="20"/>
+              </w:rPr>
+              <w:t>Result bits</w:t>
+            </w:r>
+          </w:p>
+        </w:tc>
+        <w:tc>
+          <w:tcPr>
+            <w:tcW w:type="dxa" w:w="2430"/>
+            <w:tcBorders>
+              <w:top w:val="single" w:sz="4" w:color="D9D9D9"/>
+              <w:left w:val="single" w:sz="4" w:color="D9D9D9"/>
+              <w:bottom w:val="single" w:sz="4" w:color="D9D9D9"/>
+              <w:right w:val="single" w:sz="4" w:color="D9D9D9"/>
+              <w:insideH w:val="single" w:sz="4" w:color="D9D9D9"/>
+              <w:insideV w:val="single" w:sz="4" w:color="D9D9D9"/>
+            </w:tcBorders>
+            <w:tcMar>
+              <w:top w:w="65" w:type="dxa"/>
+              <w:left w:w="65" w:type="dxa"/>
+              <w:bottom w:w="65" w:type="dxa"/>
+              <w:right w:w="65" w:type="dxa"/>
+            </w:tcMar>
+            <w:shd w:fill="EDF0F2"/>
+          </w:tcPr>
+          <w:p>
+            <w:pPr>
+              <w:spacing w:after="40" w:before="40" w:line="240" w:lineRule="auto"/>
+              <w:jc w:val="center"/>
+            </w:pPr>
+            <w:r>
+              <w:rPr>
+                <w:rFonts w:ascii="Times New Roman" w:hAnsi="Times New Roman"/>
+                <w:b/>
+                <w:sz w:val="20"/>
+              </w:rPr>
+              <w:t>64-bit limbs</w:t>
+            </w:r>
+          </w:p>
+        </w:tc>
+        <w:tc>
+          <w:tcPr>
+            <w:tcW w:type="dxa" w:w="2430"/>
+            <w:tcBorders>
+              <w:top w:val="single" w:sz="4" w:color="D9D9D9"/>
+              <w:left w:val="single" w:sz="4" w:color="D9D9D9"/>
+              <w:bottom w:val="single" w:sz="4" w:color="D9D9D9"/>
+              <w:right w:val="single" w:sz="4" w:color="D9D9D9"/>
+              <w:insideH w:val="single" w:sz="4" w:color="D9D9D9"/>
+              <w:insideV w:val="single" w:sz="4" w:color="D9D9D9"/>
+            </w:tcBorders>
+            <w:tcMar>
+              <w:top w:w="65" w:type="dxa"/>
+              <w:left w:w="65" w:type="dxa"/>
+              <w:bottom w:w="65" w:type="dxa"/>
+              <w:right w:w="65" w:type="dxa"/>
+            </w:tcMar>
+            <w:shd w:fill="EDF0F2"/>
+          </w:tcPr>
+          <w:p>
+            <w:pPr>
+              <w:spacing w:after="40" w:before="40" w:line="240" w:lineRule="auto"/>
+              <w:jc w:val="center"/>
+            </w:pPr>
+            <w:r>
+              <w:rPr>
+                <w:rFonts w:ascii="Times New Roman" w:hAnsi="Times New Roman"/>
+                <w:b/>
+                <w:sz w:val="20"/>
+              </w:rPr>
+              <w:t>Observed result</w:t>
+            </w:r>
+          </w:p>
+        </w:tc>
+      </w:tr>
+      <w:tr>
+        <w:trPr>
+          <w:cantSplit/>
+        </w:trPr>
+        <w:tc>
+          <w:tcPr>
+            <w:tcW w:type="dxa" w:w="1710"/>
+            <w:tcBorders>
+              <w:top w:val="single" w:sz="4" w:color="D9D9D9"/>
+              <w:left w:val="single" w:sz="4" w:color="D9D9D9"/>
+              <w:bottom w:val="single" w:sz="4" w:color="D9D9D9"/>
+              <w:right w:val="single" w:sz="4" w:color="D9D9D9"/>
+              <w:insideH w:val="single" w:sz="4" w:color="D9D9D9"/>
+              <w:insideV w:val="single" w:sz="4" w:color="D9D9D9"/>
+            </w:tcBorders>
+            <w:tcMar>
+              <w:top w:w="65" w:type="dxa"/>
+              <w:left w:w="65" w:type="dxa"/>
+              <w:bottom w:w="65" w:type="dxa"/>
+              <w:right w:w="65" w:type="dxa"/>
+            </w:tcMar>
+          </w:tcPr>
+          <w:p>
+            <w:pPr>
+              <w:spacing w:after="40" w:before="40" w:line="240" w:lineRule="auto"/>
+              <w:jc w:val="center"/>
+            </w:pPr>
+            <w:r>
+              <w:rPr>
+                <w:rFonts w:ascii="Times New Roman" w:hAnsi="Times New Roman"/>
+                <w:b w:val="0"/>
+                <w:sz w:val="20"/>
+              </w:rPr>
+            </w:r>
+            <w:r>
+              <w:rPr>
+                <w:rFonts w:ascii="Times New Roman" w:hAnsi="Times New Roman"/>
+                <w:b w:val="0"/>
+                <w:sz w:val="20"/>
+              </w:rPr>
+              <w:t>2,147,352,576</w:t>
+            </w:r>
+          </w:p>
+        </w:tc>
+        <w:tc>
+          <w:tcPr>
+            <w:tcW w:type="dxa" w:w="2430"/>
+            <w:tcBorders>
+              <w:top w:val="single" w:sz="4" w:color="D9D9D9"/>
+              <w:left w:val="single" w:sz="4" w:color="D9D9D9"/>
+              <w:bottom w:val="single" w:sz="4" w:color="D9D9D9"/>
+              <w:right w:val="single" w:sz="4" w:color="D9D9D9"/>
+              <w:insideH w:val="single" w:sz="4" w:color="D9D9D9"/>
+              <w:insideV w:val="single" w:sz="4" w:color="D9D9D9"/>
+            </w:tcBorders>
+            <w:tcMar>
+              <w:top w:w="65" w:type="dxa"/>
+              <w:left w:w="65" w:type="dxa"/>
+              <w:bottom w:w="65" w:type="dxa"/>
+              <w:right w:w="65" w:type="dxa"/>
+            </w:tcMar>
+          </w:tcPr>
+          <w:p>
+            <w:pPr>
+              <w:spacing w:after="40" w:before="40" w:line="240" w:lineRule="auto"/>
+              <w:jc w:val="center"/>
+            </w:pPr>
+            <w:r>
+              <w:rPr>
+                <w:rFonts w:ascii="Times New Roman" w:hAnsi="Times New Roman"/>
+                <w:b w:val="0"/>
+                <w:sz w:val="20"/>
+              </w:rPr>
+            </w:r>
+            <w:r>
+              <w:rPr>
+                <w:rFonts w:ascii="Times New Roman" w:hAnsi="Times New Roman"/>
+                <w:b w:val="0"/>
+                <w:sz w:val="20"/>
+              </w:rPr>
+              <w:t>4,294,705,151</w:t>
+            </w:r>
+          </w:p>
+        </w:tc>
+        <w:tc>
+          <w:tcPr>
+            <w:tcW w:type="dxa" w:w="2430"/>
+            <w:tcBorders>
+              <w:top w:val="single" w:sz="4" w:color="D9D9D9"/>
+              <w:left w:val="single" w:sz="4" w:color="D9D9D9"/>
+              <w:bottom w:val="single" w:sz="4" w:color="D9D9D9"/>
+              <w:right w:val="single" w:sz="4" w:color="D9D9D9"/>
+              <w:insideH w:val="single" w:sz="4" w:color="D9D9D9"/>
+              <w:insideV w:val="single" w:sz="4" w:color="D9D9D9"/>
+            </w:tcBorders>
+            <w:tcMar>
+              <w:top w:w="65" w:type="dxa"/>
+              <w:left w:w="65" w:type="dxa"/>
+              <w:bottom w:w="65" w:type="dxa"/>
+              <w:right w:w="65" w:type="dxa"/>
+            </w:tcMar>
+          </w:tcPr>
+          <w:p>
+            <w:pPr>
+              <w:spacing w:after="40" w:before="40" w:line="240" w:lineRule="auto"/>
+              <w:jc w:val="center"/>
+            </w:pPr>
+            <w:r>
+              <w:rPr>
+                <w:rFonts w:ascii="Times New Roman" w:hAnsi="Times New Roman"/>
+                <w:b w:val="0"/>
+                <w:sz w:val="20"/>
+              </w:rPr>
+            </w:r>
+            <w:r>
+              <w:rPr>
+                <w:rFonts w:ascii="Times New Roman" w:hAnsi="Times New Roman"/>
+                <w:b w:val="0"/>
+                <w:sz w:val="20"/>
+              </w:rPr>
+              <w:t>67,104,768</w:t>
+            </w:r>
+          </w:p>
+        </w:tc>
+        <w:tc>
+          <w:tcPr>
+            <w:tcW w:type="dxa" w:w="2430"/>
+            <w:tcBorders>
+              <w:top w:val="single" w:sz="4" w:color="D9D9D9"/>
+              <w:left w:val="single" w:sz="4" w:color="D9D9D9"/>
+              <w:bottom w:val="single" w:sz="4" w:color="D9D9D9"/>
+              <w:right w:val="single" w:sz="4" w:color="D9D9D9"/>
+              <w:insideH w:val="single" w:sz="4" w:color="D9D9D9"/>
+              <w:insideV w:val="single" w:sz="4" w:color="D9D9D9"/>
+            </w:tcBorders>
+            <w:tcMar>
+              <w:top w:w="65" w:type="dxa"/>
+              <w:left w:w="65" w:type="dxa"/>
+              <w:bottom w:w="65" w:type="dxa"/>
+              <w:right w:w="65" w:type="dxa"/>
+            </w:tcMar>
+          </w:tcPr>
+          <w:p>
+            <w:pPr>
+              <w:spacing w:after="40" w:before="40" w:line="240" w:lineRule="auto"/>
+              <w:jc w:val="center"/>
+            </w:pPr>
+            <w:r>
+              <w:rPr>
+                <w:rFonts w:ascii="Times New Roman" w:hAnsi="Times New Roman"/>
+                <w:b w:val="0"/>
+                <w:sz w:val="20"/>
+              </w:rPr>
+            </w:r>
+            <w:r>
+              <w:rPr>
+                <w:rFonts w:ascii="Times New Roman" w:hAnsi="Times New Roman"/>
+                <w:b w:val="0"/>
+                <w:sz w:val="20"/>
+              </w:rPr>
+              <w:t>Succeeded</w:t>
+            </w:r>
+          </w:p>
+        </w:tc>
+      </w:tr>
+      <w:tr>
+        <w:trPr>
+          <w:cantSplit/>
+        </w:trPr>
+        <w:tc>
+          <w:tcPr>
+            <w:tcW w:type="dxa" w:w="1710"/>
+            <w:tcBorders>
+              <w:top w:val="single" w:sz="4" w:color="D9D9D9"/>
+              <w:left w:val="single" w:sz="4" w:color="D9D9D9"/>
+              <w:bottom w:val="single" w:sz="4" w:color="D9D9D9"/>
+              <w:right w:val="single" w:sz="4" w:color="D9D9D9"/>
+              <w:insideH w:val="single" w:sz="4" w:color="D9D9D9"/>
+              <w:insideV w:val="single" w:sz="4" w:color="D9D9D9"/>
+            </w:tcBorders>
+            <w:tcMar>
+              <w:top w:w="65" w:type="dxa"/>
+              <w:left w:w="65" w:type="dxa"/>
+              <w:bottom w:w="65" w:type="dxa"/>
+              <w:right w:w="65" w:type="dxa"/>
+            </w:tcMar>
+          </w:tcPr>
+          <w:p>
+            <w:pPr>
+              <w:spacing w:after="40" w:before="40" w:line="240" w:lineRule="auto"/>
+              <w:jc w:val="center"/>
+            </w:pPr>
+            <w:r>
+              <w:rPr>
+                <w:rFonts w:ascii="Times New Roman" w:hAnsi="Times New Roman"/>
+                <w:b w:val="0"/>
+                <w:sz w:val="20"/>
+              </w:rPr>
+            </w:r>
+            <w:r>
+              <w:rPr>
+                <w:rFonts w:ascii="Times New Roman" w:hAnsi="Times New Roman"/>
+                <w:b w:val="0"/>
+                <w:sz w:val="20"/>
+              </w:rPr>
+              <w:t>2,147,352,577</w:t>
+            </w:r>
+          </w:p>
+        </w:tc>
+        <w:tc>
+          <w:tcPr>
+            <w:tcW w:type="dxa" w:w="2430"/>
+            <w:tcBorders>
+              <w:top w:val="single" w:sz="4" w:color="D9D9D9"/>
+              <w:left w:val="single" w:sz="4" w:color="D9D9D9"/>
+              <w:bottom w:val="single" w:sz="4" w:color="D9D9D9"/>
+              <w:right w:val="single" w:sz="4" w:color="D9D9D9"/>
+              <w:insideH w:val="single" w:sz="4" w:color="D9D9D9"/>
+              <w:insideV w:val="single" w:sz="4" w:color="D9D9D9"/>
+            </w:tcBorders>
+            <w:tcMar>
+              <w:top w:w="65" w:type="dxa"/>
+              <w:left w:w="65" w:type="dxa"/>
+              <w:bottom w:w="65" w:type="dxa"/>
+              <w:right w:w="65" w:type="dxa"/>
+            </w:tcMar>
+          </w:tcPr>
+          <w:p>
+            <w:pPr>
+              <w:spacing w:after="40" w:before="40" w:line="240" w:lineRule="auto"/>
+              <w:jc w:val="center"/>
+            </w:pPr>
+            <w:r>
+              <w:rPr>
+                <w:rFonts w:ascii="Times New Roman" w:hAnsi="Times New Roman"/>
+                <w:b w:val="0"/>
+                <w:sz w:val="20"/>
+              </w:rPr>
+            </w:r>
+            <w:r>
+              <w:rPr>
+                <w:rFonts w:ascii="Times New Roman" w:hAnsi="Times New Roman"/>
+                <w:b w:val="0"/>
+                <w:sz w:val="20"/>
+              </w:rPr>
+              <w:t>4,294,705,153</w:t>
+            </w:r>
+          </w:p>
+        </w:tc>
+        <w:tc>
+          <w:tcPr>
+            <w:tcW w:type="dxa" w:w="2430"/>
+            <w:tcBorders>
+              <w:top w:val="single" w:sz="4" w:color="D9D9D9"/>
+              <w:left w:val="single" w:sz="4" w:color="D9D9D9"/>
+              <w:bottom w:val="single" w:sz="4" w:color="D9D9D9"/>
+              <w:right w:val="single" w:sz="4" w:color="D9D9D9"/>
+              <w:insideH w:val="single" w:sz="4" w:color="D9D9D9"/>
+              <w:insideV w:val="single" w:sz="4" w:color="D9D9D9"/>
+            </w:tcBorders>
+            <w:tcMar>
+              <w:top w:w="65" w:type="dxa"/>
+              <w:left w:w="65" w:type="dxa"/>
+              <w:bottom w:w="65" w:type="dxa"/>
+              <w:right w:w="65" w:type="dxa"/>
+            </w:tcMar>
+          </w:tcPr>
+          <w:p>
+            <w:pPr>
+              <w:spacing w:after="40" w:before="40" w:line="240" w:lineRule="auto"/>
+              <w:jc w:val="center"/>
+            </w:pPr>
+            <w:r>
+              <w:rPr>
+                <w:rFonts w:ascii="Times New Roman" w:hAnsi="Times New Roman"/>
+                <w:b w:val="0"/>
+                <w:sz w:val="20"/>
+              </w:rPr>
+            </w:r>
+            <w:r>
+              <w:rPr>
+                <w:rFonts w:ascii="Times New Roman" w:hAnsi="Times New Roman"/>
+                <w:b w:val="0"/>
+                <w:sz w:val="20"/>
+              </w:rPr>
+              <w:t>67,104,769</w:t>
+            </w:r>
+          </w:p>
+        </w:tc>
+        <w:tc>
+          <w:tcPr>
+            <w:tcW w:type="dxa" w:w="2430"/>
+            <w:tcBorders>
+              <w:top w:val="single" w:sz="4" w:color="D9D9D9"/>
+              <w:left w:val="single" w:sz="4" w:color="D9D9D9"/>
+              <w:bottom w:val="single" w:sz="4" w:color="D9D9D9"/>
+              <w:right w:val="single" w:sz="4" w:color="D9D9D9"/>
+              <w:insideH w:val="single" w:sz="4" w:color="D9D9D9"/>
+              <w:insideV w:val="single" w:sz="4" w:color="D9D9D9"/>
+            </w:tcBorders>
+            <w:tcMar>
+              <w:top w:w="65" w:type="dxa"/>
+              <w:left w:w="65" w:type="dxa"/>
+              <w:bottom w:w="65" w:type="dxa"/>
+              <w:right w:w="65" w:type="dxa"/>
+            </w:tcMar>
+          </w:tcPr>
+          <w:p>
+            <w:pPr>
+              <w:spacing w:after="40" w:before="40" w:line="240" w:lineRule="auto"/>
+              <w:jc w:val="center"/>
+            </w:pPr>
+            <w:r>
+              <w:rPr>
+                <w:rFonts w:ascii="Times New Roman" w:hAnsi="Times New Roman"/>
+                <w:b w:val="0"/>
+                <w:sz w:val="20"/>
+              </w:rPr>
+            </w:r>
+            <w:r>
+              <w:rPr>
+                <w:rFonts w:ascii="Times New Roman" w:hAnsi="Times New Roman"/>
+                <w:b w:val="0"/>
+                <w:sz w:val="20"/>
+              </w:rPr>
+              <w:t>Wrapped request</w:t>
+            </w:r>
+          </w:p>
+        </w:tc>
+      </w:tr>
+    </w:tbl>
     <w:p>
       <w:r>
         <w:t>At the same Fibonacci index, WSL2 two-square completed all three trials, with median arithmetic time 48.18 s and median peak RSS 2.81 GiB. The native Windows MPIR release also completed the larger n=10</w:t>
@@ -1865,7 +2404,7 @@
         <w:pStyle w:val="Caption"/>
       </w:pPr>
       <w:r>
-        <w:t>Table 2. New complete Linux output trials</w:t>
+        <w:t>Table 3. New complete Linux output trials</w:t>
       </w:r>
     </w:p>
     <w:tbl>
@@ -2052,7 +2591,7 @@
                 <w:b/>
                 <w:sz w:val="20"/>
               </w:rPr>
-              <w:t>Peak RSS / GiB</w:t>
+              <w:t>Peak RSS / MiB</w:t>
             </w:r>
           </w:p>
         </w:tc>
@@ -2257,7 +2796,7 @@
                 <w:b w:val="0"/>
                 <w:sz w:val="20"/>
               </w:rPr>
-              <w:t>5.10</w:t>
+              <w:t>5219.6</w:t>
             </w:r>
           </w:p>
         </w:tc>
@@ -2462,7 +3001,7 @@
                 <w:b w:val="0"/>
                 <w:sz w:val="20"/>
               </w:rPr>
-              <w:t>5.10</w:t>
+              <w:t>5219.7</w:t>
             </w:r>
           </w:p>
         </w:tc>
@@ -2667,7 +3206,7 @@
                 <w:b w:val="0"/>
                 <w:sz w:val="20"/>
               </w:rPr>
-              <w:t>5.10</w:t>
+              <w:t>5219.4</w:t>
             </w:r>
           </w:p>
         </w:tc>
@@ -2872,7 +3411,7 @@
                 <w:b w:val="0"/>
                 <w:sz w:val="20"/>
               </w:rPr>
-              <w:t>5.10</w:t>
+              <w:t>5221.6</w:t>
             </w:r>
           </w:p>
         </w:tc>
@@ -2993,7 +3532,7 @@
         <w:pStyle w:val="Caption"/>
       </w:pPr>
       <w:r>
-        <w:t>Table 3. New output and reference verification</w:t>
+        <w:t>Table 4. New output and reference verification</w:t>
       </w:r>
     </w:p>
     <w:tbl>
@@ -3160,7 +3699,7 @@
                 <w:b w:val="0"/>
                 <w:sz w:val="20"/>
               </w:rPr>
-              <w:t>5</w:t>
+              <w:t>3 WSL2 + 1 MPIR + 1 native reference</w:t>
             </w:r>
           </w:p>
         </w:tc>
@@ -3690,7 +4229,7 @@
     </w:p>
     <w:p>
       <w:r>
-        <w:t>The retained C and Python writers both bisect decimal widths, cache powers of ten and use 4,000,000-digit leaves; the leaf limit does not explain the gap. C calls MPIR mpz_tdiv_qr/mpz_get_str, pads zeros with fputc and writes with fwrite; Python uses GMP f_divmod/digits and writes padding strings through a Python file object. C also checks the width against a near-full-size power of ten and clears that cache; Python uses an MPFR width candidate. The release includes initialization, a ten-second status thread, width correction, file flushing and close. Its coarse log places arithmetic completion at about 1 min 57 s and total completion at 43 min 12 s, with width correction in between; the remaining time cannot all be assigned to progress reporting. Linux writes under WSL2 /tmp, whereas Windows writes to C:. Library division/conversion, padding, runtime I/O and disk waits were not profiled separately, and filesystem/cache conditions were not controlled. These are candidate factors, not measured causal explanations; source inspection is not a binary-matched rebuild of the release.</w:t>
+        <w:t>The retained C and Python writers both use 4,000,000-digit leaves, but C calls MPIR mpz_tdiv_qr/mpz_get_str and fwrite whereas Python calls GMP f_divmod/digits and writes through a Python file object. The MPIR release also performs width correction and status reporting. Linux output was written under WSL2 /tmp and Windows output to C:. Conversion, padding, runtime I/O and storage waits were not measured separately, so the timing gap cannot be attributed to any one of them. Retained C source is not a binary-matched rebuild of the release.</w:t>
       </w:r>
     </w:p>
     <w:p>
@@ -3730,7 +4269,7 @@
         <w:pStyle w:val="Caption"/>
       </w:pPr>
       <w:r>
-        <w:t>Table 4. MPIR measurements by endpoint and sample size</w:t>
+        <w:t>Table 5. MPIR measurements by endpoint and sample size</w:t>
       </w:r>
     </w:p>
     <w:tbl>
@@ -4888,7 +5427,7 @@
     </w:p>
     <w:p>
       <w:r>
-        <w:t>The software remains MIT-licensed at the pinned public Git revision [4]. Supplementary experiment drivers, raw measurements, environment files, source and binary hashes, failure diagnostics, the isolated square/direct-DLL probes of 16 October 2026, numeric verification manifests and the reference-generation command are supplied with this revision. The new full numeric outputs are retained locally and identified by file hashes; the package does not claim that a public archive or DOI already exists. Historical files retain their original provenance qualifications. Software citation follows version-specific identification [13].</w:t>
+        <w:t>The software remains MIT-licensed at the pinned public Git revision [4]. Supplementary experiment drivers, raw measurements, environment files, source and binary hashes, failure diagnostics, the isolated square/direct-DLL probes of 16 October 2026, numeric verification manifests and the reference-generation command are supplied with this revision. The new full numeric outputs are retained locally and identified by file hashes; the package does not claim that a public archive or DOI already exists. Historical files retain their original provenance qualifications. Software citation follows version-specific identification [14].</w:t>
       </w:r>
     </w:p>
     <w:p>
@@ -5035,7 +5574,17 @@
         <w:jc w:val="left"/>
       </w:pPr>
       <w:r>
-        <w:t>[13] Smith AM, Katz DS, Niemeyer KE, FORCE11 Software Citation Working Group. 2016. Software citation principles. PeerJ Computer Science 2:e86. https://doi.org/10.7717/peerj-cs.86</w:t>
+        <w:t>[13] The GNU MP developers. 2023f. Integer Internals. GNU MP 6.3.0 manual. https://gmplib.org/manual/Integer-Internals</w:t>
+      </w:r>
+    </w:p>
+    <w:p>
+      <w:pPr>
+        <w:keepLines/>
+        <w:spacing w:after="80"/>
+        <w:jc w:val="left"/>
+      </w:pPr>
+      <w:r>
+        <w:t>[14] Smith AM, Katz DS, Niemeyer KE, FORCE11 Software Citation Working Group. 2016. Software citation principles. PeerJ Computer Science 2:e86. https://doi.org/10.7717/peerj-cs.86</w:t>
       </w:r>
     </w:p>
     <w:sectPr>

</xml_diff>

<commit_message>
Add MSYS2 and asymmetric GMP boundary experiments
Refresh four manuscripts with three-build allocation traces, matching-header type widths, and repeated one-billion-index sink controls.
</commit_message>
<xml_diff>
--- a/papers/2026-10-16/en/manuscript.docx
+++ b/papers/2026-10-16/en/manuscript.docx
@@ -67,12 +67,7 @@
         <w:t>10</w:t>
       </w:r>
       <w:r>
-        <w:t>) on a 32 GB home computer using repeated WSL2/Linux trials and a native Windows MPIR run. Two different Windows GMP DLLs failed at the last F(8 billion) square. Independent sparse-square and C probes found the same adjacent outcomes in both DLLs: 2,147,352,576 operand bits succeeded and 2,147,352,577 failed with a wrapped 64-bit allocation request. Three WSL2 outputs and one MPIR output each contain 2,089,876,403 digits and match a new direct Linux GMP reference by SHA-256. The source expression behind the wrapped request remains unlocated; the observed boundary applies to the tested builds and sparse inputs.</w:t>
-      </w:r>
-    </w:p>
-    <w:p>
-      <w:r>
-        <w:t>Keywords: arbitrary precision arithmetic; Fibonacci numbers; decimal conversion; reproducibility</w:t>
+        <w:t>) on a 32 GB home computer using repeated WSL2/Linux trials and native Windows MPIR. Three SHA-256-distinct Windows GMP 6.3.0 DLLs, including an independently sourced MSYS2 package, showed the same adjacent sparse-square outcomes: 2,147,352,576 operand bits succeeded and 2,147,352,577 failed with a wrapped 64-bit allocation request. Asymmetric multiplication also failed, with matched-result tests distinguishing input limb lengths from mathematical result width. Three WSL2 outputs and one MPIR output each contain 2,089,876,403 digits and match a new direct Linux GMP reference by SHA-256. The responsible source expression remains unlocated; results concern the recorded builds and host.</w:t>
       </w:r>
     </w:p>
     <w:p>
@@ -676,6 +671,7 @@
     <w:p>
       <w:pPr>
         <w:pStyle w:val="Caption"/>
+        <w:keepNext/>
       </w:pPr>
       <w:r>
         <w:t>Table 1. Five-trial arithmetic medians</w:t>
@@ -721,6 +717,7 @@
           <w:p>
             <w:pPr>
               <w:spacing w:after="40" w:before="40" w:line="240" w:lineRule="auto"/>
+              <w:ind w:firstLine="0" w:left="0" w:right="0" w:firstLineChars="0" w:leftChars="0" w:rightChars="0"/>
               <w:jc w:val="center"/>
             </w:pPr>
             <w:r>
@@ -755,6 +752,7 @@
           <w:p>
             <w:pPr>
               <w:spacing w:after="40" w:before="40" w:line="240" w:lineRule="auto"/>
+              <w:ind w:firstLine="0" w:left="0" w:right="0" w:firstLineChars="0" w:leftChars="0" w:rightChars="0"/>
               <w:jc w:val="center"/>
             </w:pPr>
             <w:r>
@@ -789,6 +787,7 @@
           <w:p>
             <w:pPr>
               <w:spacing w:after="40" w:before="40" w:line="240" w:lineRule="auto"/>
+              <w:ind w:firstLine="0" w:left="0" w:right="0" w:firstLineChars="0" w:leftChars="0" w:rightChars="0"/>
               <w:jc w:val="center"/>
             </w:pPr>
             <w:r>
@@ -823,6 +822,7 @@
           <w:p>
             <w:pPr>
               <w:spacing w:after="40" w:before="40" w:line="240" w:lineRule="auto"/>
+              <w:ind w:firstLine="0" w:left="0" w:right="0" w:firstLineChars="0" w:leftChars="0" w:rightChars="0"/>
               <w:jc w:val="center"/>
             </w:pPr>
             <w:r>
@@ -857,6 +857,7 @@
           <w:p>
             <w:pPr>
               <w:spacing w:after="40" w:before="40" w:line="240" w:lineRule="auto"/>
+              <w:ind w:firstLine="0" w:left="0" w:right="0" w:firstLineChars="0" w:leftChars="0" w:rightChars="0"/>
               <w:jc w:val="center"/>
             </w:pPr>
             <w:r>
@@ -895,6 +896,7 @@
           <w:p>
             <w:pPr>
               <w:spacing w:after="40" w:before="40" w:line="240" w:lineRule="auto"/>
+              <w:ind w:firstLine="0" w:left="0" w:right="0" w:firstLineChars="0" w:leftChars="0" w:rightChars="0"/>
               <w:jc w:val="center"/>
             </w:pPr>
             <w:r>
@@ -944,6 +946,7 @@
           <w:p>
             <w:pPr>
               <w:spacing w:after="40" w:before="40" w:line="240" w:lineRule="auto"/>
+              <w:ind w:firstLine="0" w:left="0" w:right="0" w:firstLineChars="0" w:leftChars="0" w:rightChars="0"/>
               <w:jc w:val="center"/>
             </w:pPr>
             <w:r>
@@ -984,6 +987,7 @@
           <w:p>
             <w:pPr>
               <w:spacing w:after="40" w:before="40" w:line="240" w:lineRule="auto"/>
+              <w:ind w:firstLine="0" w:left="0" w:right="0" w:firstLineChars="0" w:leftChars="0" w:rightChars="0"/>
               <w:jc w:val="center"/>
             </w:pPr>
             <w:r>
@@ -1024,6 +1028,7 @@
           <w:p>
             <w:pPr>
               <w:spacing w:after="40" w:before="40" w:line="240" w:lineRule="auto"/>
+              <w:ind w:firstLine="0" w:left="0" w:right="0" w:firstLineChars="0" w:leftChars="0" w:rightChars="0"/>
               <w:jc w:val="center"/>
             </w:pPr>
             <w:r>
@@ -1064,6 +1069,7 @@
           <w:p>
             <w:pPr>
               <w:spacing w:after="40" w:before="40" w:line="240" w:lineRule="auto"/>
+              <w:ind w:firstLine="0" w:left="0" w:right="0" w:firstLineChars="0" w:leftChars="0" w:rightChars="0"/>
               <w:jc w:val="center"/>
             </w:pPr>
             <w:r>
@@ -1109,6 +1115,7 @@
           <w:p>
             <w:pPr>
               <w:spacing w:after="40" w:before="40" w:line="240" w:lineRule="auto"/>
+              <w:ind w:firstLine="0" w:left="0" w:right="0" w:firstLineChars="0" w:leftChars="0" w:rightChars="0"/>
               <w:jc w:val="center"/>
             </w:pPr>
             <w:r>
@@ -1158,6 +1165,7 @@
           <w:p>
             <w:pPr>
               <w:spacing w:after="40" w:before="40" w:line="240" w:lineRule="auto"/>
+              <w:ind w:firstLine="0" w:left="0" w:right="0" w:firstLineChars="0" w:leftChars="0" w:rightChars="0"/>
               <w:jc w:val="center"/>
             </w:pPr>
             <w:r>
@@ -1198,6 +1206,7 @@
           <w:p>
             <w:pPr>
               <w:spacing w:after="40" w:before="40" w:line="240" w:lineRule="auto"/>
+              <w:ind w:firstLine="0" w:left="0" w:right="0" w:firstLineChars="0" w:leftChars="0" w:rightChars="0"/>
               <w:jc w:val="center"/>
             </w:pPr>
             <w:r>
@@ -1238,6 +1247,7 @@
           <w:p>
             <w:pPr>
               <w:spacing w:after="40" w:before="40" w:line="240" w:lineRule="auto"/>
+              <w:ind w:firstLine="0" w:left="0" w:right="0" w:firstLineChars="0" w:leftChars="0" w:rightChars="0"/>
               <w:jc w:val="center"/>
             </w:pPr>
             <w:r>
@@ -1278,6 +1288,7 @@
           <w:p>
             <w:pPr>
               <w:spacing w:after="40" w:before="40" w:line="240" w:lineRule="auto"/>
+              <w:ind w:firstLine="0" w:left="0" w:right="0" w:firstLineChars="0" w:leftChars="0" w:rightChars="0"/>
               <w:jc w:val="center"/>
             </w:pPr>
             <w:r>
@@ -1323,6 +1334,7 @@
           <w:p>
             <w:pPr>
               <w:spacing w:after="40" w:before="40" w:line="240" w:lineRule="auto"/>
+              <w:ind w:firstLine="0" w:left="0" w:right="0" w:firstLineChars="0" w:leftChars="0" w:rightChars="0"/>
               <w:jc w:val="center"/>
             </w:pPr>
             <w:r>
@@ -1372,6 +1384,7 @@
           <w:p>
             <w:pPr>
               <w:spacing w:after="40" w:before="40" w:line="240" w:lineRule="auto"/>
+              <w:ind w:firstLine="0" w:left="0" w:right="0" w:firstLineChars="0" w:leftChars="0" w:rightChars="0"/>
               <w:jc w:val="center"/>
             </w:pPr>
             <w:r>
@@ -1412,6 +1425,7 @@
           <w:p>
             <w:pPr>
               <w:spacing w:after="40" w:before="40" w:line="240" w:lineRule="auto"/>
+              <w:ind w:firstLine="0" w:left="0" w:right="0" w:firstLineChars="0" w:leftChars="0" w:rightChars="0"/>
               <w:jc w:val="center"/>
             </w:pPr>
             <w:r>
@@ -1452,6 +1466,7 @@
           <w:p>
             <w:pPr>
               <w:spacing w:after="40" w:before="40" w:line="240" w:lineRule="auto"/>
+              <w:ind w:firstLine="0" w:left="0" w:right="0" w:firstLineChars="0" w:leftChars="0" w:rightChars="0"/>
               <w:jc w:val="center"/>
             </w:pPr>
             <w:r>
@@ -1492,6 +1507,7 @@
           <w:p>
             <w:pPr>
               <w:spacing w:after="40" w:before="40" w:line="240" w:lineRule="auto"/>
+              <w:ind w:firstLine="0" w:left="0" w:right="0" w:firstLineChars="0" w:leftChars="0" w:rightChars="0"/>
               <w:jc w:val="center"/>
             </w:pPr>
             <w:r>
@@ -1537,6 +1553,7 @@
           <w:p>
             <w:pPr>
               <w:spacing w:after="40" w:before="40" w:line="240" w:lineRule="auto"/>
+              <w:ind w:firstLine="0" w:left="0" w:right="0" w:firstLineChars="0" w:leftChars="0" w:rightChars="0"/>
               <w:jc w:val="center"/>
             </w:pPr>
             <w:r>
@@ -1586,6 +1603,7 @@
           <w:p>
             <w:pPr>
               <w:spacing w:after="40" w:before="40" w:line="240" w:lineRule="auto"/>
+              <w:ind w:firstLine="0" w:left="0" w:right="0" w:firstLineChars="0" w:leftChars="0" w:rightChars="0"/>
               <w:jc w:val="center"/>
             </w:pPr>
             <w:r>
@@ -1626,6 +1644,7 @@
           <w:p>
             <w:pPr>
               <w:spacing w:after="40" w:before="40" w:line="240" w:lineRule="auto"/>
+              <w:ind w:firstLine="0" w:left="0" w:right="0" w:firstLineChars="0" w:leftChars="0" w:rightChars="0"/>
               <w:jc w:val="center"/>
             </w:pPr>
             <w:r>
@@ -1666,6 +1685,7 @@
           <w:p>
             <w:pPr>
               <w:spacing w:after="40" w:before="40" w:line="240" w:lineRule="auto"/>
+              <w:ind w:firstLine="0" w:left="0" w:right="0" w:firstLineChars="0" w:leftChars="0" w:rightChars="0"/>
               <w:jc w:val="center"/>
             </w:pPr>
             <w:r>
@@ -1706,6 +1726,7 @@
           <w:p>
             <w:pPr>
               <w:spacing w:after="40" w:before="40" w:line="240" w:lineRule="auto"/>
+              <w:ind w:firstLine="0" w:left="0" w:right="0" w:firstLineChars="0" w:leftChars="0" w:rightChars="0"/>
               <w:jc w:val="center"/>
             </w:pPr>
             <w:r>
@@ -1793,8 +1814,32 @@
       </w:r>
     </w:p>
     <w:p>
+      <w:pPr>
+        <w:pStyle w:val="Heading3"/>
+        <w:keepNext/>
+        <w:numPr>
+          <w:numId w:val="0"/>
+        </w:numPr>
+      </w:pPr>
+      <w:r>
+        <w:t>Failure observations</w:t>
+      </w:r>
+    </w:p>
+    <w:p>
       <w:r>
         <w:t>The two native gmpy2 2.3.1 trials and two isolated gmpy2 2.2.1 trials failed at layer 32/32, the first square of a 2,776,967,654-bit operand, before decimal conversion. The preserved stderr contains GNU MP: Cannot allocate memory (size=4294597664). The current 2.3.1 trials exited with code 3 rather than the historical report's 0xC0000409. No watchdog termination was involved. Median peak working set and private commitment were 1.82 and 2.46 GiB for gmpy2 2.3.1, and 1.81 and 2.46 GiB for 2.2.1, respectively; these are distinct Windows counters. In the two gmpy2 2.3.1 runs, more than 10 GiB of physical memory remained available at the last pre-failure diagnostic. Available physical memory alone does not identify the failure; the full-width allocation trace and isolated tests below resolve the nature of the requested size.</w:t>
+      </w:r>
+    </w:p>
+    <w:p>
+      <w:pPr>
+        <w:pStyle w:val="Heading3"/>
+        <w:keepNext/>
+        <w:numPr>
+          <w:numId w:val="0"/>
+        </w:numPr>
+      </w:pPr>
+      <w:r>
+        <w:t>Full width allocation trace</w:t>
       </w:r>
     </w:p>
     <w:p>
@@ -1812,26 +1857,86 @@
       </w:r>
     </w:p>
     <w:p>
+      <w:pPr>
+        <w:pStyle w:val="Heading3"/>
+        <w:keepNext/>
+        <w:numPr>
+          <w:numId w:val="0"/>
+        </w:numPr>
+      </w:pPr>
       <w:r>
-        <w:t>On 16 October 2026, protected processes squared b-bit sparse operands with only the highest bit set. Binary search recorded adjacent outcomes: b=2,147,352,576 succeeded and b=2,147,352,577 failed. The first failed input equals 2</w:t>
+        <w:t>Minimal reproduction and build comparison</w:t>
+      </w:r>
+    </w:p>
+    <w:p>
+      <w:r>
+        <w:t>In protected processes on 16 October 2026, sparse operands with only the highest bit set showed adjacent square outcomes at b=2,147,352,576 and b=2,147,352,577. Define T=2</w:t>
       </w:r>
       <w:r>
         <w:rPr>
           <w:vertAlign w:val="superscript"/>
         </w:rPr>
-        <w:t>31</w:t>
+        <w:t>32</w:t>
       </w:r>
       <w:r>
-        <w:t>-2</w:t>
+        <w:t>−2</w:t>
       </w:r>
       <w:r>
         <w:rPr>
           <w:vertAlign w:val="superscript"/>
         </w:rPr>
-        <w:t>17</w:t>
+        <w:t>18</w:t>
       </w:r>
       <w:r>
-        <w:t>+1 bits; its mathematical square has 4,294,705,153 bits or 67,104,769 64-bit limbs. GMP documents 32-bit `mpz_t` size fields in limb units [13]; 67,104,769 is far below 2,147,483,647 limbs, so that generic capacity does not explain the observed boundary. The same adjacent outcomes were reproduced by direct DLL calls and by a separately compiled Visual Studio 2019 x64 C program. Its core calls are `mpz_init_set_ui(x,1); mpz_init(y); mpz_mul_2exp(x,x,b-1); mpz_mul(y,x,x);`; the complete guarded reproducer is supplied. The installed 2.3.1 binary was `C:/Users/lusun/AppData/Roaming/Python/Python313/site-packages/gmpy2.libs/libgmp-10.dll` (SHA-256 `829adcf025d22e641c6816b431fbe5b226a39b390c7205192d480151646fe9c9`). The distinct 2.2.1 wheel DLL (SHA-256 `fb2d312ca861c18e8b23648ac8440b0b613b1930ceff58f48b48ba2d3bd6b186`) had the same adjacent outcomes and a full-width failed request of 2</w:t>
+        <w:t>=4,294,705,152 bits and L=T/64=2</w:t>
+      </w:r>
+      <w:r>
+        <w:rPr>
+          <w:vertAlign w:val="superscript"/>
+        </w:rPr>
+        <w:t>26</w:t>
+      </w:r>
+      <w:r>
+        <w:t>−2</w:t>
+      </w:r>
+      <w:r>
+        <w:rPr>
+          <w:vertAlign w:val="superscript"/>
+        </w:rPr>
+        <w:t>12</w:t>
+      </w:r>
+      <w:r>
+        <w:t>=67,104,768 limbs. The successful mathematical square has T−1 bits and the failed one T+1 bits. This is an observed sparse-square transition, not a universal minimum for other operand shapes. The direct DLL test and separately compiled C reproducer use the following core operations; each case runs in its own guarded process.</w:t>
+      </w:r>
+    </w:p>
+    <w:p>
+      <w:pPr>
+        <w:keepLines/>
+        <w:spacing w:after="140"/>
+      </w:pPr>
+      <w:r>
+        <w:rPr>
+          <w:rFonts w:ascii="Courier New" w:hAnsi="Courier New"/>
+          <w:sz w:val="16"/>
+        </w:rPr>
+        <w:t>mpz_t x, y;</w:t>
+        <w:br/>
+        <w:t>mpz_init_set_ui(x, 1);</w:t>
+        <w:br/>
+        <w:t>mpz_init(y);</w:t>
+        <w:br/>
+        <w:t>mpz_mul_2exp(x, x, b - 1);</w:t>
+        <w:br/>
+        <w:t>mpz_mul(y, x, x);</w:t>
+        <w:br/>
+        <w:t>mpz_clear(y);</w:t>
+        <w:br/>
+        <w:t>mpz_clear(x);</w:t>
+      </w:r>
+    </w:p>
+    <w:p>
+      <w:r>
+        <w:t>The two wheel binaries are identified as `site-packages/gmpy2.libs/libgmp-10.dll`: gmpy2 2.3.1 SHA-256 `829adcf025d22e641c6816b431fbe5b226a39b390c7205192d480151646fe9c9` and gmpy2 2.2.1 SHA-256 `fb2d312ca861c18e8b23648ac8440b0b613b1930ceff58f48b48ba2d3bd6b186`. An independent MSYS2 mingw-w64-x86_64-gmp 6.3.0-2 package [13] supplies a third DLL, `mingw64/bin/libgmp-10.dll`, SHA-256 `37248cda33845e7c5c35a574e57da762dd0a8268f0270d179f30a33746809681`. Its verified package SHA-256, CI packager, build date and GCC 13.2.0-2 build-environment record are supplied. All three reproduced the adjacent pair. At b=2,147,352,577, the 2.3.1 DLL requested 2</w:t>
       </w:r>
       <w:r>
         <w:rPr>
@@ -1840,15 +1945,34 @@
         <w:t>64</w:t>
       </w:r>
       <w:r>
-        <w:t>-523,232 bytes. The C runs confirmed both binaries, but did not measure the internal FFT rounded length or identify a source expression. The fault is therefore in the examined DLLs' large-operand square/multiplication paths or allocation-size propagation, rather than requiring the Fibonacci recurrence, decimal conversion or Python binding. The observed wraparound supports a size-arithmetic fault; its specific expression and internal multiplication branch remain unlocated. The isolated probes, full-width traces and both DLL hashes are supplied with the supplementary evidence. The adjacent pair is an observed sparse-input transition, not a proven universal minimum; FFT rounding length remains unmeasured.</w:t>
+        <w:t>−523,232 bytes; the 2.2.1 DLL requested 2</w:t>
+      </w:r>
+      <w:r>
+        <w:rPr>
+          <w:vertAlign w:val="superscript"/>
+        </w:rPr>
+        <w:t>64</w:t>
+      </w:r>
+      <w:r>
+        <w:t>−523,232 bytes; the MSYS2 DLL requested 2</w:t>
+      </w:r>
+      <w:r>
+        <w:rPr>
+          <w:vertAlign w:val="superscript"/>
+        </w:rPr>
+        <w:t>64</w:t>
+      </w:r>
+      <w:r>
+        <w:t>−523,232 bytes. These requests were captured by native C allocation callbacks forwarding to each DLL's original allocator.</w:t>
       </w:r>
     </w:p>
     <w:p>
       <w:pPr>
         <w:pStyle w:val="Caption"/>
+        <w:keepNext/>
       </w:pPr>
       <w:r>
-        <w:t>Table 2. Adjacent observed outcomes for sparse-operand squaring in the tested DLL</w:t>
+        <w:t>Table 2. Adjacent sparse-square outcomes in all three tested DLLs</w:t>
       </w:r>
     </w:p>
     <w:tbl>
@@ -1858,10 +1982,11 @@
         <w:tblLook w:firstColumn="1" w:firstRow="1" w:lastColumn="0" w:lastRow="0" w:noHBand="0" w:noVBand="1" w:val="04A0"/>
       </w:tblPr>
       <w:tblGrid>
-        <w:gridCol w:w="2256"/>
-        <w:gridCol w:w="2256"/>
-        <w:gridCol w:w="2256"/>
-        <w:gridCol w:w="2256"/>
+        <w:gridCol w:w="1805"/>
+        <w:gridCol w:w="1805"/>
+        <w:gridCol w:w="1805"/>
+        <w:gridCol w:w="1805"/>
+        <w:gridCol w:w="1805"/>
       </w:tblGrid>
       <w:tr>
         <w:trPr>
@@ -1890,6 +2015,7 @@
           <w:p>
             <w:pPr>
               <w:spacing w:after="40" w:before="40" w:line="240" w:lineRule="auto"/>
+              <w:ind w:firstLine="0" w:left="0" w:right="0" w:firstLineChars="0" w:leftChars="0" w:rightChars="0"/>
               <w:jc w:val="center"/>
             </w:pPr>
             <w:r>
@@ -1904,7 +2030,7 @@
         </w:tc>
         <w:tc>
           <w:tcPr>
-            <w:tcW w:type="dxa" w:w="2430"/>
+            <w:tcW w:type="dxa" w:w="1822"/>
             <w:tcBorders>
               <w:top w:val="single" w:sz="4" w:color="D9D9D9"/>
               <w:left w:val="single" w:sz="4" w:color="D9D9D9"/>
@@ -1924,6 +2050,7 @@
           <w:p>
             <w:pPr>
               <w:spacing w:after="40" w:before="40" w:line="240" w:lineRule="auto"/>
+              <w:ind w:firstLine="0" w:left="0" w:right="0" w:firstLineChars="0" w:leftChars="0" w:rightChars="0"/>
               <w:jc w:val="center"/>
             </w:pPr>
             <w:r>
@@ -1938,7 +2065,7 @@
         </w:tc>
         <w:tc>
           <w:tcPr>
-            <w:tcW w:type="dxa" w:w="2430"/>
+            <w:tcW w:type="dxa" w:w="1822"/>
             <w:tcBorders>
               <w:top w:val="single" w:sz="4" w:color="D9D9D9"/>
               <w:left w:val="single" w:sz="4" w:color="D9D9D9"/>
@@ -1958,6 +2085,7 @@
           <w:p>
             <w:pPr>
               <w:spacing w:after="40" w:before="40" w:line="240" w:lineRule="auto"/>
+              <w:ind w:firstLine="0" w:left="0" w:right="0" w:firstLineChars="0" w:leftChars="0" w:rightChars="0"/>
               <w:jc w:val="center"/>
             </w:pPr>
             <w:r>
@@ -1966,13 +2094,13 @@
                 <w:b/>
                 <w:sz w:val="20"/>
               </w:rPr>
-              <w:t>64-bit limbs</w:t>
+              <w:t>Delta from T</w:t>
             </w:r>
           </w:p>
         </w:tc>
         <w:tc>
           <w:tcPr>
-            <w:tcW w:type="dxa" w:w="2430"/>
+            <w:tcW w:type="dxa" w:w="1822"/>
             <w:tcBorders>
               <w:top w:val="single" w:sz="4" w:color="D9D9D9"/>
               <w:left w:val="single" w:sz="4" w:color="D9D9D9"/>
@@ -1992,6 +2120,42 @@
           <w:p>
             <w:pPr>
               <w:spacing w:after="40" w:before="40" w:line="240" w:lineRule="auto"/>
+              <w:ind w:firstLine="0" w:left="0" w:right="0" w:firstLineChars="0" w:leftChars="0" w:rightChars="0"/>
+              <w:jc w:val="center"/>
+            </w:pPr>
+            <w:r>
+              <w:rPr>
+                <w:rFonts w:ascii="Times New Roman" w:hAnsi="Times New Roman"/>
+                <w:b/>
+                <w:sz w:val="20"/>
+              </w:rPr>
+              <w:t>64-bit limbs</w:t>
+            </w:r>
+          </w:p>
+        </w:tc>
+        <w:tc>
+          <w:tcPr>
+            <w:tcW w:type="dxa" w:w="1822"/>
+            <w:tcBorders>
+              <w:top w:val="single" w:sz="4" w:color="D9D9D9"/>
+              <w:left w:val="single" w:sz="4" w:color="D9D9D9"/>
+              <w:bottom w:val="single" w:sz="4" w:color="D9D9D9"/>
+              <w:right w:val="single" w:sz="4" w:color="D9D9D9"/>
+              <w:insideH w:val="single" w:sz="4" w:color="D9D9D9"/>
+              <w:insideV w:val="single" w:sz="4" w:color="D9D9D9"/>
+            </w:tcBorders>
+            <w:tcMar>
+              <w:top w:w="65" w:type="dxa"/>
+              <w:left w:w="65" w:type="dxa"/>
+              <w:bottom w:w="65" w:type="dxa"/>
+              <w:right w:w="65" w:type="dxa"/>
+            </w:tcMar>
+            <w:shd w:fill="EDF0F2"/>
+          </w:tcPr>
+          <w:p>
+            <w:pPr>
+              <w:spacing w:after="40" w:before="40" w:line="240" w:lineRule="auto"/>
+              <w:ind w:firstLine="0" w:left="0" w:right="0" w:firstLineChars="0" w:leftChars="0" w:rightChars="0"/>
               <w:jc w:val="center"/>
             </w:pPr>
             <w:r>
@@ -2030,6 +2194,7 @@
           <w:p>
             <w:pPr>
               <w:spacing w:after="40" w:before="40" w:line="240" w:lineRule="auto"/>
+              <w:ind w:firstLine="0" w:left="0" w:right="0" w:firstLineChars="0" w:leftChars="0" w:rightChars="0"/>
               <w:jc w:val="center"/>
             </w:pPr>
             <w:r>
@@ -2051,7 +2216,7 @@
         </w:tc>
         <w:tc>
           <w:tcPr>
-            <w:tcW w:type="dxa" w:w="2430"/>
+            <w:tcW w:type="dxa" w:w="1822"/>
             <w:tcBorders>
               <w:top w:val="single" w:sz="4" w:color="D9D9D9"/>
               <w:left w:val="single" w:sz="4" w:color="D9D9D9"/>
@@ -2070,6 +2235,7 @@
           <w:p>
             <w:pPr>
               <w:spacing w:after="40" w:before="40" w:line="240" w:lineRule="auto"/>
+              <w:ind w:firstLine="0" w:left="0" w:right="0" w:firstLineChars="0" w:leftChars="0" w:rightChars="0"/>
               <w:jc w:val="center"/>
             </w:pPr>
             <w:r>
@@ -2091,7 +2257,7 @@
         </w:tc>
         <w:tc>
           <w:tcPr>
-            <w:tcW w:type="dxa" w:w="2430"/>
+            <w:tcW w:type="dxa" w:w="1822"/>
             <w:tcBorders>
               <w:top w:val="single" w:sz="4" w:color="D9D9D9"/>
               <w:left w:val="single" w:sz="4" w:color="D9D9D9"/>
@@ -2110,6 +2276,48 @@
           <w:p>
             <w:pPr>
               <w:spacing w:after="40" w:before="40" w:line="240" w:lineRule="auto"/>
+              <w:ind w:firstLine="0" w:left="0" w:right="0" w:firstLineChars="0" w:leftChars="0" w:rightChars="0"/>
+              <w:jc w:val="center"/>
+            </w:pPr>
+            <w:r>
+              <w:rPr>
+                <w:rFonts w:ascii="Times New Roman" w:hAnsi="Times New Roman"/>
+                <w:b w:val="0"/>
+                <w:sz w:val="20"/>
+              </w:rPr>
+            </w:r>
+            <w:r>
+              <w:rPr>
+                <w:rFonts w:ascii="Times New Roman" w:hAnsi="Times New Roman"/>
+                <w:b w:val="0"/>
+                <w:sz w:val="20"/>
+              </w:rPr>
+              <w:t>−1</w:t>
+            </w:r>
+          </w:p>
+        </w:tc>
+        <w:tc>
+          <w:tcPr>
+            <w:tcW w:type="dxa" w:w="1822"/>
+            <w:tcBorders>
+              <w:top w:val="single" w:sz="4" w:color="D9D9D9"/>
+              <w:left w:val="single" w:sz="4" w:color="D9D9D9"/>
+              <w:bottom w:val="single" w:sz="4" w:color="D9D9D9"/>
+              <w:right w:val="single" w:sz="4" w:color="D9D9D9"/>
+              <w:insideH w:val="single" w:sz="4" w:color="D9D9D9"/>
+              <w:insideV w:val="single" w:sz="4" w:color="D9D9D9"/>
+            </w:tcBorders>
+            <w:tcMar>
+              <w:top w:w="65" w:type="dxa"/>
+              <w:left w:w="65" w:type="dxa"/>
+              <w:bottom w:w="65" w:type="dxa"/>
+              <w:right w:w="65" w:type="dxa"/>
+            </w:tcMar>
+          </w:tcPr>
+          <w:p>
+            <w:pPr>
+              <w:spacing w:after="40" w:before="40" w:line="240" w:lineRule="auto"/>
+              <w:ind w:firstLine="0" w:left="0" w:right="0" w:firstLineChars="0" w:leftChars="0" w:rightChars="0"/>
               <w:jc w:val="center"/>
             </w:pPr>
             <w:r>
@@ -2131,7 +2339,7 @@
         </w:tc>
         <w:tc>
           <w:tcPr>
-            <w:tcW w:type="dxa" w:w="2430"/>
+            <w:tcW w:type="dxa" w:w="1822"/>
             <w:tcBorders>
               <w:top w:val="single" w:sz="4" w:color="D9D9D9"/>
               <w:left w:val="single" w:sz="4" w:color="D9D9D9"/>
@@ -2150,6 +2358,7 @@
           <w:p>
             <w:pPr>
               <w:spacing w:after="40" w:before="40" w:line="240" w:lineRule="auto"/>
+              <w:ind w:firstLine="0" w:left="0" w:right="0" w:firstLineChars="0" w:leftChars="0" w:rightChars="0"/>
               <w:jc w:val="center"/>
             </w:pPr>
             <w:r>
@@ -2195,6 +2404,7 @@
           <w:p>
             <w:pPr>
               <w:spacing w:after="40" w:before="40" w:line="240" w:lineRule="auto"/>
+              <w:ind w:firstLine="0" w:left="0" w:right="0" w:firstLineChars="0" w:leftChars="0" w:rightChars="0"/>
               <w:jc w:val="center"/>
             </w:pPr>
             <w:r>
@@ -2216,7 +2426,7 @@
         </w:tc>
         <w:tc>
           <w:tcPr>
-            <w:tcW w:type="dxa" w:w="2430"/>
+            <w:tcW w:type="dxa" w:w="1822"/>
             <w:tcBorders>
               <w:top w:val="single" w:sz="4" w:color="D9D9D9"/>
               <w:left w:val="single" w:sz="4" w:color="D9D9D9"/>
@@ -2235,6 +2445,7 @@
           <w:p>
             <w:pPr>
               <w:spacing w:after="40" w:before="40" w:line="240" w:lineRule="auto"/>
+              <w:ind w:firstLine="0" w:left="0" w:right="0" w:firstLineChars="0" w:leftChars="0" w:rightChars="0"/>
               <w:jc w:val="center"/>
             </w:pPr>
             <w:r>
@@ -2256,7 +2467,7 @@
         </w:tc>
         <w:tc>
           <w:tcPr>
-            <w:tcW w:type="dxa" w:w="2430"/>
+            <w:tcW w:type="dxa" w:w="1822"/>
             <w:tcBorders>
               <w:top w:val="single" w:sz="4" w:color="D9D9D9"/>
               <w:left w:val="single" w:sz="4" w:color="D9D9D9"/>
@@ -2275,6 +2486,48 @@
           <w:p>
             <w:pPr>
               <w:spacing w:after="40" w:before="40" w:line="240" w:lineRule="auto"/>
+              <w:ind w:firstLine="0" w:left="0" w:right="0" w:firstLineChars="0" w:leftChars="0" w:rightChars="0"/>
+              <w:jc w:val="center"/>
+            </w:pPr>
+            <w:r>
+              <w:rPr>
+                <w:rFonts w:ascii="Times New Roman" w:hAnsi="Times New Roman"/>
+                <w:b w:val="0"/>
+                <w:sz w:val="20"/>
+              </w:rPr>
+            </w:r>
+            <w:r>
+              <w:rPr>
+                <w:rFonts w:ascii="Times New Roman" w:hAnsi="Times New Roman"/>
+                <w:b w:val="0"/>
+                <w:sz w:val="20"/>
+              </w:rPr>
+              <w:t>+1</w:t>
+            </w:r>
+          </w:p>
+        </w:tc>
+        <w:tc>
+          <w:tcPr>
+            <w:tcW w:type="dxa" w:w="1822"/>
+            <w:tcBorders>
+              <w:top w:val="single" w:sz="4" w:color="D9D9D9"/>
+              <w:left w:val="single" w:sz="4" w:color="D9D9D9"/>
+              <w:bottom w:val="single" w:sz="4" w:color="D9D9D9"/>
+              <w:right w:val="single" w:sz="4" w:color="D9D9D9"/>
+              <w:insideH w:val="single" w:sz="4" w:color="D9D9D9"/>
+              <w:insideV w:val="single" w:sz="4" w:color="D9D9D9"/>
+            </w:tcBorders>
+            <w:tcMar>
+              <w:top w:w="65" w:type="dxa"/>
+              <w:left w:w="65" w:type="dxa"/>
+              <w:bottom w:w="65" w:type="dxa"/>
+              <w:right w:w="65" w:type="dxa"/>
+            </w:tcMar>
+          </w:tcPr>
+          <w:p>
+            <w:pPr>
+              <w:spacing w:after="40" w:before="40" w:line="240" w:lineRule="auto"/>
+              <w:ind w:firstLine="0" w:left="0" w:right="0" w:firstLineChars="0" w:leftChars="0" w:rightChars="0"/>
               <w:jc w:val="center"/>
             </w:pPr>
             <w:r>
@@ -2296,7 +2549,7 @@
         </w:tc>
         <w:tc>
           <w:tcPr>
-            <w:tcW w:type="dxa" w:w="2430"/>
+            <w:tcW w:type="dxa" w:w="1822"/>
             <w:tcBorders>
               <w:top w:val="single" w:sz="4" w:color="D9D9D9"/>
               <w:left w:val="single" w:sz="4" w:color="D9D9D9"/>
@@ -2315,6 +2568,7 @@
           <w:p>
             <w:pPr>
               <w:spacing w:after="40" w:before="40" w:line="240" w:lineRule="auto"/>
+              <w:ind w:firstLine="0" w:left="0" w:right="0" w:firstLineChars="0" w:leftChars="0" w:rightChars="0"/>
               <w:jc w:val="center"/>
             </w:pPr>
             <w:r>
@@ -2336,6 +2590,43 @@
         </w:tc>
       </w:tr>
     </w:tbl>
+    <w:p>
+      <w:r>
+        <w:t>The delta column is mathematical result bits minus T. Result widths in failed cases follow from the sparse inputs; no failed result object was recovered. Limbs in this table describe the normalized mathematical result, not an observed FFT workspace length.</w:t>
+      </w:r>
+    </w:p>
+    <w:p>
+      <w:pPr>
+        <w:pStyle w:val="Heading3"/>
+        <w:keepNext/>
+        <w:numPr>
+          <w:numId w:val="0"/>
+        </w:numPr>
+      </w:pPr>
+      <w:r>
+        <w:t>Scope and mechanism tests</w:t>
+      </w:r>
+    </w:p>
+    <w:p>
+      <w:r>
+        <w:t>A separate C probe compiled against the matching MSYS2 package header measured sizeof(mp_limb_t)=8, sizeof(mp_size_t)=4, sizeof(mp_bitcnt_t)=4 and sizeof(unsigned long)=4 bytes. The two wheel headers were not recovered, so their typedef widths are not established by this header probe. The inspected MPIR Win64 header instead defines 64-bit mp_size_t and mp_bitcnt_t [14]. Thus type widths differ across these builds. This makes 32-bit length or workspace arithmetic a testable hypothesis; a header width alone does not identify which internal operation produced the request. GMP's mpz_t capacity fields count limbs [15], and approximately 67 million limbs remain far below INT_MAX.</w:t>
+      </w:r>
+    </w:p>
+    <w:p>
+      <w:r>
+        <w:t>Sofroniou of Wolfram Research reported a GMP 5.1.2 failure on 64-bit Linux: an int multiplication of K and l overflowed before assignment to mp_size_t, then reached allocation as a huge size_t [5]. That historical mechanism motivates checking intermediate arithmetic, rather than assigning its source expression to the present DLLs.</w:t>
+      </w:r>
+    </w:p>
+    <w:p>
+      <w:r>
+        <w:t>At six sampled square widths from 2,147,352,577 through 2,147,483,648 bits, the signed interpretation of the abnormal request stayed at −523,232 bytes. At 2,776,967,654 bits it was −369,632 bytes. Both are multiples of the 8-byte limb size, corresponding arithmetically to −65,404 and −46,204 limb-sized units; this does not prove an internal variable held either negative limb count. The plateau does not support a single nonconstant affine request-versus-raw-bit formula over those samples.</w:t>
+      </w:r>
+    </w:p>
+    <w:p>
+      <w:r>
+        <w:t>Distinct-address multiplication with unequal operand lengths also failed when the mathematical result had exactly T bits. A stronger matched-result test used bit-length pairs (2,147,352,513, 2,147,352,577) and (2,147,352,512, 2,147,352,578). Both mathematical products have 4,294,705,089 bits and 67,104,768 normalized limbs; their input limb sums are respectively 67,104,769 and 67,104,768. The former failed with the wrapped request and the latter succeeded in all three DLLs. These tests rule out mathematical result width or normalized result limb count as the sole trigger in these cases, and show that a square-specific path is not required. Input limb lengths and internal padding/workspace handling are therefore the next quantities to trace. Internal FFT lengths and the first overflowing expression remain unmeasured. All Windows tests used build 27766; no stable-Windows replication has been obtained.</w:t>
+      </w:r>
+    </w:p>
     <w:p>
       <w:r>
         <w:t>At the same Fibonacci index, WSL2 two-square completed all three trials, with median arithmetic time 48.18 s and median peak RSS 2.81 GiB. The native Windows MPIR release also completed the larger n=10</w:t>
@@ -2402,6 +2693,7 @@
     <w:p>
       <w:pPr>
         <w:pStyle w:val="Caption"/>
+        <w:keepNext/>
       </w:pPr>
       <w:r>
         <w:t>Table 3. New complete Linux output trials</w:t>
@@ -2447,6 +2739,7 @@
           <w:p>
             <w:pPr>
               <w:spacing w:after="40" w:before="40" w:line="240" w:lineRule="auto"/>
+              <w:ind w:firstLine="0" w:left="0" w:right="0" w:firstLineChars="0" w:leftChars="0" w:rightChars="0"/>
               <w:jc w:val="center"/>
             </w:pPr>
             <w:r>
@@ -2481,6 +2774,7 @@
           <w:p>
             <w:pPr>
               <w:spacing w:after="40" w:before="40" w:line="240" w:lineRule="auto"/>
+              <w:ind w:firstLine="0" w:left="0" w:right="0" w:firstLineChars="0" w:leftChars="0" w:rightChars="0"/>
               <w:jc w:val="center"/>
             </w:pPr>
             <w:r>
@@ -2515,6 +2809,7 @@
           <w:p>
             <w:pPr>
               <w:spacing w:after="40" w:before="40" w:line="240" w:lineRule="auto"/>
+              <w:ind w:firstLine="0" w:left="0" w:right="0" w:firstLineChars="0" w:leftChars="0" w:rightChars="0"/>
               <w:jc w:val="center"/>
             </w:pPr>
             <w:r>
@@ -2549,6 +2844,7 @@
           <w:p>
             <w:pPr>
               <w:spacing w:after="40" w:before="40" w:line="240" w:lineRule="auto"/>
+              <w:ind w:firstLine="0" w:left="0" w:right="0" w:firstLineChars="0" w:leftChars="0" w:rightChars="0"/>
               <w:jc w:val="center"/>
             </w:pPr>
             <w:r>
@@ -2583,6 +2879,7 @@
           <w:p>
             <w:pPr>
               <w:spacing w:after="40" w:before="40" w:line="240" w:lineRule="auto"/>
+              <w:ind w:firstLine="0" w:left="0" w:right="0" w:firstLineChars="0" w:leftChars="0" w:rightChars="0"/>
               <w:jc w:val="center"/>
             </w:pPr>
             <w:r>
@@ -2621,6 +2918,7 @@
           <w:p>
             <w:pPr>
               <w:spacing w:after="40" w:before="40" w:line="240" w:lineRule="auto"/>
+              <w:ind w:firstLine="0" w:left="0" w:right="0" w:firstLineChars="0" w:leftChars="0" w:rightChars="0"/>
               <w:jc w:val="center"/>
             </w:pPr>
             <w:r>
@@ -2661,6 +2959,7 @@
           <w:p>
             <w:pPr>
               <w:spacing w:after="40" w:before="40" w:line="240" w:lineRule="auto"/>
+              <w:ind w:firstLine="0" w:left="0" w:right="0" w:firstLineChars="0" w:leftChars="0" w:rightChars="0"/>
               <w:jc w:val="center"/>
             </w:pPr>
             <w:r>
@@ -2701,6 +3000,7 @@
           <w:p>
             <w:pPr>
               <w:spacing w:after="40" w:before="40" w:line="240" w:lineRule="auto"/>
+              <w:ind w:firstLine="0" w:left="0" w:right="0" w:firstLineChars="0" w:leftChars="0" w:rightChars="0"/>
               <w:jc w:val="center"/>
             </w:pPr>
             <w:r>
@@ -2741,6 +3041,7 @@
           <w:p>
             <w:pPr>
               <w:spacing w:after="40" w:before="40" w:line="240" w:lineRule="auto"/>
+              <w:ind w:firstLine="0" w:left="0" w:right="0" w:firstLineChars="0" w:leftChars="0" w:rightChars="0"/>
               <w:jc w:val="center"/>
             </w:pPr>
             <w:r>
@@ -2781,6 +3082,7 @@
           <w:p>
             <w:pPr>
               <w:spacing w:after="40" w:before="40" w:line="240" w:lineRule="auto"/>
+              <w:ind w:firstLine="0" w:left="0" w:right="0" w:firstLineChars="0" w:leftChars="0" w:rightChars="0"/>
               <w:jc w:val="center"/>
             </w:pPr>
             <w:r>
@@ -2826,6 +3128,7 @@
           <w:p>
             <w:pPr>
               <w:spacing w:after="40" w:before="40" w:line="240" w:lineRule="auto"/>
+              <w:ind w:firstLine="0" w:left="0" w:right="0" w:firstLineChars="0" w:leftChars="0" w:rightChars="0"/>
               <w:jc w:val="center"/>
             </w:pPr>
             <w:r>
@@ -2866,6 +3169,7 @@
           <w:p>
             <w:pPr>
               <w:spacing w:after="40" w:before="40" w:line="240" w:lineRule="auto"/>
+              <w:ind w:firstLine="0" w:left="0" w:right="0" w:firstLineChars="0" w:leftChars="0" w:rightChars="0"/>
               <w:jc w:val="center"/>
             </w:pPr>
             <w:r>
@@ -2906,6 +3210,7 @@
           <w:p>
             <w:pPr>
               <w:spacing w:after="40" w:before="40" w:line="240" w:lineRule="auto"/>
+              <w:ind w:firstLine="0" w:left="0" w:right="0" w:firstLineChars="0" w:leftChars="0" w:rightChars="0"/>
               <w:jc w:val="center"/>
             </w:pPr>
             <w:r>
@@ -2946,6 +3251,7 @@
           <w:p>
             <w:pPr>
               <w:spacing w:after="40" w:before="40" w:line="240" w:lineRule="auto"/>
+              <w:ind w:firstLine="0" w:left="0" w:right="0" w:firstLineChars="0" w:leftChars="0" w:rightChars="0"/>
               <w:jc w:val="center"/>
             </w:pPr>
             <w:r>
@@ -2986,6 +3292,7 @@
           <w:p>
             <w:pPr>
               <w:spacing w:after="40" w:before="40" w:line="240" w:lineRule="auto"/>
+              <w:ind w:firstLine="0" w:left="0" w:right="0" w:firstLineChars="0" w:leftChars="0" w:rightChars="0"/>
               <w:jc w:val="center"/>
             </w:pPr>
             <w:r>
@@ -3031,6 +3338,7 @@
           <w:p>
             <w:pPr>
               <w:spacing w:after="40" w:before="40" w:line="240" w:lineRule="auto"/>
+              <w:ind w:firstLine="0" w:left="0" w:right="0" w:firstLineChars="0" w:leftChars="0" w:rightChars="0"/>
               <w:jc w:val="center"/>
             </w:pPr>
             <w:r>
@@ -3071,6 +3379,7 @@
           <w:p>
             <w:pPr>
               <w:spacing w:after="40" w:before="40" w:line="240" w:lineRule="auto"/>
+              <w:ind w:firstLine="0" w:left="0" w:right="0" w:firstLineChars="0" w:leftChars="0" w:rightChars="0"/>
               <w:jc w:val="center"/>
             </w:pPr>
             <w:r>
@@ -3111,6 +3420,7 @@
           <w:p>
             <w:pPr>
               <w:spacing w:after="40" w:before="40" w:line="240" w:lineRule="auto"/>
+              <w:ind w:firstLine="0" w:left="0" w:right="0" w:firstLineChars="0" w:leftChars="0" w:rightChars="0"/>
               <w:jc w:val="center"/>
             </w:pPr>
             <w:r>
@@ -3151,6 +3461,7 @@
           <w:p>
             <w:pPr>
               <w:spacing w:after="40" w:before="40" w:line="240" w:lineRule="auto"/>
+              <w:ind w:firstLine="0" w:left="0" w:right="0" w:firstLineChars="0" w:leftChars="0" w:rightChars="0"/>
               <w:jc w:val="center"/>
             </w:pPr>
             <w:r>
@@ -3191,6 +3502,7 @@
           <w:p>
             <w:pPr>
               <w:spacing w:after="40" w:before="40" w:line="240" w:lineRule="auto"/>
+              <w:ind w:firstLine="0" w:left="0" w:right="0" w:firstLineChars="0" w:leftChars="0" w:rightChars="0"/>
               <w:jc w:val="center"/>
             </w:pPr>
             <w:r>
@@ -3236,6 +3548,7 @@
           <w:p>
             <w:pPr>
               <w:spacing w:after="40" w:before="40" w:line="240" w:lineRule="auto"/>
+              <w:ind w:firstLine="0" w:left="0" w:right="0" w:firstLineChars="0" w:leftChars="0" w:rightChars="0"/>
               <w:jc w:val="center"/>
             </w:pPr>
             <w:r>
@@ -3276,6 +3589,7 @@
           <w:p>
             <w:pPr>
               <w:spacing w:after="40" w:before="40" w:line="240" w:lineRule="auto"/>
+              <w:ind w:firstLine="0" w:left="0" w:right="0" w:firstLineChars="0" w:leftChars="0" w:rightChars="0"/>
               <w:jc w:val="center"/>
             </w:pPr>
             <w:r>
@@ -3316,6 +3630,7 @@
           <w:p>
             <w:pPr>
               <w:spacing w:after="40" w:before="40" w:line="240" w:lineRule="auto"/>
+              <w:ind w:firstLine="0" w:left="0" w:right="0" w:firstLineChars="0" w:leftChars="0" w:rightChars="0"/>
               <w:jc w:val="center"/>
             </w:pPr>
             <w:r>
@@ -3356,6 +3671,7 @@
           <w:p>
             <w:pPr>
               <w:spacing w:after="40" w:before="40" w:line="240" w:lineRule="auto"/>
+              <w:ind w:firstLine="0" w:left="0" w:right="0" w:firstLineChars="0" w:leftChars="0" w:rightChars="0"/>
               <w:jc w:val="center"/>
             </w:pPr>
             <w:r>
@@ -3396,6 +3712,7 @@
           <w:p>
             <w:pPr>
               <w:spacing w:after="40" w:before="40" w:line="240" w:lineRule="auto"/>
+              <w:ind w:firstLine="0" w:left="0" w:right="0" w:firstLineChars="0" w:leftChars="0" w:rightChars="0"/>
               <w:jc w:val="center"/>
             </w:pPr>
             <w:r>
@@ -3530,6 +3847,7 @@
     <w:p>
       <w:pPr>
         <w:pStyle w:val="Caption"/>
+        <w:keepNext/>
       </w:pPr>
       <w:r>
         <w:t>Table 4. New output and reference verification</w:t>
@@ -3572,6 +3890,7 @@
           <w:p>
             <w:pPr>
               <w:spacing w:after="40" w:before="40" w:line="240" w:lineRule="auto"/>
+              <w:ind w:firstLine="0" w:left="0" w:right="0" w:firstLineChars="0" w:leftChars="0" w:rightChars="0"/>
               <w:jc w:val="left"/>
             </w:pPr>
             <w:r>
@@ -3606,6 +3925,7 @@
           <w:p>
             <w:pPr>
               <w:spacing w:after="40" w:before="40" w:line="240" w:lineRule="auto"/>
+              <w:ind w:firstLine="0" w:left="0" w:right="0" w:firstLineChars="0" w:leftChars="0" w:rightChars="0"/>
               <w:jc w:val="left"/>
             </w:pPr>
             <w:r>
@@ -3644,6 +3964,7 @@
           <w:p>
             <w:pPr>
               <w:spacing w:after="40" w:before="40" w:line="240" w:lineRule="auto"/>
+              <w:ind w:firstLine="0" w:left="0" w:right="0" w:firstLineChars="0" w:leftChars="0" w:rightChars="0"/>
               <w:jc w:val="left"/>
             </w:pPr>
             <w:r>
@@ -3684,6 +4005,7 @@
           <w:p>
             <w:pPr>
               <w:spacing w:after="40" w:before="40" w:line="240" w:lineRule="auto"/>
+              <w:ind w:firstLine="0" w:left="0" w:right="0" w:firstLineChars="0" w:leftChars="0" w:rightChars="0"/>
               <w:jc w:val="left"/>
             </w:pPr>
             <w:r>
@@ -3729,6 +4051,7 @@
           <w:p>
             <w:pPr>
               <w:spacing w:after="40" w:before="40" w:line="240" w:lineRule="auto"/>
+              <w:ind w:firstLine="0" w:left="0" w:right="0" w:firstLineChars="0" w:leftChars="0" w:rightChars="0"/>
               <w:jc w:val="left"/>
             </w:pPr>
             <w:r>
@@ -3769,6 +4092,7 @@
           <w:p>
             <w:pPr>
               <w:spacing w:after="40" w:before="40" w:line="240" w:lineRule="auto"/>
+              <w:ind w:firstLine="0" w:left="0" w:right="0" w:firstLineChars="0" w:leftChars="0" w:rightChars="0"/>
               <w:jc w:val="left"/>
             </w:pPr>
             <w:r>
@@ -3814,6 +4138,7 @@
           <w:p>
             <w:pPr>
               <w:spacing w:after="40" w:before="40" w:line="240" w:lineRule="auto"/>
+              <w:ind w:firstLine="0" w:left="0" w:right="0" w:firstLineChars="0" w:leftChars="0" w:rightChars="0"/>
               <w:jc w:val="left"/>
             </w:pPr>
             <w:r>
@@ -3854,6 +4179,7 @@
           <w:p>
             <w:pPr>
               <w:spacing w:after="40" w:before="40" w:line="240" w:lineRule="auto"/>
+              <w:ind w:firstLine="0" w:left="0" w:right="0" w:firstLineChars="0" w:leftChars="0" w:rightChars="0"/>
               <w:jc w:val="left"/>
             </w:pPr>
             <w:r>
@@ -3899,6 +4225,7 @@
           <w:p>
             <w:pPr>
               <w:spacing w:after="40" w:before="40" w:line="240" w:lineRule="auto"/>
+              <w:ind w:firstLine="0" w:left="0" w:right="0" w:firstLineChars="0" w:leftChars="0" w:rightChars="0"/>
               <w:jc w:val="left"/>
             </w:pPr>
             <w:r>
@@ -3939,6 +4266,7 @@
           <w:p>
             <w:pPr>
               <w:spacing w:after="40" w:before="40" w:line="240" w:lineRule="auto"/>
+              <w:ind w:firstLine="0" w:left="0" w:right="0" w:firstLineChars="0" w:leftChars="0" w:rightChars="0"/>
               <w:jc w:val="left"/>
             </w:pPr>
             <w:r>
@@ -3984,6 +4312,7 @@
           <w:p>
             <w:pPr>
               <w:spacing w:after="40" w:before="40" w:line="240" w:lineRule="auto"/>
+              <w:ind w:firstLine="0" w:left="0" w:right="0" w:firstLineChars="0" w:leftChars="0" w:rightChars="0"/>
               <w:jc w:val="left"/>
             </w:pPr>
             <w:r>
@@ -4024,6 +4353,7 @@
           <w:p>
             <w:pPr>
               <w:spacing w:after="40" w:before="40" w:line="240" w:lineRule="auto"/>
+              <w:ind w:firstLine="0" w:left="0" w:right="0" w:firstLineChars="0" w:leftChars="0" w:rightChars="0"/>
               <w:jc w:val="left"/>
             </w:pPr>
             <w:r>
@@ -4069,6 +4399,7 @@
           <w:p>
             <w:pPr>
               <w:spacing w:after="40" w:before="40" w:line="240" w:lineRule="auto"/>
+              <w:ind w:firstLine="0" w:left="0" w:right="0" w:firstLineChars="0" w:leftChars="0" w:rightChars="0"/>
               <w:jc w:val="left"/>
             </w:pPr>
             <w:r>
@@ -4109,6 +4440,7 @@
           <w:p>
             <w:pPr>
               <w:spacing w:after="40" w:before="40" w:line="240" w:lineRule="auto"/>
+              <w:ind w:firstLine="0" w:left="0" w:right="0" w:firstLineChars="0" w:leftChars="0" w:rightChars="0"/>
               <w:jc w:val="left"/>
             </w:pPr>
             <w:r>
@@ -4154,6 +4486,7 @@
           <w:p>
             <w:pPr>
               <w:spacing w:after="40" w:before="40" w:line="240" w:lineRule="auto"/>
+              <w:ind w:firstLine="0" w:left="0" w:right="0" w:firstLineChars="0" w:leftChars="0" w:rightChars="0"/>
               <w:jc w:val="left"/>
             </w:pPr>
             <w:r>
@@ -4194,6 +4527,7 @@
           <w:p>
             <w:pPr>
               <w:spacing w:after="40" w:before="40" w:line="240" w:lineRule="auto"/>
+              <w:ind w:firstLine="0" w:left="0" w:right="0" w:firstLineChars="0" w:leftChars="0" w:rightChars="0"/>
               <w:jc w:val="left"/>
             </w:pPr>
             <w:r>
@@ -4261,12 +4595,36 @@
         <w:t>10</w:t>
       </w:r>
       <w:r>
-        <w:t>. The compute-only executable was rebuilt from the retained C snapshot with QueryPerformanceCounter around the unchanged Fibonacci function and an exit branch before decimal conversion. Its source, build command, library hash and executable hash are supplied separately from the release. Arithmetic medians were 107.97 s and 122.22 s at the two large indices. The single complete MPIR target run is not presented as a repeated full-output statistic. The first release run's sampler was replaced while preserving its numeric process; the protocol amendment and both memory traces are retained, and that run's wall clock uses the operating-system process creation timestamp to observed exit.</w:t>
+        <w:t>. The compute-only executable was rebuilt from the retained C snapshot with QueryPerformanceCounter around the unchanged Fibonacci function and an exit branch before decimal conversion. Its source, build command, library hash and executable hash are supplied separately from the release. Arithmetic medians were 107.97 s and 122.22 s at the two large indices. At n=10</w:t>
+      </w:r>
+      <w:r>
+        <w:rPr>
+          <w:vertAlign w:val="superscript"/>
+        </w:rPr>
+        <w:t>10</w:t>
+      </w:r>
+      <w:r>
+        <w:t>, 122.22 s is about 2.15 times the WSL2 two-square median of 56.95 s; this descriptive build comparison does not isolate an operating-system effect. The single complete MPIR target run is not presented as a repeated full-output statistic. The first release run's sampler was replaced while preserving its numeric process; the protocol amendment and both memory traces are retained, and that run's wall clock uses the operating-system process creation timestamp to observed exit.</w:t>
+      </w:r>
+    </w:p>
+    <w:p>
+      <w:r>
+        <w:t>Follow-up sink controls used n=10</w:t>
+      </w:r>
+      <w:r>
+        <w:rPr>
+          <w:vertAlign w:val="superscript"/>
+        </w:rPr>
+        <w:t>9</w:t>
+      </w:r>
+      <w:r>
+        <w:t xml:space="preserve"> and three fresh-process trials per condition, with the second round reversing condition order. The unchanged MPIR release had median process wall times 197.00 s to a C: file and 199.37 s to NUL (NUL/file=1.012). The unchanged Linux writer had median conversion-and-close times 37.90 s under WSL2 /tmp and 40.30 s under /mnt/c (/mnt/c-to-/tmp=1.063); fsync remained separate. MPIR includes arithmetic, width correction and status output, so cross-backend endpoints still differ. The stored control files matched by SHA-256; NUL produced no numeric artifact. These are within-backend sink comparisons at one billion, without a target-scale decomposition of the ten-billion timing gap.</w:t>
       </w:r>
     </w:p>
     <w:p>
       <w:pPr>
         <w:pStyle w:val="Caption"/>
+        <w:keepNext/>
       </w:pPr>
       <w:r>
         <w:t>Table 5. MPIR measurements by endpoint and sample size</w:t>
@@ -4312,6 +4670,7 @@
           <w:p>
             <w:pPr>
               <w:spacing w:after="40" w:before="40" w:line="240" w:lineRule="auto"/>
+              <w:ind w:firstLine="0" w:left="0" w:right="0" w:firstLineChars="0" w:leftChars="0" w:rightChars="0"/>
               <w:jc w:val="center"/>
             </w:pPr>
             <w:r>
@@ -4346,6 +4705,7 @@
           <w:p>
             <w:pPr>
               <w:spacing w:after="40" w:before="40" w:line="240" w:lineRule="auto"/>
+              <w:ind w:firstLine="0" w:left="0" w:right="0" w:firstLineChars="0" w:leftChars="0" w:rightChars="0"/>
               <w:jc w:val="center"/>
             </w:pPr>
             <w:r>
@@ -4380,6 +4740,7 @@
           <w:p>
             <w:pPr>
               <w:spacing w:after="40" w:before="40" w:line="240" w:lineRule="auto"/>
+              <w:ind w:firstLine="0" w:left="0" w:right="0" w:firstLineChars="0" w:leftChars="0" w:rightChars="0"/>
               <w:jc w:val="center"/>
             </w:pPr>
             <w:r>
@@ -4414,6 +4775,7 @@
           <w:p>
             <w:pPr>
               <w:spacing w:after="40" w:before="40" w:line="240" w:lineRule="auto"/>
+              <w:ind w:firstLine="0" w:left="0" w:right="0" w:firstLineChars="0" w:leftChars="0" w:rightChars="0"/>
               <w:jc w:val="center"/>
             </w:pPr>
             <w:r>
@@ -4448,6 +4810,7 @@
           <w:p>
             <w:pPr>
               <w:spacing w:after="40" w:before="40" w:line="240" w:lineRule="auto"/>
+              <w:ind w:firstLine="0" w:left="0" w:right="0" w:firstLineChars="0" w:leftChars="0" w:rightChars="0"/>
               <w:jc w:val="center"/>
             </w:pPr>
             <w:r>
@@ -4486,6 +4849,7 @@
           <w:p>
             <w:pPr>
               <w:spacing w:after="40" w:before="40" w:line="240" w:lineRule="auto"/>
+              <w:ind w:firstLine="0" w:left="0" w:right="0" w:firstLineChars="0" w:leftChars="0" w:rightChars="0"/>
               <w:jc w:val="center"/>
             </w:pPr>
             <w:r>
@@ -4535,6 +4899,7 @@
           <w:p>
             <w:pPr>
               <w:spacing w:after="40" w:before="40" w:line="240" w:lineRule="auto"/>
+              <w:ind w:firstLine="0" w:left="0" w:right="0" w:firstLineChars="0" w:leftChars="0" w:rightChars="0"/>
               <w:jc w:val="center"/>
             </w:pPr>
             <w:r>
@@ -4575,6 +4940,7 @@
           <w:p>
             <w:pPr>
               <w:spacing w:after="40" w:before="40" w:line="240" w:lineRule="auto"/>
+              <w:ind w:firstLine="0" w:left="0" w:right="0" w:firstLineChars="0" w:leftChars="0" w:rightChars="0"/>
               <w:jc w:val="center"/>
             </w:pPr>
             <w:r>
@@ -4615,6 +4981,7 @@
           <w:p>
             <w:pPr>
               <w:spacing w:after="40" w:before="40" w:line="240" w:lineRule="auto"/>
+              <w:ind w:firstLine="0" w:left="0" w:right="0" w:firstLineChars="0" w:leftChars="0" w:rightChars="0"/>
               <w:jc w:val="center"/>
             </w:pPr>
             <w:r>
@@ -4655,6 +5022,7 @@
           <w:p>
             <w:pPr>
               <w:spacing w:after="40" w:before="40" w:line="240" w:lineRule="auto"/>
+              <w:ind w:firstLine="0" w:left="0" w:right="0" w:firstLineChars="0" w:leftChars="0" w:rightChars="0"/>
               <w:jc w:val="center"/>
             </w:pPr>
             <w:r>
@@ -4700,6 +5068,7 @@
           <w:p>
             <w:pPr>
               <w:spacing w:after="40" w:before="40" w:line="240" w:lineRule="auto"/>
+              <w:ind w:firstLine="0" w:left="0" w:right="0" w:firstLineChars="0" w:leftChars="0" w:rightChars="0"/>
               <w:jc w:val="center"/>
             </w:pPr>
             <w:r>
@@ -4749,6 +5118,7 @@
           <w:p>
             <w:pPr>
               <w:spacing w:after="40" w:before="40" w:line="240" w:lineRule="auto"/>
+              <w:ind w:firstLine="0" w:left="0" w:right="0" w:firstLineChars="0" w:leftChars="0" w:rightChars="0"/>
               <w:jc w:val="center"/>
             </w:pPr>
             <w:r>
@@ -4789,6 +5159,7 @@
           <w:p>
             <w:pPr>
               <w:spacing w:after="40" w:before="40" w:line="240" w:lineRule="auto"/>
+              <w:ind w:firstLine="0" w:left="0" w:right="0" w:firstLineChars="0" w:leftChars="0" w:rightChars="0"/>
               <w:jc w:val="center"/>
             </w:pPr>
             <w:r>
@@ -4829,6 +5200,7 @@
           <w:p>
             <w:pPr>
               <w:spacing w:after="40" w:before="40" w:line="240" w:lineRule="auto"/>
+              <w:ind w:firstLine="0" w:left="0" w:right="0" w:firstLineChars="0" w:leftChars="0" w:rightChars="0"/>
               <w:jc w:val="center"/>
             </w:pPr>
             <w:r>
@@ -4869,6 +5241,7 @@
           <w:p>
             <w:pPr>
               <w:spacing w:after="40" w:before="40" w:line="240" w:lineRule="auto"/>
+              <w:ind w:firstLine="0" w:left="0" w:right="0" w:firstLineChars="0" w:leftChars="0" w:rightChars="0"/>
               <w:jc w:val="center"/>
             </w:pPr>
             <w:r>
@@ -4914,6 +5287,7 @@
           <w:p>
             <w:pPr>
               <w:spacing w:after="40" w:before="40" w:line="240" w:lineRule="auto"/>
+              <w:ind w:firstLine="0" w:left="0" w:right="0" w:firstLineChars="0" w:leftChars="0" w:rightChars="0"/>
               <w:jc w:val="center"/>
             </w:pPr>
             <w:r>
@@ -4963,6 +5337,7 @@
           <w:p>
             <w:pPr>
               <w:spacing w:after="40" w:before="40" w:line="240" w:lineRule="auto"/>
+              <w:ind w:firstLine="0" w:left="0" w:right="0" w:firstLineChars="0" w:leftChars="0" w:rightChars="0"/>
               <w:jc w:val="center"/>
             </w:pPr>
             <w:r>
@@ -5003,6 +5378,7 @@
           <w:p>
             <w:pPr>
               <w:spacing w:after="40" w:before="40" w:line="240" w:lineRule="auto"/>
+              <w:ind w:firstLine="0" w:left="0" w:right="0" w:firstLineChars="0" w:leftChars="0" w:rightChars="0"/>
               <w:jc w:val="center"/>
             </w:pPr>
             <w:r>
@@ -5043,6 +5419,7 @@
           <w:p>
             <w:pPr>
               <w:spacing w:after="40" w:before="40" w:line="240" w:lineRule="auto"/>
+              <w:ind w:firstLine="0" w:left="0" w:right="0" w:firstLineChars="0" w:leftChars="0" w:rightChars="0"/>
               <w:jc w:val="center"/>
             </w:pPr>
             <w:r>
@@ -5083,6 +5460,7 @@
           <w:p>
             <w:pPr>
               <w:spacing w:after="40" w:before="40" w:line="240" w:lineRule="auto"/>
+              <w:ind w:firstLine="0" w:left="0" w:right="0" w:firstLineChars="0" w:leftChars="0" w:rightChars="0"/>
               <w:jc w:val="center"/>
             </w:pPr>
             <w:r>
@@ -5128,6 +5506,7 @@
           <w:p>
             <w:pPr>
               <w:spacing w:after="40" w:before="40" w:line="240" w:lineRule="auto"/>
+              <w:ind w:firstLine="0" w:left="0" w:right="0" w:firstLineChars="0" w:leftChars="0" w:rightChars="0"/>
               <w:jc w:val="center"/>
             </w:pPr>
             <w:r>
@@ -5177,6 +5556,7 @@
           <w:p>
             <w:pPr>
               <w:spacing w:after="40" w:before="40" w:line="240" w:lineRule="auto"/>
+              <w:ind w:firstLine="0" w:left="0" w:right="0" w:firstLineChars="0" w:leftChars="0" w:rightChars="0"/>
               <w:jc w:val="center"/>
             </w:pPr>
             <w:r>
@@ -5217,6 +5597,7 @@
           <w:p>
             <w:pPr>
               <w:spacing w:after="40" w:before="40" w:line="240" w:lineRule="auto"/>
+              <w:ind w:firstLine="0" w:left="0" w:right="0" w:firstLineChars="0" w:leftChars="0" w:rightChars="0"/>
               <w:jc w:val="center"/>
             </w:pPr>
             <w:r>
@@ -5257,6 +5638,7 @@
           <w:p>
             <w:pPr>
               <w:spacing w:after="40" w:before="40" w:line="240" w:lineRule="auto"/>
+              <w:ind w:firstLine="0" w:left="0" w:right="0" w:firstLineChars="0" w:leftChars="0" w:rightChars="0"/>
               <w:jc w:val="center"/>
             </w:pPr>
             <w:r>
@@ -5297,6 +5679,7 @@
           <w:p>
             <w:pPr>
               <w:spacing w:after="40" w:before="40" w:line="240" w:lineRule="auto"/>
+              <w:ind w:firstLine="0" w:left="0" w:right="0" w:firstLineChars="0" w:leftChars="0" w:rightChars="0"/>
               <w:jc w:val="center"/>
             </w:pPr>
             <w:r>
@@ -5342,6 +5725,7 @@
     </w:p>
     <w:p>
       <w:pPr>
+        <w:keepLines/>
         <w:spacing w:after="140"/>
       </w:pPr>
       <w:r>
@@ -5354,6 +5738,7 @@
     </w:p>
     <w:p>
       <w:pPr>
+        <w:keepLines/>
         <w:spacing w:after="140"/>
       </w:pPr>
       <w:r>
@@ -5427,7 +5812,7 @@
     </w:p>
     <w:p>
       <w:r>
-        <w:t>The software remains MIT-licensed at the pinned public Git revision [4]. Supplementary experiment drivers, raw measurements, environment files, source and binary hashes, failure diagnostics, the isolated square/direct-DLL probes of 16 October 2026, numeric verification manifests and the reference-generation command are supplied with this revision. The new full numeric outputs are retained locally and identified by file hashes; the package does not claim that a public archive or DOI already exists. Historical files retain their original provenance qualifications. Software citation follows version-specific identification [14].</w:t>
+        <w:t>The software remains MIT-licensed at the pinned public Git revision [4]. Supplementary experiment drivers, raw measurements, environment files, source and binary hashes, failure diagnostics, the isolated square/direct-DLL probes of 16 October 2026, numeric verification manifests and the reference-generation command are supplied with this revision. The new full numeric outputs are retained locally and identified by file hashes; the package does not claim that a public archive or DOI already exists. Historical files retain their original provenance qualifications. Software citation follows version-specific identification [16].</w:t>
       </w:r>
     </w:p>
     <w:p>
@@ -5574,7 +5959,7 @@
         <w:jc w:val="left"/>
       </w:pPr>
       <w:r>
-        <w:t>[13] The GNU MP developers. 2023f. Integer Internals. GNU MP 6.3.0 manual. https://gmplib.org/manual/Integer-Internals</w:t>
+        <w:t>[13] MSYS2. n.d. mingw-w64-x86_64-gmp 6.3.0-2 package and build metadata. Accessed 16 October 2026. https://packages.msys2.org/packages/mingw-w64-x86_64-gmp</w:t>
       </w:r>
     </w:p>
     <w:p>
@@ -5584,7 +5969,27 @@
         <w:jc w:val="left"/>
       </w:pPr>
       <w:r>
-        <w:t>[14] Smith AM, Katz DS, Niemeyer KE, FORCE11 Software Citation Working Group. 2016. Software citation principles. PeerJ Computer Science 2:e86. https://doi.org/10.7717/peerj-cs.86</w:t>
+        <w:t>[14] The MPIR contributors. n.d. MPIR Windows source and Win64 definitions. Inspected revision 5e0c2061af105c151970d41c8394ce956f77e455. https://github.com/BrianGladman/mpir/blob/5e0c2061af105c151970d41c8394ce956f77e455/gmp-h.in</w:t>
+      </w:r>
+    </w:p>
+    <w:p>
+      <w:pPr>
+        <w:keepLines/>
+        <w:spacing w:after="80"/>
+        <w:jc w:val="left"/>
+      </w:pPr>
+      <w:r>
+        <w:t>[15] The GNU MP developers. 2023f. Integer Internals. GNU MP 6.3.0 manual. https://gmplib.org/manual/Integer-Internals</w:t>
+      </w:r>
+    </w:p>
+    <w:p>
+      <w:pPr>
+        <w:keepLines/>
+        <w:spacing w:after="80"/>
+        <w:jc w:val="left"/>
+      </w:pPr>
+      <w:r>
+        <w:t>[16] Smith AM, Katz DS, Niemeyer KE, FORCE11 Software Citation Working Group. 2016. Software citation principles. PeerJ Computer Science 2:e86. https://doi.org/10.7717/peerj-cs.86</w:t>
       </w:r>
     </w:p>
     <w:sectPr>
@@ -6113,10 +6518,11 @@
       <w:outlineLvl w:val="2"/>
     </w:pPr>
     <w:rPr>
-      <w:rFonts w:asciiTheme="majorHAnsi" w:eastAsiaTheme="majorEastAsia" w:hAnsiTheme="majorHAnsi" w:cstheme="majorBidi"/>
+      <w:rFonts w:ascii="Times New Roman" w:hAnsi="Times New Roman"/>
       <w:b/>
       <w:bCs/>
       <w:color w:val="000000"/>
+      <w:sz w:val="22"/>
     </w:rPr>
   </w:style>
   <w:style w:type="paragraph" w:styleId="Heading4">

</xml_diff>

<commit_message>
Finalize four manuscripts with FFT diagnosis and controlled timings
</commit_message>
<xml_diff>
--- a/papers/2026-10-16/en/manuscript.docx
+++ b/papers/2026-10-16/en/manuscript.docx
@@ -58,7 +58,7 @@
     </w:p>
     <w:p>
       <w:r>
-        <w:t>We tested complete computation and decimal output of F(10</w:t>
+        <w:t>We computed and wrote F(10</w:t>
       </w:r>
       <w:r>
         <w:rPr>
@@ -67,7 +67,7 @@
         <w:t>10</w:t>
       </w:r>
       <w:r>
-        <w:t>) on a 32 GB home computer using repeated WSL2/Linux trials and native Windows MPIR. Three SHA-256-distinct Windows GMP 6.3.0 DLLs, including an independently sourced MSYS2 package, showed the same adjacent sparse-square outcomes: 2,147,352,576 operand bits succeeded and 2,147,352,577 failed with a wrapped 64-bit allocation request. Asymmetric multiplication also failed, with matched-result tests distinguishing input limb lengths from mathematical result width. Three WSL2 outputs and one MPIR output each contain 2,089,876,403 digits and match a new direct Linux GMP reference by SHA-256. The responsible source expression remains unlocated; results concern the recorded builds and host.</w:t>
+        <w:t>) on a 32 GB home computer and investigated the native Windows failure that had blocked earlier attempts. Three different Windows GMP 6.3.0 DLLs shared an adjacent sparse-square boundary: 2,147,352,576 operand bits succeeded and 2,147,352,577 failed with a wrapped allocation request. Two products both having 4,294,705,089 bits failed or succeeded when their input limb sums were 67,104,769 or 67,104,768, respectively. An FFT size model is consistent with the recorded requests and a predicted step confirmed in all three DLLs; actual MSYS2 instructions and an unwound allocation frame support its signed 32-bit length mechanism. Three WSL2 outputs and one native Windows MPIR output matched a new direct Linux GMP reference, each containing 2,089,876,403 digits. The MSYS2 execution path is corroborated; replication on stable Windows and instruction-level checks of the two wheel DLLs remain open.</w:t>
       </w:r>
     </w:p>
     <w:p>
@@ -108,7 +108,7 @@
     </w:p>
     <w:p>
       <w:r>
-        <w:t>The contribution consists of a complete arithmetic-to-file workflow, a comparison of established algorithm implementations, failure isolation across execution environments, and a bounded-memory procedure for checking archived output. No claim is made to invent fast doubling, to prove a universal library limit, or to establish priority among large Fibonacci computations.</w:t>
+        <w:t>The contribution consists of a complete arithmetic-to-file workflow, a comparison of established algorithm implementations, failure isolation across execution environments, and a bounded-memory procedure for checking archived output. The recurrence methods are established; the evidence comes from complete outputs and reproducible failure tests.</w:t>
       </w:r>
     </w:p>
     <w:p>
@@ -118,7 +118,7 @@
     </w:p>
     <w:p>
       <w:r>
-        <w:t>The project began with naive recursion and matrix exponentiation, followed by fast doubling, Lucas and two-square algorithms. Despite repeated algorithmic improvements, attempts to compute and write the ten-billionth term failed for an extended period. The author's exploratory GitHub search did not locate a directly usable same-scale output record; its queries and date were not retained, so no priority claim follows. Layer diagnostics eventually placed the native Windows failure at a large-integer square. The error appeared to request about 4 GiB, but a full-width allocator trace later showed a request of 2</w:t>
+        <w:t>The project began with naive recursion and matrix exponentiation, followed by fast doubling, Lucas and two-square algorithms. Despite repeated algorithmic improvements, attempts to compute and write the ten-billionth term failed for an extended period. The author's exploratory GitHub search did not locate a directly usable same-scale output record; the search queries and date were not retained. Layer diagnostics eventually placed the native Windows failure at a large-integer square. The error appeared to request about 4 GiB, but a full-width allocator trace later showed a request of 2</w:t>
       </w:r>
       <w:r>
         <w:rPr>
@@ -380,7 +380,7 @@
         <w:t>10</w:t>
       </w:r>
       <w:r>
-        <w:t>, 256-bit and 1024-bit MPFR evaluations both give 2,089,876,402 before adding one; the 1024-bit fractional part is 0.1503023355... and the two values differ by about 1.11e-68. This numerical cross-check is not a formal interval proof. The output length agrees with the resulting 2,089,876,403 digits. A fixed MPFR precision is not presented as a formal certification for arbitrarily large input indices.</w:t>
+        <w:t>, 256-bit and 1024-bit MPFR evaluations both give 2,089,876,402 before adding one; the 1024-bit fractional part is 0.1503023355... and the two values differ by about 1.11e-68. The fractional margin is much larger than the observed precision difference, and the output contains the predicted 2,089,876,403 digits. This is a numerical cross-check for the studied index; a formal interval bound would certify the rounding.</w:t>
       </w:r>
     </w:p>
     <w:p>
@@ -1936,25 +1936,7 @@
     </w:p>
     <w:p>
       <w:r>
-        <w:t>The two wheel binaries are identified as `site-packages/gmpy2.libs/libgmp-10.dll`: gmpy2 2.3.1 SHA-256 `829adcf025d22e641c6816b431fbe5b226a39b390c7205192d480151646fe9c9` and gmpy2 2.2.1 SHA-256 `fb2d312ca861c18e8b23648ac8440b0b613b1930ceff58f48b48ba2d3bd6b186`. An independent MSYS2 mingw-w64-x86_64-gmp 6.3.0-2 package [13] supplies a third DLL, `mingw64/bin/libgmp-10.dll`, SHA-256 `37248cda33845e7c5c35a574e57da762dd0a8268f0270d179f30a33746809681`. Its verified package SHA-256, CI packager, build date and GCC 13.2.0-2 build-environment record are supplied. All three reproduced the adjacent pair. At b=2,147,352,577, the 2.3.1 DLL requested 2</w:t>
-      </w:r>
-      <w:r>
-        <w:rPr>
-          <w:vertAlign w:val="superscript"/>
-        </w:rPr>
-        <w:t>64</w:t>
-      </w:r>
-      <w:r>
-        <w:t>−523,232 bytes; the 2.2.1 DLL requested 2</w:t>
-      </w:r>
-      <w:r>
-        <w:rPr>
-          <w:vertAlign w:val="superscript"/>
-        </w:rPr>
-        <w:t>64</w:t>
-      </w:r>
-      <w:r>
-        <w:t>−523,232 bytes; the MSYS2 DLL requested 2</w:t>
+        <w:t>The two wheel binaries are identified as `site-packages/gmpy2.libs/libgmp-10.dll`: gmpy2 2.3.1 SHA-256 `829adcf025d22e641c6816b431fbe5b226a39b390c7205192d480151646fe9c9` and gmpy2 2.2.1 SHA-256 `fb2d312ca861c18e8b23648ac8440b0b613b1930ceff58f48b48ba2d3bd6b186`. An independent MSYS2 mingw-w64-x86_64-gmp 6.3.0-2 package [13] supplies a third DLL, `mingw64/bin/libgmp-10.dll`, SHA-256 `37248cda33845e7c5c35a574e57da762dd0a8268f0270d179f30a33746809681`. Its verified package SHA-256, CI packager, build date and GCC 13.2.0-2 build-environment record are supplied. All three reproduced the adjacent pair. At b=2,147,352,577, all three DLLs requested 2</w:t>
       </w:r>
       <w:r>
         <w:rPr>
@@ -1982,11 +1964,12 @@
         <w:tblLook w:firstColumn="1" w:firstRow="1" w:lastColumn="0" w:lastRow="0" w:noHBand="0" w:noVBand="1" w:val="04A0"/>
       </w:tblPr>
       <w:tblGrid>
-        <w:gridCol w:w="1805"/>
-        <w:gridCol w:w="1805"/>
-        <w:gridCol w:w="1805"/>
-        <w:gridCol w:w="1805"/>
-        <w:gridCol w:w="1805"/>
+        <w:gridCol w:w="1504"/>
+        <w:gridCol w:w="1504"/>
+        <w:gridCol w:w="1504"/>
+        <w:gridCol w:w="1504"/>
+        <w:gridCol w:w="1504"/>
+        <w:gridCol w:w="1504"/>
       </w:tblGrid>
       <w:tr>
         <w:trPr>
@@ -2030,7 +2013,42 @@
         </w:tc>
         <w:tc>
           <w:tcPr>
-            <w:tcW w:type="dxa" w:w="1822"/>
+            <w:tcW w:type="dxa" w:w="1458"/>
+            <w:tcBorders>
+              <w:top w:val="single" w:sz="4" w:color="D9D9D9"/>
+              <w:left w:val="single" w:sz="4" w:color="D9D9D9"/>
+              <w:bottom w:val="single" w:sz="4" w:color="D9D9D9"/>
+              <w:right w:val="single" w:sz="4" w:color="D9D9D9"/>
+              <w:insideH w:val="single" w:sz="4" w:color="D9D9D9"/>
+              <w:insideV w:val="single" w:sz="4" w:color="D9D9D9"/>
+            </w:tcBorders>
+            <w:tcMar>
+              <w:top w:w="65" w:type="dxa"/>
+              <w:left w:w="65" w:type="dxa"/>
+              <w:bottom w:w="65" w:type="dxa"/>
+              <w:right w:w="65" w:type="dxa"/>
+            </w:tcMar>
+            <w:shd w:fill="EDF0F2"/>
+          </w:tcPr>
+          <w:p>
+            <w:pPr>
+              <w:spacing w:after="40" w:before="40" w:line="240" w:lineRule="auto"/>
+              <w:ind w:firstLine="0" w:left="0" w:right="0" w:firstLineChars="0" w:leftChars="0" w:rightChars="0"/>
+              <w:jc w:val="center"/>
+            </w:pPr>
+            <w:r>
+              <w:rPr>
+                <w:rFonts w:ascii="Times New Roman" w:hAnsi="Times New Roman"/>
+                <w:b/>
+                <w:sz w:val="20"/>
+              </w:rPr>
+              <w:t>Input limb sum</w:t>
+            </w:r>
+          </w:p>
+        </w:tc>
+        <w:tc>
+          <w:tcPr>
+            <w:tcW w:type="dxa" w:w="1458"/>
             <w:tcBorders>
               <w:top w:val="single" w:sz="4" w:color="D9D9D9"/>
               <w:left w:val="single" w:sz="4" w:color="D9D9D9"/>
@@ -2065,7 +2083,7 @@
         </w:tc>
         <w:tc>
           <w:tcPr>
-            <w:tcW w:type="dxa" w:w="1822"/>
+            <w:tcW w:type="dxa" w:w="1458"/>
             <w:tcBorders>
               <w:top w:val="single" w:sz="4" w:color="D9D9D9"/>
               <w:left w:val="single" w:sz="4" w:color="D9D9D9"/>
@@ -2100,7 +2118,7 @@
         </w:tc>
         <w:tc>
           <w:tcPr>
-            <w:tcW w:type="dxa" w:w="1822"/>
+            <w:tcW w:type="dxa" w:w="1458"/>
             <w:tcBorders>
               <w:top w:val="single" w:sz="4" w:color="D9D9D9"/>
               <w:left w:val="single" w:sz="4" w:color="D9D9D9"/>
@@ -2129,13 +2147,13 @@
                 <w:b/>
                 <w:sz w:val="20"/>
               </w:rPr>
-              <w:t>64-bit limbs</w:t>
+              <w:t>Result limbs</w:t>
             </w:r>
           </w:p>
         </w:tc>
         <w:tc>
           <w:tcPr>
-            <w:tcW w:type="dxa" w:w="1822"/>
+            <w:tcW w:type="dxa" w:w="1458"/>
             <w:tcBorders>
               <w:top w:val="single" w:sz="4" w:color="D9D9D9"/>
               <w:left w:val="single" w:sz="4" w:color="D9D9D9"/>
@@ -2164,7 +2182,7 @@
                 <w:b/>
                 <w:sz w:val="20"/>
               </w:rPr>
-              <w:t>Observed result</w:t>
+              <w:t>Outcome</w:t>
             </w:r>
           </w:p>
         </w:tc>
@@ -2216,7 +2234,48 @@
         </w:tc>
         <w:tc>
           <w:tcPr>
-            <w:tcW w:type="dxa" w:w="1822"/>
+            <w:tcW w:type="dxa" w:w="1458"/>
+            <w:tcBorders>
+              <w:top w:val="single" w:sz="4" w:color="D9D9D9"/>
+              <w:left w:val="single" w:sz="4" w:color="D9D9D9"/>
+              <w:bottom w:val="single" w:sz="4" w:color="D9D9D9"/>
+              <w:right w:val="single" w:sz="4" w:color="D9D9D9"/>
+              <w:insideH w:val="single" w:sz="4" w:color="D9D9D9"/>
+              <w:insideV w:val="single" w:sz="4" w:color="D9D9D9"/>
+            </w:tcBorders>
+            <w:tcMar>
+              <w:top w:w="65" w:type="dxa"/>
+              <w:left w:w="65" w:type="dxa"/>
+              <w:bottom w:w="65" w:type="dxa"/>
+              <w:right w:w="65" w:type="dxa"/>
+            </w:tcMar>
+          </w:tcPr>
+          <w:p>
+            <w:pPr>
+              <w:spacing w:after="40" w:before="40" w:line="240" w:lineRule="auto"/>
+              <w:ind w:firstLine="0" w:left="0" w:right="0" w:firstLineChars="0" w:leftChars="0" w:rightChars="0"/>
+              <w:jc w:val="center"/>
+            </w:pPr>
+            <w:r>
+              <w:rPr>
+                <w:rFonts w:ascii="Times New Roman" w:hAnsi="Times New Roman"/>
+                <w:b w:val="0"/>
+                <w:sz w:val="20"/>
+              </w:rPr>
+            </w:r>
+            <w:r>
+              <w:rPr>
+                <w:rFonts w:ascii="Times New Roman" w:hAnsi="Times New Roman"/>
+                <w:b w:val="0"/>
+                <w:sz w:val="20"/>
+              </w:rPr>
+              <w:t>67,104,768</w:t>
+            </w:r>
+          </w:p>
+        </w:tc>
+        <w:tc>
+          <w:tcPr>
+            <w:tcW w:type="dxa" w:w="1458"/>
             <w:tcBorders>
               <w:top w:val="single" w:sz="4" w:color="D9D9D9"/>
               <w:left w:val="single" w:sz="4" w:color="D9D9D9"/>
@@ -2257,7 +2316,7 @@
         </w:tc>
         <w:tc>
           <w:tcPr>
-            <w:tcW w:type="dxa" w:w="1822"/>
+            <w:tcW w:type="dxa" w:w="1458"/>
             <w:tcBorders>
               <w:top w:val="single" w:sz="4" w:color="D9D9D9"/>
               <w:left w:val="single" w:sz="4" w:color="D9D9D9"/>
@@ -2298,7 +2357,7 @@
         </w:tc>
         <w:tc>
           <w:tcPr>
-            <w:tcW w:type="dxa" w:w="1822"/>
+            <w:tcW w:type="dxa" w:w="1458"/>
             <w:tcBorders>
               <w:top w:val="single" w:sz="4" w:color="D9D9D9"/>
               <w:left w:val="single" w:sz="4" w:color="D9D9D9"/>
@@ -2339,7 +2398,7 @@
         </w:tc>
         <w:tc>
           <w:tcPr>
-            <w:tcW w:type="dxa" w:w="1822"/>
+            <w:tcW w:type="dxa" w:w="1458"/>
             <w:tcBorders>
               <w:top w:val="single" w:sz="4" w:color="D9D9D9"/>
               <w:left w:val="single" w:sz="4" w:color="D9D9D9"/>
@@ -2426,7 +2485,48 @@
         </w:tc>
         <w:tc>
           <w:tcPr>
-            <w:tcW w:type="dxa" w:w="1822"/>
+            <w:tcW w:type="dxa" w:w="1458"/>
+            <w:tcBorders>
+              <w:top w:val="single" w:sz="4" w:color="D9D9D9"/>
+              <w:left w:val="single" w:sz="4" w:color="D9D9D9"/>
+              <w:bottom w:val="single" w:sz="4" w:color="D9D9D9"/>
+              <w:right w:val="single" w:sz="4" w:color="D9D9D9"/>
+              <w:insideH w:val="single" w:sz="4" w:color="D9D9D9"/>
+              <w:insideV w:val="single" w:sz="4" w:color="D9D9D9"/>
+            </w:tcBorders>
+            <w:tcMar>
+              <w:top w:w="65" w:type="dxa"/>
+              <w:left w:w="65" w:type="dxa"/>
+              <w:bottom w:w="65" w:type="dxa"/>
+              <w:right w:w="65" w:type="dxa"/>
+            </w:tcMar>
+          </w:tcPr>
+          <w:p>
+            <w:pPr>
+              <w:spacing w:after="40" w:before="40" w:line="240" w:lineRule="auto"/>
+              <w:ind w:firstLine="0" w:left="0" w:right="0" w:firstLineChars="0" w:leftChars="0" w:rightChars="0"/>
+              <w:jc w:val="center"/>
+            </w:pPr>
+            <w:r>
+              <w:rPr>
+                <w:rFonts w:ascii="Times New Roman" w:hAnsi="Times New Roman"/>
+                <w:b w:val="0"/>
+                <w:sz w:val="20"/>
+              </w:rPr>
+            </w:r>
+            <w:r>
+              <w:rPr>
+                <w:rFonts w:ascii="Times New Roman" w:hAnsi="Times New Roman"/>
+                <w:b w:val="0"/>
+                <w:sz w:val="20"/>
+              </w:rPr>
+              <w:t>67,104,770</w:t>
+            </w:r>
+          </w:p>
+        </w:tc>
+        <w:tc>
+          <w:tcPr>
+            <w:tcW w:type="dxa" w:w="1458"/>
             <w:tcBorders>
               <w:top w:val="single" w:sz="4" w:color="D9D9D9"/>
               <w:left w:val="single" w:sz="4" w:color="D9D9D9"/>
@@ -2467,7 +2567,7 @@
         </w:tc>
         <w:tc>
           <w:tcPr>
-            <w:tcW w:type="dxa" w:w="1822"/>
+            <w:tcW w:type="dxa" w:w="1458"/>
             <w:tcBorders>
               <w:top w:val="single" w:sz="4" w:color="D9D9D9"/>
               <w:left w:val="single" w:sz="4" w:color="D9D9D9"/>
@@ -2508,7 +2608,7 @@
         </w:tc>
         <w:tc>
           <w:tcPr>
-            <w:tcW w:type="dxa" w:w="1822"/>
+            <w:tcW w:type="dxa" w:w="1458"/>
             <w:tcBorders>
               <w:top w:val="single" w:sz="4" w:color="D9D9D9"/>
               <w:left w:val="single" w:sz="4" w:color="D9D9D9"/>
@@ -2549,7 +2649,7 @@
         </w:tc>
         <w:tc>
           <w:tcPr>
-            <w:tcW w:type="dxa" w:w="1822"/>
+            <w:tcW w:type="dxa" w:w="1458"/>
             <w:tcBorders>
               <w:top w:val="single" w:sz="4" w:color="D9D9D9"/>
               <w:left w:val="single" w:sz="4" w:color="D9D9D9"/>
@@ -2592,7 +2692,7 @@
     </w:tbl>
     <w:p>
       <w:r>
-        <w:t>The delta column is mathematical result bits minus T. Result widths in failed cases follow from the sparse inputs; no failed result object was recovered. Limbs in this table describe the normalized mathematical result, not an observed FFT workspace length.</w:t>
+        <w:t>The delta column is mathematical result bits minus T. Result widths in failed cases follow from the sparse inputs; no failed result object was recovered. Input limb sums use actual operand lengths. The two normalized mathematical results occupy 67,104,768 and 67,104,769 limbs, respectively.</w:t>
       </w:r>
     </w:p>
     <w:p>
@@ -2604,27 +2704,1384 @@
         </w:numPr>
       </w:pPr>
       <w:r>
-        <w:t>Scope and mechanism tests</w:t>
+        <w:t>Input lengths and FFT mechanism</w:t>
       </w:r>
     </w:p>
     <w:p>
       <w:r>
-        <w:t>A separate C probe compiled against the matching MSYS2 package header measured sizeof(mp_limb_t)=8, sizeof(mp_size_t)=4, sizeof(mp_bitcnt_t)=4 and sizeof(unsigned long)=4 bytes. The two wheel headers were not recovered, so their typedef widths are not established by this header probe. The inspected MPIR Win64 header instead defines 64-bit mp_size_t and mp_bitcnt_t [14]. Thus type widths differ across these builds. This makes 32-bit length or workspace arithmetic a testable hypothesis; a header width alone does not identify which internal operation produced the request. GMP's mpz_t capacity fields count limbs [15], and approximately 67 million limbs remain far below INT_MAX.</w:t>
+        <w:t>A matching-header probe measured 8-byte mp_limb_t and 4-byte mp_size_t, mp_bitcnt_t and unsigned long in MSYS2. The MPIR Win64 header uses 64-bit mp_size_t and mp_bitcnt_t [14]. Matching wheel headers were unavailable. GMP capacity fields count limbs [15]; about 67 million limbs are themselves well below INT_MAX.</w:t>
       </w:r>
     </w:p>
     <w:p>
       <w:r>
-        <w:t>Sofroniou of Wolfram Research reported a GMP 5.1.2 failure on 64-bit Linux: an int multiplication of K and l overflowed before assignment to mp_size_t, then reached allocation as a huge size_t [5]. That historical mechanism motivates checking intermediate arithmetic, rather than assigning its source expression to the present DLLs.</w:t>
+        <w:t>Two distinct-address products have the same mathematical width of 4,294,705,089 bits but differ by one in input limb sum. The larger sum failed and the smaller succeeded in all three DLLs.</w:t>
+      </w:r>
+    </w:p>
+    <w:p>
+      <w:pPr>
+        <w:pStyle w:val="Caption"/>
+        <w:keepNext/>
+      </w:pPr>
+      <w:r>
+        <w:t>Table 3. Equal mathematical result widths with different input limb sums</w:t>
+      </w:r>
+    </w:p>
+    <w:tbl>
+      <w:tblPr>
+        <w:tblW w:type="auto" w:w="0"/>
+        <w:tblLayout w:type="fixed"/>
+        <w:tblLook w:firstColumn="1" w:firstRow="1" w:lastColumn="0" w:lastRow="0" w:noHBand="0" w:noVBand="1" w:val="04A0"/>
+      </w:tblPr>
+      <w:tblGrid>
+        <w:gridCol w:w="2256"/>
+        <w:gridCol w:w="2256"/>
+        <w:gridCol w:w="2256"/>
+        <w:gridCol w:w="2256"/>
+      </w:tblGrid>
+      <w:tr>
+        <w:trPr>
+          <w:cantSplit/>
+          <w:tblHeader/>
+        </w:trPr>
+        <w:tc>
+          <w:tcPr>
+            <w:tcW w:type="dxa" w:w="1710"/>
+            <w:tcBorders>
+              <w:top w:val="single" w:sz="4" w:color="D9D9D9"/>
+              <w:left w:val="single" w:sz="4" w:color="D9D9D9"/>
+              <w:bottom w:val="single" w:sz="4" w:color="D9D9D9"/>
+              <w:right w:val="single" w:sz="4" w:color="D9D9D9"/>
+              <w:insideH w:val="single" w:sz="4" w:color="D9D9D9"/>
+              <w:insideV w:val="single" w:sz="4" w:color="D9D9D9"/>
+            </w:tcBorders>
+            <w:tcMar>
+              <w:top w:w="65" w:type="dxa"/>
+              <w:left w:w="65" w:type="dxa"/>
+              <w:bottom w:w="65" w:type="dxa"/>
+              <w:right w:w="65" w:type="dxa"/>
+            </w:tcMar>
+            <w:shd w:fill="EDF0F2"/>
+          </w:tcPr>
+          <w:p>
+            <w:pPr>
+              <w:spacing w:after="40" w:before="40" w:line="240" w:lineRule="auto"/>
+              <w:ind w:firstLine="0" w:left="0" w:right="0" w:firstLineChars="0" w:leftChars="0" w:rightChars="0"/>
+              <w:jc w:val="center"/>
+            </w:pPr>
+            <w:r>
+              <w:rPr>
+                <w:rFonts w:ascii="Times New Roman" w:hAnsi="Times New Roman"/>
+                <w:b/>
+                <w:sz w:val="20"/>
+              </w:rPr>
+              <w:t>Operand A bits</w:t>
+            </w:r>
+          </w:p>
+        </w:tc>
+        <w:tc>
+          <w:tcPr>
+            <w:tcW w:type="dxa" w:w="2430"/>
+            <w:tcBorders>
+              <w:top w:val="single" w:sz="4" w:color="D9D9D9"/>
+              <w:left w:val="single" w:sz="4" w:color="D9D9D9"/>
+              <w:bottom w:val="single" w:sz="4" w:color="D9D9D9"/>
+              <w:right w:val="single" w:sz="4" w:color="D9D9D9"/>
+              <w:insideH w:val="single" w:sz="4" w:color="D9D9D9"/>
+              <w:insideV w:val="single" w:sz="4" w:color="D9D9D9"/>
+            </w:tcBorders>
+            <w:tcMar>
+              <w:top w:w="65" w:type="dxa"/>
+              <w:left w:w="65" w:type="dxa"/>
+              <w:bottom w:w="65" w:type="dxa"/>
+              <w:right w:w="65" w:type="dxa"/>
+            </w:tcMar>
+            <w:shd w:fill="EDF0F2"/>
+          </w:tcPr>
+          <w:p>
+            <w:pPr>
+              <w:spacing w:after="40" w:before="40" w:line="240" w:lineRule="auto"/>
+              <w:ind w:firstLine="0" w:left="0" w:right="0" w:firstLineChars="0" w:leftChars="0" w:rightChars="0"/>
+              <w:jc w:val="center"/>
+            </w:pPr>
+            <w:r>
+              <w:rPr>
+                <w:rFonts w:ascii="Times New Roman" w:hAnsi="Times New Roman"/>
+                <w:b/>
+                <w:sz w:val="20"/>
+              </w:rPr>
+              <w:t>Operand B bits</w:t>
+            </w:r>
+          </w:p>
+        </w:tc>
+        <w:tc>
+          <w:tcPr>
+            <w:tcW w:type="dxa" w:w="2430"/>
+            <w:tcBorders>
+              <w:top w:val="single" w:sz="4" w:color="D9D9D9"/>
+              <w:left w:val="single" w:sz="4" w:color="D9D9D9"/>
+              <w:bottom w:val="single" w:sz="4" w:color="D9D9D9"/>
+              <w:right w:val="single" w:sz="4" w:color="D9D9D9"/>
+              <w:insideH w:val="single" w:sz="4" w:color="D9D9D9"/>
+              <w:insideV w:val="single" w:sz="4" w:color="D9D9D9"/>
+            </w:tcBorders>
+            <w:tcMar>
+              <w:top w:w="65" w:type="dxa"/>
+              <w:left w:w="65" w:type="dxa"/>
+              <w:bottom w:w="65" w:type="dxa"/>
+              <w:right w:w="65" w:type="dxa"/>
+            </w:tcMar>
+            <w:shd w:fill="EDF0F2"/>
+          </w:tcPr>
+          <w:p>
+            <w:pPr>
+              <w:spacing w:after="40" w:before="40" w:line="240" w:lineRule="auto"/>
+              <w:ind w:firstLine="0" w:left="0" w:right="0" w:firstLineChars="0" w:leftChars="0" w:rightChars="0"/>
+              <w:jc w:val="center"/>
+            </w:pPr>
+            <w:r>
+              <w:rPr>
+                <w:rFonts w:ascii="Times New Roman" w:hAnsi="Times New Roman"/>
+                <w:b/>
+                <w:sz w:val="20"/>
+              </w:rPr>
+              <w:t>Input limb sum</w:t>
+            </w:r>
+          </w:p>
+        </w:tc>
+        <w:tc>
+          <w:tcPr>
+            <w:tcW w:type="dxa" w:w="2430"/>
+            <w:tcBorders>
+              <w:top w:val="single" w:sz="4" w:color="D9D9D9"/>
+              <w:left w:val="single" w:sz="4" w:color="D9D9D9"/>
+              <w:bottom w:val="single" w:sz="4" w:color="D9D9D9"/>
+              <w:right w:val="single" w:sz="4" w:color="D9D9D9"/>
+              <w:insideH w:val="single" w:sz="4" w:color="D9D9D9"/>
+              <w:insideV w:val="single" w:sz="4" w:color="D9D9D9"/>
+            </w:tcBorders>
+            <w:tcMar>
+              <w:top w:w="65" w:type="dxa"/>
+              <w:left w:w="65" w:type="dxa"/>
+              <w:bottom w:w="65" w:type="dxa"/>
+              <w:right w:w="65" w:type="dxa"/>
+            </w:tcMar>
+            <w:shd w:fill="EDF0F2"/>
+          </w:tcPr>
+          <w:p>
+            <w:pPr>
+              <w:spacing w:after="40" w:before="40" w:line="240" w:lineRule="auto"/>
+              <w:ind w:firstLine="0" w:left="0" w:right="0" w:firstLineChars="0" w:leftChars="0" w:rightChars="0"/>
+              <w:jc w:val="center"/>
+            </w:pPr>
+            <w:r>
+              <w:rPr>
+                <w:rFonts w:ascii="Times New Roman" w:hAnsi="Times New Roman"/>
+                <w:b/>
+                <w:sz w:val="20"/>
+              </w:rPr>
+              <w:t>Outcome</w:t>
+            </w:r>
+          </w:p>
+        </w:tc>
+      </w:tr>
+      <w:tr>
+        <w:trPr>
+          <w:cantSplit/>
+        </w:trPr>
+        <w:tc>
+          <w:tcPr>
+            <w:tcW w:type="dxa" w:w="1710"/>
+            <w:tcBorders>
+              <w:top w:val="single" w:sz="4" w:color="D9D9D9"/>
+              <w:left w:val="single" w:sz="4" w:color="D9D9D9"/>
+              <w:bottom w:val="single" w:sz="4" w:color="D9D9D9"/>
+              <w:right w:val="single" w:sz="4" w:color="D9D9D9"/>
+              <w:insideH w:val="single" w:sz="4" w:color="D9D9D9"/>
+              <w:insideV w:val="single" w:sz="4" w:color="D9D9D9"/>
+            </w:tcBorders>
+            <w:tcMar>
+              <w:top w:w="65" w:type="dxa"/>
+              <w:left w:w="65" w:type="dxa"/>
+              <w:bottom w:w="65" w:type="dxa"/>
+              <w:right w:w="65" w:type="dxa"/>
+            </w:tcMar>
+          </w:tcPr>
+          <w:p>
+            <w:pPr>
+              <w:spacing w:after="40" w:before="40" w:line="240" w:lineRule="auto"/>
+              <w:ind w:firstLine="0" w:left="0" w:right="0" w:firstLineChars="0" w:leftChars="0" w:rightChars="0"/>
+              <w:jc w:val="center"/>
+            </w:pPr>
+            <w:r>
+              <w:rPr>
+                <w:rFonts w:ascii="Times New Roman" w:hAnsi="Times New Roman"/>
+                <w:b w:val="0"/>
+                <w:sz w:val="20"/>
+              </w:rPr>
+            </w:r>
+            <w:r>
+              <w:rPr>
+                <w:rFonts w:ascii="Times New Roman" w:hAnsi="Times New Roman"/>
+                <w:b w:val="0"/>
+                <w:sz w:val="20"/>
+              </w:rPr>
+              <w:t>2,147,352,513</w:t>
+            </w:r>
+          </w:p>
+        </w:tc>
+        <w:tc>
+          <w:tcPr>
+            <w:tcW w:type="dxa" w:w="2430"/>
+            <w:tcBorders>
+              <w:top w:val="single" w:sz="4" w:color="D9D9D9"/>
+              <w:left w:val="single" w:sz="4" w:color="D9D9D9"/>
+              <w:bottom w:val="single" w:sz="4" w:color="D9D9D9"/>
+              <w:right w:val="single" w:sz="4" w:color="D9D9D9"/>
+              <w:insideH w:val="single" w:sz="4" w:color="D9D9D9"/>
+              <w:insideV w:val="single" w:sz="4" w:color="D9D9D9"/>
+            </w:tcBorders>
+            <w:tcMar>
+              <w:top w:w="65" w:type="dxa"/>
+              <w:left w:w="65" w:type="dxa"/>
+              <w:bottom w:w="65" w:type="dxa"/>
+              <w:right w:w="65" w:type="dxa"/>
+            </w:tcMar>
+          </w:tcPr>
+          <w:p>
+            <w:pPr>
+              <w:spacing w:after="40" w:before="40" w:line="240" w:lineRule="auto"/>
+              <w:ind w:firstLine="0" w:left="0" w:right="0" w:firstLineChars="0" w:leftChars="0" w:rightChars="0"/>
+              <w:jc w:val="center"/>
+            </w:pPr>
+            <w:r>
+              <w:rPr>
+                <w:rFonts w:ascii="Times New Roman" w:hAnsi="Times New Roman"/>
+                <w:b w:val="0"/>
+                <w:sz w:val="20"/>
+              </w:rPr>
+            </w:r>
+            <w:r>
+              <w:rPr>
+                <w:rFonts w:ascii="Times New Roman" w:hAnsi="Times New Roman"/>
+                <w:b w:val="0"/>
+                <w:sz w:val="20"/>
+              </w:rPr>
+              <w:t>2,147,352,577</w:t>
+            </w:r>
+          </w:p>
+        </w:tc>
+        <w:tc>
+          <w:tcPr>
+            <w:tcW w:type="dxa" w:w="2430"/>
+            <w:tcBorders>
+              <w:top w:val="single" w:sz="4" w:color="D9D9D9"/>
+              <w:left w:val="single" w:sz="4" w:color="D9D9D9"/>
+              <w:bottom w:val="single" w:sz="4" w:color="D9D9D9"/>
+              <w:right w:val="single" w:sz="4" w:color="D9D9D9"/>
+              <w:insideH w:val="single" w:sz="4" w:color="D9D9D9"/>
+              <w:insideV w:val="single" w:sz="4" w:color="D9D9D9"/>
+            </w:tcBorders>
+            <w:tcMar>
+              <w:top w:w="65" w:type="dxa"/>
+              <w:left w:w="65" w:type="dxa"/>
+              <w:bottom w:w="65" w:type="dxa"/>
+              <w:right w:w="65" w:type="dxa"/>
+            </w:tcMar>
+          </w:tcPr>
+          <w:p>
+            <w:pPr>
+              <w:spacing w:after="40" w:before="40" w:line="240" w:lineRule="auto"/>
+              <w:ind w:firstLine="0" w:left="0" w:right="0" w:firstLineChars="0" w:leftChars="0" w:rightChars="0"/>
+              <w:jc w:val="center"/>
+            </w:pPr>
+            <w:r>
+              <w:rPr>
+                <w:rFonts w:ascii="Times New Roman" w:hAnsi="Times New Roman"/>
+                <w:b w:val="0"/>
+                <w:sz w:val="20"/>
+              </w:rPr>
+            </w:r>
+            <w:r>
+              <w:rPr>
+                <w:rFonts w:ascii="Times New Roman" w:hAnsi="Times New Roman"/>
+                <w:b w:val="0"/>
+                <w:sz w:val="20"/>
+              </w:rPr>
+              <w:t>67,104,769</w:t>
+            </w:r>
+          </w:p>
+        </w:tc>
+        <w:tc>
+          <w:tcPr>
+            <w:tcW w:type="dxa" w:w="2430"/>
+            <w:tcBorders>
+              <w:top w:val="single" w:sz="4" w:color="D9D9D9"/>
+              <w:left w:val="single" w:sz="4" w:color="D9D9D9"/>
+              <w:bottom w:val="single" w:sz="4" w:color="D9D9D9"/>
+              <w:right w:val="single" w:sz="4" w:color="D9D9D9"/>
+              <w:insideH w:val="single" w:sz="4" w:color="D9D9D9"/>
+              <w:insideV w:val="single" w:sz="4" w:color="D9D9D9"/>
+            </w:tcBorders>
+            <w:tcMar>
+              <w:top w:w="65" w:type="dxa"/>
+              <w:left w:w="65" w:type="dxa"/>
+              <w:bottom w:w="65" w:type="dxa"/>
+              <w:right w:w="65" w:type="dxa"/>
+            </w:tcMar>
+          </w:tcPr>
+          <w:p>
+            <w:pPr>
+              <w:spacing w:after="40" w:before="40" w:line="240" w:lineRule="auto"/>
+              <w:ind w:firstLine="0" w:left="0" w:right="0" w:firstLineChars="0" w:leftChars="0" w:rightChars="0"/>
+              <w:jc w:val="center"/>
+            </w:pPr>
+            <w:r>
+              <w:rPr>
+                <w:rFonts w:ascii="Times New Roman" w:hAnsi="Times New Roman"/>
+                <w:b w:val="0"/>
+                <w:sz w:val="20"/>
+              </w:rPr>
+            </w:r>
+            <w:r>
+              <w:rPr>
+                <w:rFonts w:ascii="Times New Roman" w:hAnsi="Times New Roman"/>
+                <w:b w:val="0"/>
+                <w:sz w:val="20"/>
+              </w:rPr>
+              <w:t>Failed</w:t>
+            </w:r>
+          </w:p>
+        </w:tc>
+      </w:tr>
+      <w:tr>
+        <w:trPr>
+          <w:cantSplit/>
+        </w:trPr>
+        <w:tc>
+          <w:tcPr>
+            <w:tcW w:type="dxa" w:w="1710"/>
+            <w:tcBorders>
+              <w:top w:val="single" w:sz="4" w:color="D9D9D9"/>
+              <w:left w:val="single" w:sz="4" w:color="D9D9D9"/>
+              <w:bottom w:val="single" w:sz="4" w:color="D9D9D9"/>
+              <w:right w:val="single" w:sz="4" w:color="D9D9D9"/>
+              <w:insideH w:val="single" w:sz="4" w:color="D9D9D9"/>
+              <w:insideV w:val="single" w:sz="4" w:color="D9D9D9"/>
+            </w:tcBorders>
+            <w:tcMar>
+              <w:top w:w="65" w:type="dxa"/>
+              <w:left w:w="65" w:type="dxa"/>
+              <w:bottom w:w="65" w:type="dxa"/>
+              <w:right w:w="65" w:type="dxa"/>
+            </w:tcMar>
+          </w:tcPr>
+          <w:p>
+            <w:pPr>
+              <w:spacing w:after="40" w:before="40" w:line="240" w:lineRule="auto"/>
+              <w:ind w:firstLine="0" w:left="0" w:right="0" w:firstLineChars="0" w:leftChars="0" w:rightChars="0"/>
+              <w:jc w:val="center"/>
+            </w:pPr>
+            <w:r>
+              <w:rPr>
+                <w:rFonts w:ascii="Times New Roman" w:hAnsi="Times New Roman"/>
+                <w:b w:val="0"/>
+                <w:sz w:val="20"/>
+              </w:rPr>
+            </w:r>
+            <w:r>
+              <w:rPr>
+                <w:rFonts w:ascii="Times New Roman" w:hAnsi="Times New Roman"/>
+                <w:b w:val="0"/>
+                <w:sz w:val="20"/>
+              </w:rPr>
+              <w:t>2,147,352,512</w:t>
+            </w:r>
+          </w:p>
+        </w:tc>
+        <w:tc>
+          <w:tcPr>
+            <w:tcW w:type="dxa" w:w="2430"/>
+            <w:tcBorders>
+              <w:top w:val="single" w:sz="4" w:color="D9D9D9"/>
+              <w:left w:val="single" w:sz="4" w:color="D9D9D9"/>
+              <w:bottom w:val="single" w:sz="4" w:color="D9D9D9"/>
+              <w:right w:val="single" w:sz="4" w:color="D9D9D9"/>
+              <w:insideH w:val="single" w:sz="4" w:color="D9D9D9"/>
+              <w:insideV w:val="single" w:sz="4" w:color="D9D9D9"/>
+            </w:tcBorders>
+            <w:tcMar>
+              <w:top w:w="65" w:type="dxa"/>
+              <w:left w:w="65" w:type="dxa"/>
+              <w:bottom w:w="65" w:type="dxa"/>
+              <w:right w:w="65" w:type="dxa"/>
+            </w:tcMar>
+          </w:tcPr>
+          <w:p>
+            <w:pPr>
+              <w:spacing w:after="40" w:before="40" w:line="240" w:lineRule="auto"/>
+              <w:ind w:firstLine="0" w:left="0" w:right="0" w:firstLineChars="0" w:leftChars="0" w:rightChars="0"/>
+              <w:jc w:val="center"/>
+            </w:pPr>
+            <w:r>
+              <w:rPr>
+                <w:rFonts w:ascii="Times New Roman" w:hAnsi="Times New Roman"/>
+                <w:b w:val="0"/>
+                <w:sz w:val="20"/>
+              </w:rPr>
+            </w:r>
+            <w:r>
+              <w:rPr>
+                <w:rFonts w:ascii="Times New Roman" w:hAnsi="Times New Roman"/>
+                <w:b w:val="0"/>
+                <w:sz w:val="20"/>
+              </w:rPr>
+              <w:t>2,147,352,578</w:t>
+            </w:r>
+          </w:p>
+        </w:tc>
+        <w:tc>
+          <w:tcPr>
+            <w:tcW w:type="dxa" w:w="2430"/>
+            <w:tcBorders>
+              <w:top w:val="single" w:sz="4" w:color="D9D9D9"/>
+              <w:left w:val="single" w:sz="4" w:color="D9D9D9"/>
+              <w:bottom w:val="single" w:sz="4" w:color="D9D9D9"/>
+              <w:right w:val="single" w:sz="4" w:color="D9D9D9"/>
+              <w:insideH w:val="single" w:sz="4" w:color="D9D9D9"/>
+              <w:insideV w:val="single" w:sz="4" w:color="D9D9D9"/>
+            </w:tcBorders>
+            <w:tcMar>
+              <w:top w:w="65" w:type="dxa"/>
+              <w:left w:w="65" w:type="dxa"/>
+              <w:bottom w:w="65" w:type="dxa"/>
+              <w:right w:w="65" w:type="dxa"/>
+            </w:tcMar>
+          </w:tcPr>
+          <w:p>
+            <w:pPr>
+              <w:spacing w:after="40" w:before="40" w:line="240" w:lineRule="auto"/>
+              <w:ind w:firstLine="0" w:left="0" w:right="0" w:firstLineChars="0" w:leftChars="0" w:rightChars="0"/>
+              <w:jc w:val="center"/>
+            </w:pPr>
+            <w:r>
+              <w:rPr>
+                <w:rFonts w:ascii="Times New Roman" w:hAnsi="Times New Roman"/>
+                <w:b w:val="0"/>
+                <w:sz w:val="20"/>
+              </w:rPr>
+            </w:r>
+            <w:r>
+              <w:rPr>
+                <w:rFonts w:ascii="Times New Roman" w:hAnsi="Times New Roman"/>
+                <w:b w:val="0"/>
+                <w:sz w:val="20"/>
+              </w:rPr>
+              <w:t>67,104,768</w:t>
+            </w:r>
+          </w:p>
+        </w:tc>
+        <w:tc>
+          <w:tcPr>
+            <w:tcW w:type="dxa" w:w="2430"/>
+            <w:tcBorders>
+              <w:top w:val="single" w:sz="4" w:color="D9D9D9"/>
+              <w:left w:val="single" w:sz="4" w:color="D9D9D9"/>
+              <w:bottom w:val="single" w:sz="4" w:color="D9D9D9"/>
+              <w:right w:val="single" w:sz="4" w:color="D9D9D9"/>
+              <w:insideH w:val="single" w:sz="4" w:color="D9D9D9"/>
+              <w:insideV w:val="single" w:sz="4" w:color="D9D9D9"/>
+            </w:tcBorders>
+            <w:tcMar>
+              <w:top w:w="65" w:type="dxa"/>
+              <w:left w:w="65" w:type="dxa"/>
+              <w:bottom w:w="65" w:type="dxa"/>
+              <w:right w:w="65" w:type="dxa"/>
+            </w:tcMar>
+          </w:tcPr>
+          <w:p>
+            <w:pPr>
+              <w:spacing w:after="40" w:before="40" w:line="240" w:lineRule="auto"/>
+              <w:ind w:firstLine="0" w:left="0" w:right="0" w:firstLineChars="0" w:leftChars="0" w:rightChars="0"/>
+              <w:jc w:val="center"/>
+            </w:pPr>
+            <w:r>
+              <w:rPr>
+                <w:rFonts w:ascii="Times New Roman" w:hAnsi="Times New Roman"/>
+                <w:b w:val="0"/>
+                <w:sz w:val="20"/>
+              </w:rPr>
+            </w:r>
+            <w:r>
+              <w:rPr>
+                <w:rFonts w:ascii="Times New Roman" w:hAnsi="Times New Roman"/>
+                <w:b w:val="0"/>
+                <w:sz w:val="20"/>
+              </w:rPr>
+              <w:t>Succeeded</w:t>
+            </w:r>
+          </w:p>
+        </w:tc>
+      </w:tr>
+    </w:tbl>
+    <w:p>
+      <w:r>
+        <w:t>Both mathematical results occupy 67,104,768 normalized 64-bit limbs. Failed widths are derived from the input powers of two. Every row was tested against all three DLLs.</w:t>
       </w:r>
     </w:p>
     <w:p>
       <w:r>
-        <w:t>At six sampled square widths from 2,147,352,577 through 2,147,483,648 bits, the signed interpretation of the abnormal request stayed at −523,232 bytes. At 2,776,967,654 bits it was −369,632 bytes. Both are multiples of the 8-byte limb size, corresponding arithmetically to −65,404 and −46,204 limb-sized units; this does not prove an internal variable held either negative limb count. The plateau does not support a single nonconstant affine request-versus-raw-bit formula over those samples.</w:t>
+        <w:t>We verified the official gmp-6.3.0.tar.xz archive [16], SHA-256 `a3c2b80201b89e68616f4ad30bc66aee4927c3ce50e33929ca819d5c43538898`. The relevant functions are mpn_mulmod_bnm1_next_size in mulmod_bnm1.c, and mpn_fft_next_size and mpn_mul_fft in mul_fft.c. The default nussbaumer_mul route rounds half the input limb sum s. Let pl denote that rounded half-length; N-prime and n-prime correspond to source variables Nprime and nprime. The negative-workspace path is reproduced by:</w:t>
+      </w:r>
+    </w:p>
+    <w:p>
+      <w:pPr>
+        <w:keepNext/>
+        <w:jc w:val="center"/>
+      </w:pPr>
+      <m:oMath>
+        <m:r>
+          <m:t>h = ⌈</m:t>
+        </m:r>
+        <m:f>
+          <m:num>
+            <m:r>
+              <m:t>s</m:t>
+            </m:r>
+          </m:num>
+          <m:den>
+            <m:r>
+              <m:t>2</m:t>
+            </m:r>
+          </m:den>
+        </m:f>
+        <m:r>
+          <m:t>⌉,  pl = </m:t>
+        </m:r>
+        <m:sSup>
+          <m:e>
+            <m:r>
+              <m:t>2</m:t>
+            </m:r>
+          </m:e>
+          <m:sup>
+            <m:r>
+              <m:t>k</m:t>
+            </m:r>
+          </m:sup>
+        </m:sSup>
+        <m:r>
+          <m:t>⌈</m:t>
+        </m:r>
+        <m:f>
+          <m:num>
+            <m:r>
+              <m:t>h</m:t>
+            </m:r>
+          </m:num>
+          <m:den>
+            <m:r>
+              <m:t>2ᵏ</m:t>
+            </m:r>
+          </m:den>
+        </m:f>
+        <m:r>
+          <m:t>⌉</m:t>
+        </m:r>
+      </m:oMath>
+    </w:p>
+    <w:p>
+      <w:pPr>
+        <w:keepNext/>
+        <w:jc w:val="center"/>
+      </w:pPr>
+      <m:oMath>
+        <m:r>
+          <m:t>N = </m:t>
+        </m:r>
+        <m:sSub>
+          <m:e>
+            <m:r>
+              <m:t>wrap</m:t>
+            </m:r>
+          </m:e>
+          <m:sub>
+            <m:r>
+              <m:t>32</m:t>
+            </m:r>
+          </m:sub>
+        </m:sSub>
+        <m:r>
+          <m:t>(64pl),  M = ⌊</m:t>
+        </m:r>
+        <m:f>
+          <m:num>
+            <m:r>
+              <m:t>N</m:t>
+            </m:r>
+          </m:num>
+          <m:den>
+            <m:r>
+              <m:t>2ᵏ</m:t>
+            </m:r>
+          </m:den>
+        </m:f>
+        <m:r>
+          <m:t>⌋</m:t>
+        </m:r>
+      </m:oMath>
+    </w:p>
+    <w:p>
+      <w:pPr>
+        <w:keepNext/>
+        <w:jc w:val="center"/>
+      </w:pPr>
+      <m:oMath>
+        <m:r>
+          <m:t>W = lcm(64, </m:t>
+        </m:r>
+        <m:sSup>
+          <m:e>
+            <m:r>
+              <m:t>2</m:t>
+            </m:r>
+          </m:e>
+          <m:sup>
+            <m:r>
+              <m:t>k</m:t>
+            </m:r>
+          </m:sup>
+        </m:sSup>
+        <m:r>
+          <m:t>)</m:t>
+        </m:r>
+      </m:oMath>
+    </w:p>
+    <w:p>
+      <w:pPr>
+        <w:keepNext/>
+        <w:jc w:val="center"/>
+      </w:pPr>
+      <m:oMath>
+        <m:r>
+          <m:t>N′ = (1 + </m:t>
+        </m:r>
+        <m:sSub>
+          <m:e>
+            <m:r>
+              <m:t>trunc</m:t>
+            </m:r>
+          </m:e>
+          <m:sub>
+            <m:r>
+              <m:t>0</m:t>
+            </m:r>
+          </m:sub>
+        </m:sSub>
+        <m:r>
+          <m:t>(</m:t>
+        </m:r>
+        <m:f>
+          <m:num>
+            <m:r>
+              <m:t>2M+k+2</m:t>
+            </m:r>
+          </m:num>
+          <m:den>
+            <m:r>
+              <m:t>W</m:t>
+            </m:r>
+          </m:den>
+        </m:f>
+        <m:r>
+          <m:t>)) W</m:t>
+        </m:r>
+      </m:oMath>
+    </w:p>
+    <w:p>
+      <w:pPr>
+        <w:keepNext/>
+        <w:jc w:val="center"/>
+      </w:pPr>
+      <m:oMath>
+        <m:r>
+          <m:t>n′ = </m:t>
+        </m:r>
+        <m:sSub>
+          <m:e>
+            <m:r>
+              <m:t>trunc</m:t>
+            </m:r>
+          </m:e>
+          <m:sub>
+            <m:r>
+              <m:t>0</m:t>
+            </m:r>
+          </m:sub>
+        </m:sSub>
+        <m:r>
+          <m:t>(</m:t>
+        </m:r>
+        <m:f>
+          <m:num>
+            <m:r>
+              <m:t>N′</m:t>
+            </m:r>
+          </m:num>
+          <m:den>
+            <m:r>
+              <m:t>64</m:t>
+            </m:r>
+          </m:den>
+        </m:f>
+        <m:r>
+          <m:t>)</m:t>
+        </m:r>
+      </m:oMath>
+    </w:p>
+    <w:p>
+      <w:pPr>
+        <w:keepNext/>
+        <w:jc w:val="center"/>
+      </w:pPr>
+      <m:oMath>
+        <m:r>
+          <m:t>R = [16(n′+1)+16] mod </m:t>
+        </m:r>
+        <m:sSup>
+          <m:e>
+            <m:r>
+              <m:t>2</m:t>
+            </m:r>
+          </m:e>
+          <m:sup>
+            <m:r>
+              <m:t>64</m:t>
+            </m:r>
+          </m:sup>
+        </m:sSup>
+      </m:oMath>
+    </w:p>
+    <w:p>
+      <w:r>
+        <w:t>Here trunc0 rounds toward zero, and wrap32(x)=((x+2</w:t>
+      </w:r>
+      <w:r>
+        <w:rPr>
+          <w:vertAlign w:val="superscript"/>
+        </w:rPr>
+        <w:t>31</w:t>
+      </w:r>
+      <w:r>
+        <w:t>) mod 2</w:t>
+      </w:r>
+      <w:r>
+        <w:rPr>
+          <w:vertAlign w:val="superscript"/>
+        </w:rPr>
+        <w:t>32</w:t>
+      </w:r>
+      <w:r>
+        <w:t>)−2</w:t>
+      </w:r>
+      <w:r>
+        <w:rPr>
+          <w:vertAlign w:val="superscript"/>
+        </w:rPr>
+        <w:t>31</w:t>
+      </w:r>
+      <w:r>
+        <w:t>. The floor defining M represents the observed arithmetic shift. R is the 64-bit size_t allocation request; the final 16 bytes are the reentrant-allocation header. DLL size-helper queries give k=11. The model explicitly emulates two's-complement wrap; signed C overflow is undefined. Positive n-prime can enter further recursive rounding, so these equations model the observed negative-workspace path rather than the complete FFT implementation.</w:t>
       </w:r>
     </w:p>
     <w:p>
       <w:r>
-        <w:t>Distinct-address multiplication with unequal operand lengths also failed when the mathematical result had exactly T bits. A stronger matched-result test used bit-length pairs (2,147,352,513, 2,147,352,577) and (2,147,352,512, 2,147,352,578). Both mathematical products have 4,294,705,089 bits and 67,104,768 normalized limbs; their input limb sums are respectively 67,104,769 and 67,104,768. The former failed with the wrapped request and the latter succeeded in all three DLLs. These tests rule out mathematical result width or normalized result limb count as the sole trigger in these cases, and show that a square-specific path is not required. Input limb lengths and internal padding/workspace handling are therefore the next quantities to trace. Internal FFT lengths and the first overflowing expression remain unmeasured. All Windows tests used build 27766; no stable-Windows replication has been obtained.</w:t>
+        <w:t>The first observed failure corresponds to 64pl reaching 2</w:t>
+      </w:r>
+      <w:r>
+        <w:rPr>
+          <w:vertAlign w:val="superscript"/>
+        </w:rPr>
+        <w:t>31</w:t>
+      </w:r>
+      <w:r>
+        <w:t>. With k=11, that first crossing is equivalent to s &gt; 2</w:t>
+      </w:r>
+      <w:r>
+        <w:rPr>
+          <w:vertAlign w:val="superscript"/>
+        </w:rPr>
+        <w:t>26</w:t>
+      </w:r>
+      <w:r>
+        <w:t>−2</w:t>
+      </w:r>
+      <w:r>
+        <w:rPr>
+          <w:vertAlign w:val="superscript"/>
+        </w:rPr>
+        <w:t>12</w:t>
+      </w:r>
+      <w:r>
+        <w:t>=67,104,768. Square cases sample L and L+2; paired tests supply L+1. For near-balanced inputs entering this FFT path in these DLLs, a practical guard should switch to a verified backend beyond this size: about 4.29 Gbit of total input, or roughly 1.29 billion decimal digits in scale.</w:t>
+      </w:r>
+    </w:p>
+    <w:p>
+      <w:pPr>
+        <w:pStyle w:val="Caption"/>
+        <w:keepNext/>
+      </w:pPr>
+      <w:r>
+        <w:t>Table 4. FFT allocation model and observed requests</w:t>
+      </w:r>
+    </w:p>
+    <w:tbl>
+      <w:tblPr>
+        <w:tblW w:type="auto" w:w="0"/>
+        <w:tblLayout w:type="fixed"/>
+        <w:tblLook w:firstColumn="1" w:firstRow="1" w:lastColumn="0" w:lastRow="0" w:noHBand="0" w:noVBand="1" w:val="04A0"/>
+      </w:tblPr>
+      <w:tblGrid>
+        <w:gridCol w:w="3009"/>
+        <w:gridCol w:w="3009"/>
+        <w:gridCol w:w="3009"/>
+      </w:tblGrid>
+      <w:tr>
+        <w:trPr>
+          <w:cantSplit/>
+          <w:tblHeader/>
+        </w:trPr>
+        <w:tc>
+          <w:tcPr>
+            <w:tcW w:type="dxa" w:w="1710"/>
+            <w:tcBorders>
+              <w:top w:val="single" w:sz="4" w:color="D9D9D9"/>
+              <w:left w:val="single" w:sz="4" w:color="D9D9D9"/>
+              <w:bottom w:val="single" w:sz="4" w:color="D9D9D9"/>
+              <w:right w:val="single" w:sz="4" w:color="D9D9D9"/>
+              <w:insideH w:val="single" w:sz="4" w:color="D9D9D9"/>
+              <w:insideV w:val="single" w:sz="4" w:color="D9D9D9"/>
+            </w:tcBorders>
+            <w:tcMar>
+              <w:top w:w="65" w:type="dxa"/>
+              <w:left w:w="65" w:type="dxa"/>
+              <w:bottom w:w="65" w:type="dxa"/>
+              <w:right w:w="65" w:type="dxa"/>
+            </w:tcMar>
+            <w:shd w:fill="EDF0F2"/>
+          </w:tcPr>
+          <w:p>
+            <w:pPr>
+              <w:spacing w:after="40" w:before="40" w:line="240" w:lineRule="auto"/>
+              <w:ind w:firstLine="0" w:left="0" w:right="0" w:firstLineChars="0" w:leftChars="0" w:rightChars="0"/>
+              <w:jc w:val="center"/>
+            </w:pPr>
+            <w:r>
+              <w:rPr>
+                <w:rFonts w:ascii="Times New Roman" w:hAnsi="Times New Roman"/>
+                <w:b/>
+                <w:sz w:val="20"/>
+              </w:rPr>
+              <w:t>Input limb sum s</w:t>
+            </w:r>
+          </w:p>
+        </w:tc>
+        <w:tc>
+          <w:tcPr>
+            <w:tcW w:type="dxa" w:w="3645"/>
+            <w:tcBorders>
+              <w:top w:val="single" w:sz="4" w:color="D9D9D9"/>
+              <w:left w:val="single" w:sz="4" w:color="D9D9D9"/>
+              <w:bottom w:val="single" w:sz="4" w:color="D9D9D9"/>
+              <w:right w:val="single" w:sz="4" w:color="D9D9D9"/>
+              <w:insideH w:val="single" w:sz="4" w:color="D9D9D9"/>
+              <w:insideV w:val="single" w:sz="4" w:color="D9D9D9"/>
+            </w:tcBorders>
+            <w:tcMar>
+              <w:top w:w="65" w:type="dxa"/>
+              <w:left w:w="65" w:type="dxa"/>
+              <w:bottom w:w="65" w:type="dxa"/>
+              <w:right w:w="65" w:type="dxa"/>
+            </w:tcMar>
+            <w:shd w:fill="EDF0F2"/>
+          </w:tcPr>
+          <w:p>
+            <w:pPr>
+              <w:spacing w:after="40" w:before="40" w:line="240" w:lineRule="auto"/>
+              <w:ind w:firstLine="0" w:left="0" w:right="0" w:firstLineChars="0" w:leftChars="0" w:rightChars="0"/>
+              <w:jc w:val="center"/>
+            </w:pPr>
+            <w:r>
+              <w:rPr>
+                <w:rFonts w:ascii="Times New Roman" w:hAnsi="Times New Roman"/>
+                <w:b/>
+                <w:sz w:val="20"/>
+              </w:rPr>
+              <w:t>Model signed bytes</w:t>
+            </w:r>
+          </w:p>
+        </w:tc>
+        <w:tc>
+          <w:tcPr>
+            <w:tcW w:type="dxa" w:w="3645"/>
+            <w:tcBorders>
+              <w:top w:val="single" w:sz="4" w:color="D9D9D9"/>
+              <w:left w:val="single" w:sz="4" w:color="D9D9D9"/>
+              <w:bottom w:val="single" w:sz="4" w:color="D9D9D9"/>
+              <w:right w:val="single" w:sz="4" w:color="D9D9D9"/>
+              <w:insideH w:val="single" w:sz="4" w:color="D9D9D9"/>
+              <w:insideV w:val="single" w:sz="4" w:color="D9D9D9"/>
+            </w:tcBorders>
+            <w:tcMar>
+              <w:top w:w="65" w:type="dxa"/>
+              <w:left w:w="65" w:type="dxa"/>
+              <w:bottom w:w="65" w:type="dxa"/>
+              <w:right w:w="65" w:type="dxa"/>
+            </w:tcMar>
+            <w:shd w:fill="EDF0F2"/>
+          </w:tcPr>
+          <w:p>
+            <w:pPr>
+              <w:spacing w:after="40" w:before="40" w:line="240" w:lineRule="auto"/>
+              <w:ind w:firstLine="0" w:left="0" w:right="0" w:firstLineChars="0" w:leftChars="0" w:rightChars="0"/>
+              <w:jc w:val="center"/>
+            </w:pPr>
+            <w:r>
+              <w:rPr>
+                <w:rFonts w:ascii="Times New Roman" w:hAnsi="Times New Roman"/>
+                <w:b/>
+                <w:sz w:val="20"/>
+              </w:rPr>
+              <w:t>Observed signed bytes</w:t>
+            </w:r>
+          </w:p>
+        </w:tc>
+      </w:tr>
+      <w:tr>
+        <w:trPr>
+          <w:cantSplit/>
+        </w:trPr>
+        <w:tc>
+          <w:tcPr>
+            <w:tcW w:type="dxa" w:w="1710"/>
+            <w:tcBorders>
+              <w:top w:val="single" w:sz="4" w:color="D9D9D9"/>
+              <w:left w:val="single" w:sz="4" w:color="D9D9D9"/>
+              <w:bottom w:val="single" w:sz="4" w:color="D9D9D9"/>
+              <w:right w:val="single" w:sz="4" w:color="D9D9D9"/>
+              <w:insideH w:val="single" w:sz="4" w:color="D9D9D9"/>
+              <w:insideV w:val="single" w:sz="4" w:color="D9D9D9"/>
+            </w:tcBorders>
+            <w:tcMar>
+              <w:top w:w="65" w:type="dxa"/>
+              <w:left w:w="65" w:type="dxa"/>
+              <w:bottom w:w="65" w:type="dxa"/>
+              <w:right w:w="65" w:type="dxa"/>
+            </w:tcMar>
+          </w:tcPr>
+          <w:p>
+            <w:pPr>
+              <w:spacing w:after="40" w:before="40" w:line="240" w:lineRule="auto"/>
+              <w:ind w:firstLine="0" w:left="0" w:right="0" w:firstLineChars="0" w:leftChars="0" w:rightChars="0"/>
+              <w:jc w:val="center"/>
+            </w:pPr>
+            <w:r>
+              <w:rPr>
+                <w:rFonts w:ascii="Times New Roman" w:hAnsi="Times New Roman"/>
+                <w:b w:val="0"/>
+                <w:sz w:val="20"/>
+              </w:rPr>
+            </w:r>
+            <w:r>
+              <w:rPr>
+                <w:rFonts w:ascii="Times New Roman" w:hAnsi="Times New Roman"/>
+                <w:b w:val="0"/>
+                <w:sz w:val="20"/>
+              </w:rPr>
+              <w:t>67,104,769</w:t>
+            </w:r>
+          </w:p>
+        </w:tc>
+        <w:tc>
+          <w:tcPr>
+            <w:tcW w:type="dxa" w:w="3645"/>
+            <w:tcBorders>
+              <w:top w:val="single" w:sz="4" w:color="D9D9D9"/>
+              <w:left w:val="single" w:sz="4" w:color="D9D9D9"/>
+              <w:bottom w:val="single" w:sz="4" w:color="D9D9D9"/>
+              <w:right w:val="single" w:sz="4" w:color="D9D9D9"/>
+              <w:insideH w:val="single" w:sz="4" w:color="D9D9D9"/>
+              <w:insideV w:val="single" w:sz="4" w:color="D9D9D9"/>
+            </w:tcBorders>
+            <w:tcMar>
+              <w:top w:w="65" w:type="dxa"/>
+              <w:left w:w="65" w:type="dxa"/>
+              <w:bottom w:w="65" w:type="dxa"/>
+              <w:right w:w="65" w:type="dxa"/>
+            </w:tcMar>
+          </w:tcPr>
+          <w:p>
+            <w:pPr>
+              <w:spacing w:after="40" w:before="40" w:line="240" w:lineRule="auto"/>
+              <w:ind w:firstLine="0" w:left="0" w:right="0" w:firstLineChars="0" w:leftChars="0" w:rightChars="0"/>
+              <w:jc w:val="center"/>
+            </w:pPr>
+            <w:r>
+              <w:rPr>
+                <w:rFonts w:ascii="Times New Roman" w:hAnsi="Times New Roman"/>
+                <w:b w:val="0"/>
+                <w:sz w:val="20"/>
+              </w:rPr>
+            </w:r>
+            <w:r>
+              <w:rPr>
+                <w:rFonts w:ascii="Times New Roman" w:hAnsi="Times New Roman"/>
+                <w:b w:val="0"/>
+                <w:sz w:val="20"/>
+              </w:rPr>
+              <w:t>−523,232</w:t>
+            </w:r>
+          </w:p>
+        </w:tc>
+        <w:tc>
+          <w:tcPr>
+            <w:tcW w:type="dxa" w:w="3645"/>
+            <w:tcBorders>
+              <w:top w:val="single" w:sz="4" w:color="D9D9D9"/>
+              <w:left w:val="single" w:sz="4" w:color="D9D9D9"/>
+              <w:bottom w:val="single" w:sz="4" w:color="D9D9D9"/>
+              <w:right w:val="single" w:sz="4" w:color="D9D9D9"/>
+              <w:insideH w:val="single" w:sz="4" w:color="D9D9D9"/>
+              <w:insideV w:val="single" w:sz="4" w:color="D9D9D9"/>
+            </w:tcBorders>
+            <w:tcMar>
+              <w:top w:w="65" w:type="dxa"/>
+              <w:left w:w="65" w:type="dxa"/>
+              <w:bottom w:w="65" w:type="dxa"/>
+              <w:right w:w="65" w:type="dxa"/>
+            </w:tcMar>
+          </w:tcPr>
+          <w:p>
+            <w:pPr>
+              <w:spacing w:after="40" w:before="40" w:line="240" w:lineRule="auto"/>
+              <w:ind w:firstLine="0" w:left="0" w:right="0" w:firstLineChars="0" w:leftChars="0" w:rightChars="0"/>
+              <w:jc w:val="center"/>
+            </w:pPr>
+            <w:r>
+              <w:rPr>
+                <w:rFonts w:ascii="Times New Roman" w:hAnsi="Times New Roman"/>
+                <w:b w:val="0"/>
+                <w:sz w:val="20"/>
+              </w:rPr>
+            </w:r>
+            <w:r>
+              <w:rPr>
+                <w:rFonts w:ascii="Times New Roman" w:hAnsi="Times New Roman"/>
+                <w:b w:val="0"/>
+                <w:sz w:val="20"/>
+              </w:rPr>
+              <w:t>−523,232</w:t>
+            </w:r>
+          </w:p>
+        </w:tc>
+      </w:tr>
+      <w:tr>
+        <w:trPr>
+          <w:cantSplit/>
+        </w:trPr>
+        <w:tc>
+          <w:tcPr>
+            <w:tcW w:type="dxa" w:w="1710"/>
+            <w:tcBorders>
+              <w:top w:val="single" w:sz="4" w:color="D9D9D9"/>
+              <w:left w:val="single" w:sz="4" w:color="D9D9D9"/>
+              <w:bottom w:val="single" w:sz="4" w:color="D9D9D9"/>
+              <w:right w:val="single" w:sz="4" w:color="D9D9D9"/>
+              <w:insideH w:val="single" w:sz="4" w:color="D9D9D9"/>
+              <w:insideV w:val="single" w:sz="4" w:color="D9D9D9"/>
+            </w:tcBorders>
+            <w:tcMar>
+              <w:top w:w="65" w:type="dxa"/>
+              <w:left w:w="65" w:type="dxa"/>
+              <w:bottom w:w="65" w:type="dxa"/>
+              <w:right w:w="65" w:type="dxa"/>
+            </w:tcMar>
+          </w:tcPr>
+          <w:p>
+            <w:pPr>
+              <w:spacing w:after="40" w:before="40" w:line="240" w:lineRule="auto"/>
+              <w:ind w:firstLine="0" w:left="0" w:right="0" w:firstLineChars="0" w:leftChars="0" w:rightChars="0"/>
+              <w:jc w:val="center"/>
+            </w:pPr>
+            <w:r>
+              <w:rPr>
+                <w:rFonts w:ascii="Times New Roman" w:hAnsi="Times New Roman"/>
+                <w:b w:val="0"/>
+                <w:sz w:val="20"/>
+              </w:rPr>
+            </w:r>
+            <w:r>
+              <w:rPr>
+                <w:rFonts w:ascii="Times New Roman" w:hAnsi="Times New Roman"/>
+                <w:b w:val="0"/>
+                <w:sz w:val="20"/>
+              </w:rPr>
+              <w:t>67,170,305</w:t>
+            </w:r>
+          </w:p>
+        </w:tc>
+        <w:tc>
+          <w:tcPr>
+            <w:tcW w:type="dxa" w:w="3645"/>
+            <w:tcBorders>
+              <w:top w:val="single" w:sz="4" w:color="D9D9D9"/>
+              <w:left w:val="single" w:sz="4" w:color="D9D9D9"/>
+              <w:bottom w:val="single" w:sz="4" w:color="D9D9D9"/>
+              <w:right w:val="single" w:sz="4" w:color="D9D9D9"/>
+              <w:insideH w:val="single" w:sz="4" w:color="D9D9D9"/>
+              <w:insideV w:val="single" w:sz="4" w:color="D9D9D9"/>
+            </w:tcBorders>
+            <w:tcMar>
+              <w:top w:w="65" w:type="dxa"/>
+              <w:left w:w="65" w:type="dxa"/>
+              <w:bottom w:w="65" w:type="dxa"/>
+              <w:right w:w="65" w:type="dxa"/>
+            </w:tcMar>
+          </w:tcPr>
+          <w:p>
+            <w:pPr>
+              <w:spacing w:after="40" w:before="40" w:line="240" w:lineRule="auto"/>
+              <w:ind w:firstLine="0" w:left="0" w:right="0" w:firstLineChars="0" w:leftChars="0" w:rightChars="0"/>
+              <w:jc w:val="center"/>
+            </w:pPr>
+            <w:r>
+              <w:rPr>
+                <w:rFonts w:ascii="Times New Roman" w:hAnsi="Times New Roman"/>
+                <w:b w:val="0"/>
+                <w:sz w:val="20"/>
+              </w:rPr>
+            </w:r>
+            <w:r>
+              <w:rPr>
+                <w:rFonts w:ascii="Times New Roman" w:hAnsi="Times New Roman"/>
+                <w:b w:val="0"/>
+                <w:sz w:val="20"/>
+              </w:rPr>
+              <w:t>−522,720</w:t>
+            </w:r>
+          </w:p>
+        </w:tc>
+        <w:tc>
+          <w:tcPr>
+            <w:tcW w:type="dxa" w:w="3645"/>
+            <w:tcBorders>
+              <w:top w:val="single" w:sz="4" w:color="D9D9D9"/>
+              <w:left w:val="single" w:sz="4" w:color="D9D9D9"/>
+              <w:bottom w:val="single" w:sz="4" w:color="D9D9D9"/>
+              <w:right w:val="single" w:sz="4" w:color="D9D9D9"/>
+              <w:insideH w:val="single" w:sz="4" w:color="D9D9D9"/>
+              <w:insideV w:val="single" w:sz="4" w:color="D9D9D9"/>
+            </w:tcBorders>
+            <w:tcMar>
+              <w:top w:w="65" w:type="dxa"/>
+              <w:left w:w="65" w:type="dxa"/>
+              <w:bottom w:w="65" w:type="dxa"/>
+              <w:right w:w="65" w:type="dxa"/>
+            </w:tcMar>
+          </w:tcPr>
+          <w:p>
+            <w:pPr>
+              <w:spacing w:after="40" w:before="40" w:line="240" w:lineRule="auto"/>
+              <w:ind w:firstLine="0" w:left="0" w:right="0" w:firstLineChars="0" w:leftChars="0" w:rightChars="0"/>
+              <w:jc w:val="center"/>
+            </w:pPr>
+            <w:r>
+              <w:rPr>
+                <w:rFonts w:ascii="Times New Roman" w:hAnsi="Times New Roman"/>
+                <w:b w:val="0"/>
+                <w:sz w:val="20"/>
+              </w:rPr>
+            </w:r>
+            <w:r>
+              <w:rPr>
+                <w:rFonts w:ascii="Times New Roman" w:hAnsi="Times New Roman"/>
+                <w:b w:val="0"/>
+                <w:sz w:val="20"/>
+              </w:rPr>
+              <w:t>−522,720</w:t>
+            </w:r>
+          </w:p>
+        </w:tc>
+      </w:tr>
+      <w:tr>
+        <w:trPr>
+          <w:cantSplit/>
+        </w:trPr>
+        <w:tc>
+          <w:tcPr>
+            <w:tcW w:type="dxa" w:w="1710"/>
+            <w:tcBorders>
+              <w:top w:val="single" w:sz="4" w:color="D9D9D9"/>
+              <w:left w:val="single" w:sz="4" w:color="D9D9D9"/>
+              <w:bottom w:val="single" w:sz="4" w:color="D9D9D9"/>
+              <w:right w:val="single" w:sz="4" w:color="D9D9D9"/>
+              <w:insideH w:val="single" w:sz="4" w:color="D9D9D9"/>
+              <w:insideV w:val="single" w:sz="4" w:color="D9D9D9"/>
+            </w:tcBorders>
+            <w:tcMar>
+              <w:top w:w="65" w:type="dxa"/>
+              <w:left w:w="65" w:type="dxa"/>
+              <w:bottom w:w="65" w:type="dxa"/>
+              <w:right w:w="65" w:type="dxa"/>
+            </w:tcMar>
+          </w:tcPr>
+          <w:p>
+            <w:pPr>
+              <w:spacing w:after="40" w:before="40" w:line="240" w:lineRule="auto"/>
+              <w:ind w:firstLine="0" w:left="0" w:right="0" w:firstLineChars="0" w:leftChars="0" w:rightChars="0"/>
+              <w:jc w:val="center"/>
+            </w:pPr>
+            <w:r>
+              <w:rPr>
+                <w:rFonts w:ascii="Times New Roman" w:hAnsi="Times New Roman"/>
+                <w:b w:val="0"/>
+                <w:sz w:val="20"/>
+              </w:rPr>
+            </w:r>
+            <w:r>
+              <w:rPr>
+                <w:rFonts w:ascii="Times New Roman" w:hAnsi="Times New Roman"/>
+                <w:b w:val="0"/>
+                <w:sz w:val="20"/>
+              </w:rPr>
+              <w:t>86,780,240</w:t>
+            </w:r>
+          </w:p>
+        </w:tc>
+        <w:tc>
+          <w:tcPr>
+            <w:tcW w:type="dxa" w:w="3645"/>
+            <w:tcBorders>
+              <w:top w:val="single" w:sz="4" w:color="D9D9D9"/>
+              <w:left w:val="single" w:sz="4" w:color="D9D9D9"/>
+              <w:bottom w:val="single" w:sz="4" w:color="D9D9D9"/>
+              <w:right w:val="single" w:sz="4" w:color="D9D9D9"/>
+              <w:insideH w:val="single" w:sz="4" w:color="D9D9D9"/>
+              <w:insideV w:val="single" w:sz="4" w:color="D9D9D9"/>
+            </w:tcBorders>
+            <w:tcMar>
+              <w:top w:w="65" w:type="dxa"/>
+              <w:left w:w="65" w:type="dxa"/>
+              <w:bottom w:w="65" w:type="dxa"/>
+              <w:right w:w="65" w:type="dxa"/>
+            </w:tcMar>
+          </w:tcPr>
+          <w:p>
+            <w:pPr>
+              <w:spacing w:after="40" w:before="40" w:line="240" w:lineRule="auto"/>
+              <w:ind w:firstLine="0" w:left="0" w:right="0" w:firstLineChars="0" w:leftChars="0" w:rightChars="0"/>
+              <w:jc w:val="center"/>
+            </w:pPr>
+            <w:r>
+              <w:rPr>
+                <w:rFonts w:ascii="Times New Roman" w:hAnsi="Times New Roman"/>
+                <w:b w:val="0"/>
+                <w:sz w:val="20"/>
+              </w:rPr>
+            </w:r>
+            <w:r>
+              <w:rPr>
+                <w:rFonts w:ascii="Times New Roman" w:hAnsi="Times New Roman"/>
+                <w:b w:val="0"/>
+                <w:sz w:val="20"/>
+              </w:rPr>
+              <w:t>−369,632</w:t>
+            </w:r>
+          </w:p>
+        </w:tc>
+        <w:tc>
+          <w:tcPr>
+            <w:tcW w:type="dxa" w:w="3645"/>
+            <w:tcBorders>
+              <w:top w:val="single" w:sz="4" w:color="D9D9D9"/>
+              <w:left w:val="single" w:sz="4" w:color="D9D9D9"/>
+              <w:bottom w:val="single" w:sz="4" w:color="D9D9D9"/>
+              <w:right w:val="single" w:sz="4" w:color="D9D9D9"/>
+              <w:insideH w:val="single" w:sz="4" w:color="D9D9D9"/>
+              <w:insideV w:val="single" w:sz="4" w:color="D9D9D9"/>
+            </w:tcBorders>
+            <w:tcMar>
+              <w:top w:w="65" w:type="dxa"/>
+              <w:left w:w="65" w:type="dxa"/>
+              <w:bottom w:w="65" w:type="dxa"/>
+              <w:right w:w="65" w:type="dxa"/>
+            </w:tcMar>
+          </w:tcPr>
+          <w:p>
+            <w:pPr>
+              <w:spacing w:after="40" w:before="40" w:line="240" w:lineRule="auto"/>
+              <w:ind w:firstLine="0" w:left="0" w:right="0" w:firstLineChars="0" w:leftChars="0" w:rightChars="0"/>
+              <w:jc w:val="center"/>
+            </w:pPr>
+            <w:r>
+              <w:rPr>
+                <w:rFonts w:ascii="Times New Roman" w:hAnsi="Times New Roman"/>
+                <w:b w:val="0"/>
+                <w:sz w:val="20"/>
+              </w:rPr>
+            </w:r>
+            <w:r>
+              <w:rPr>
+                <w:rFonts w:ascii="Times New Roman" w:hAnsi="Times New Roman"/>
+                <w:b w:val="0"/>
+                <w:sz w:val="20"/>
+              </w:rPr>
+              <w:t>−369,632</w:t>
+            </w:r>
+          </w:p>
+        </w:tc>
+      </w:tr>
+    </w:tbl>
+    <w:p>
+      <w:r>
+        <w:t>Requests are shown as signed 64-bit interpretations; the actual size_t is that value modulo 2</w:t>
+      </w:r>
+      <w:r>
+        <w:rPr>
+          <w:vertAlign w:val="superscript"/>
+        </w:rPr>
+        <w:t>64</w:t>
+      </w:r>
+      <w:r>
+        <w:t>. The first two rows were tested in all three DLLs; the last uses the original gmpy2 full-width trace to check the same model at the larger operand. All rows use k=11. Other sample points are retained in the raw records.</w:t>
+      </w:r>
+    </w:p>
+    <w:p>
+      <w:r>
+        <w:t>Twelve new MSYS2 samples showed that requests stayed at −523,232 above 2</w:t>
+      </w:r>
+      <w:r>
+        <w:rPr>
+          <w:vertAlign w:val="superscript"/>
+        </w:rPr>
+        <w:t>26</w:t>
+      </w:r>
+      <w:r>
+        <w:t>, refuting an immediate-change prediction. A second workspace rounding explains the long plateau. The model then predicted a change to −522,720 between input sums 67,170,304 and 67,170,305; all three DLLs matched the additional tests. The original −369,632 request also follows from the same equations.</w:t>
+      </w:r>
+    </w:p>
+    <w:p>
+      <w:r>
+        <w:t>Local NTFS metadata records the prediction file's last write at 2026-10-16 05:02:40.370418 UTC and the first additional case's stdout creation at 05:02:40.377456 UTC. The prediction file SHA-256 is `1fe694460418a3fa085bf5f50aa5a2296190bcbd17ff0f14c1491cdf2b427358`; its time-and-hash receipt is supplied.</w:t>
+      </w:r>
+    </w:p>
+    <w:p>
+      <w:r>
+        <w:t>The actual MSYS2 DLL adds instruction and runtime-frame evidence. At RVA 0x40202, SHL EDI,6 forms the 32-bit bit length, followed by a signed SAR. The abnormal-allocation return address, RVA 0x4031e, follows the FFT temporary-block call. RtlVirtualUnwind recovered nonvolatile registers giving pl=33,554,432, k=11, Nprime=−2,093,056 and nprime=−32,704, matching the model term by term. Allocator instructions also confirm the 16-byte header. Thus MSYS2 evidence reaches the actual allocation path and intermediate values; the wheels retain agreement in boundaries, requests and the new step.</w:t>
+      </w:r>
+    </w:p>
+    <w:p>
+      <w:r>
+        <w:t>Sofroniou's GMP 5.1.2 type-overflow report [5] supplies historical context. The present localization uses 6.3.0 source, DLL instructions and the measurements above.</w:t>
       </w:r>
     </w:p>
     <w:p>
@@ -2656,7 +4113,7 @@
         <w:t>10</w:t>
       </w:r>
       <w:r>
-        <w:t>. These observations demonstrate two usable execution paths around the observed failure. They do not constitute a patch to the original GMP binary, nor establish that all Windows GMP builds fail or that all Linux builds succeed.</w:t>
+        <w:t>. These observations demonstrate two usable execution paths around the observed failure. These are alternative execution backends for the completed task.</w:t>
       </w:r>
     </w:p>
     <w:p>
@@ -2696,7 +4153,7 @@
         <w:keepNext/>
       </w:pPr>
       <w:r>
-        <w:t>Table 3. New complete Linux output trials</w:t>
+        <w:t>Table 5. New complete Linux output trials</w:t>
       </w:r>
     </w:p>
     <w:tbl>
@@ -3815,6 +5272,7 @@
     </w:p>
     <w:p>
       <w:pPr>
+        <w:keepNext/>
         <w:spacing w:after="20"/>
         <w:jc w:val="center"/>
       </w:pPr>
@@ -3828,6 +5286,7 @@
     </w:p>
     <w:p>
       <w:pPr>
+        <w:keepNext w:val="0"/>
         <w:spacing w:after="20"/>
         <w:jc w:val="center"/>
       </w:pPr>
@@ -3850,7 +5309,7 @@
         <w:keepNext/>
       </w:pPr>
       <w:r>
-        <w:t>Table 4. New output and reference verification</w:t>
+        <w:t>Table 6. New output and reference verification</w:t>
       </w:r>
     </w:p>
     <w:tbl>
@@ -4563,7 +6022,7 @@
     </w:p>
     <w:p>
       <w:r>
-        <w:t>The retained C and Python writers both use 4,000,000-digit leaves, but C calls MPIR mpz_tdiv_qr/mpz_get_str and fwrite whereas Python calls GMP f_divmod/digits and writes through a Python file object. The MPIR release also performs width correction and status reporting. Linux output was written under WSL2 /tmp and Windows output to C:. Conversion, padding, runtime I/O and storage waits were not measured separately, so the timing gap cannot be attributed to any one of them. Retained C source is not a binary-matched rebuild of the release.</w:t>
+        <w:t>Both writers use 4,000,000-digit leaves. The C path calls MPIR mpz_tdiv_qr, mpz_get_str and fwrite; the Python path uses GMP f_divmod, digits and a Python file object. Sink controls test the storage destination; the new instrumented build separately measures in-process conversion work.</w:t>
       </w:r>
     </w:p>
     <w:p>
@@ -4618,7 +6077,44 @@
         <w:t>9</w:t>
       </w:r>
       <w:r>
-        <w:t xml:space="preserve"> and three fresh-process trials per condition, with the second round reversing condition order. The unchanged MPIR release had median process wall times 197.00 s to a C: file and 199.37 s to NUL (NUL/file=1.012). The unchanged Linux writer had median conversion-and-close times 37.90 s under WSL2 /tmp and 40.30 s under /mnt/c (/mnt/c-to-/tmp=1.063); fsync remained separate. MPIR includes arithmetic, width correction and status output, so cross-backend endpoints still differ. The stored control files matched by SHA-256; NUL produced no numeric artifact. These are within-backend sink comparisons at one billion, without a target-scale decomposition of the ten-billion timing gap.</w:t>
+        <w:t xml:space="preserve"> and three fresh-process trials per condition, with the second round reversing condition order. The unchanged MPIR release had median process wall times 197.00 s to a C: file and 199.37 s to NUL (NUL/file=1.012). The unchanged Linux writer had median conversion-and-close times 37.90 s under WSL2 /tmp and 40.30 s under /mnt/c (/mnt/c-to-/tmp=1.063); fsync remained separate. MPIR includes arithmetic, width correction and status output, so cross-backend endpoints still differ. The stored control files matched by SHA-256; NUL produced no numeric artifact. The 185.50 s median in the MPIR table comes from five complete trials on 15 October; the 197.00 s file and 199.37 s NUL medians come from three trials per condition on 16 October. Both batches used the same release executable; run order, background load and cache state differed, so the batches are kept separate. NUL did not reduce elapsed time: storing the result file was not the main bottleneck at one billion. Three further complete n=10</w:t>
+      </w:r>
+      <w:r>
+        <w:rPr>
+          <w:vertAlign w:val="superscript"/>
+        </w:rPr>
+        <w:t>9</w:t>
+      </w:r>
+      <w:r>
+        <w:t xml:space="preserve"> trials used a QueryPerformanceCounter-instrumented retained-source build. Its writer median was 179.62 s: division 111.67 s, leaf mpz_get_str 64.73 s, writer power generation 3.28 s, and leaf padding plus fwrite 0.048 s. The median within-trial share of division plus leaf conversion was 98.10%. In-process arithmetic dominates this output stage. All three payload hashes matched the reference. Source, library and executable hashes identify this new build separately from the release; no additional durable-file synchronization was timed, and the ten-billion release endpoint remains an external total.</w:t>
+      </w:r>
+    </w:p>
+    <w:p>
+      <w:r>
+        <w:t>A same-code Windows comparison replaced only the MPIR header/static library with the matching MSYS2 GMP header/DLL. MSVC x64, /O2/W4 and the C-drive sink were retained. Three n=10</w:t>
+      </w:r>
+      <w:r>
+        <w:rPr>
+          <w:vertAlign w:val="superscript"/>
+        </w:rPr>
+        <w:t>9</w:t>
+      </w:r>
+      <w:r>
+        <w:t xml:space="preserve"> GMP runs had a writer median of 42.92 s, with division 24.71 s and leaf conversion 16.32 s; MPIR gave 179.62 s, 111.67 s and 64.73 s, respectively. All GMP payload hashes matched the reference. The within-Windows comparison places the main difference in the arithmetic library and its build. Separate sequential batches and static versus shared linkage remain changed conditions. Stage medians are computed independently, so their sum need not equal the total median.</w:t>
+      </w:r>
+    </w:p>
+    <w:p>
+      <w:r>
+        <w:t>A further sparse square used b=4,294,967,297. After canonical input construction with the original GMP allocator, multiplication exited in a deeper FFT call on a request of 2</w:t>
+      </w:r>
+      <w:r>
+        <w:rPr>
+          <w:vertAlign w:val="superscript"/>
+        </w:rPr>
+        <w:t>64</w:t>
+      </w:r>
+      <w:r>
+        <w:t>−1,048,032 bytes, without returning a result. The planned post-multiplication popcount and width checks therefore did not run; this case did not demonstrate silent corruption. A preceding public-shift construction failure is retained separately from this multiplication trial.</w:t>
       </w:r>
     </w:p>
     <w:p>
@@ -4627,7 +6123,7 @@
         <w:keepNext/>
       </w:pPr>
       <w:r>
-        <w:t>Table 5. MPIR measurements by endpoint and sample size</w:t>
+        <w:t>Table 7. MPIR measurements by endpoint and sample size</w:t>
       </w:r>
     </w:p>
     <w:tbl>
@@ -5773,7 +7269,7 @@
     </w:p>
     <w:p>
       <w:r>
-        <w:t>The wrapped allocation size is established by the full-width callback and direct DLL probe; the responsible source expression has not been established by a binary-matched source build or native stack analysis. A successful replacement backend demonstrates an operational remedy, not correction of that expression. The new reference has a documented generation chain but shares GMP and established identities with one test path. Modular checks and cross-backend agreement reduce several error risks without providing formal verification. The 2024 file's original supercomputer execution and redistribution rights remain unverified, and a public archival DOI for the new data has not been assigned.</w:t>
+        <w:t>The wrapped allocation size is established by the full-width callback and direct DLL probe; the MSYS2 instruction sequence and recovered allocation-frame values corroborate the N = pl * GMP_NUMB_BITS mechanism. Equivalent instruction-level checks remain to be done for the wheel DLLs. All Windows tests used preview build 27766; stable-Windows replication remains to be done. A successful replacement backend demonstrates an operational remedy, not correction of that expression. The new reference has a documented generation chain but shares GMP and established identities with one test path. Modular checks and cross-backend agreement reduce several error risks without providing formal verification. The 2024 file's original supercomputer execution and redistribution rights remain unverified, and a public archival DOI for the new data has not been assigned.</w:t>
       </w:r>
     </w:p>
     <w:p>
@@ -5790,12 +7286,12 @@
     </w:p>
     <w:p>
       <w:r>
-        <w:t>New experiments demonstrate a reproducible native Windows GMP failure and two completed large-integer output paths on the recorded home computer. Three WSL2 runs and one native MPIR release run each produced the complete ten-billionth Fibonacci number, with recorded runtime and memory evidence and full agreement with a newly generated native GMP reference. Decimal conversion accounts for a median 90.65% of the WSL2 stage total. In this experiment, backend selection, temporary-memory handling and output engineering determine whether an established arithmetic algorithm can deliver a complete artifact. Broader platform claims and the specific overflowing source expression require additional controlled evidence.</w:t>
+        <w:t>New experiments demonstrate a reproducible native Windows GMP failure and two completed large-integer output paths on the recorded home computer. Three WSL2 runs and one native MPIR release run each produced the complete ten-billionth Fibonacci number, with recorded runtime and memory evidence and full agreement with a newly generated native GMP reference. Decimal conversion accounts for a median 90.65% of the WSL2 stage total. In this experiment, backend selection, temporary-memory handling and output engineering determine whether an established arithmetic algorithm can deliver a complete artifact. The FFT size model links the observed failure to a concrete signed-length calculation.</w:t>
       </w:r>
     </w:p>
     <w:p>
       <w:r>
-        <w:t>Full output agrees with direct library evaluation, and modular checks satisfy the tested arithmetic relations. This is consistency evidence: the Linux paths share GMP and established identities, and matching SHA-256 digests do not independently prove numerical correctness. No independent implementation or formal correctness proof is provided.</w:t>
+        <w:t>Complete outputs agree with direct library evaluation and satisfy the tested modular relations. MPIR is a GMP fork with different arithmetic-code versions, so agreement across these backends adds evidence beyond same-library repetition while retaining shared ancestry. The result is inspectable consistency evidence; every digit has not been proved by an independent algorithm.</w:t>
       </w:r>
     </w:p>
     <w:p>
@@ -5812,7 +7308,7 @@
     </w:p>
     <w:p>
       <w:r>
-        <w:t>The software remains MIT-licensed at the pinned public Git revision [4]. Supplementary experiment drivers, raw measurements, environment files, source and binary hashes, failure diagnostics, the isolated square/direct-DLL probes of 16 October 2026, numeric verification manifests and the reference-generation command are supplied with this revision. The new full numeric outputs are retained locally and identified by file hashes; the package does not claim that a public archive or DOI already exists. Historical files retain their original provenance qualifications. Software citation follows version-specific identification [16].</w:t>
+        <w:t>The software remains MIT-licensed at the pinned public Git revision [4]. Supplementary experiment drivers, raw measurements, environment files, source and binary hashes, failure diagnostics, the isolated square/direct-DLL probes of 16 October 2026, numeric verification manifests and the reference-generation command are supplied with this revision. The new full numeric outputs are retained locally and identified by file hashes; public archival deposition and DOI assignment remain to be completed. Historical files retain their original provenance qualifications. Software citation follows version-specific identification [17].</w:t>
       </w:r>
     </w:p>
     <w:p>
@@ -5989,7 +7485,17 @@
         <w:jc w:val="left"/>
       </w:pPr>
       <w:r>
-        <w:t>[16] Smith AM, Katz DS, Niemeyer KE, FORCE11 Software Citation Working Group. 2016. Software citation principles. PeerJ Computer Science 2:e86. https://doi.org/10.7717/peerj-cs.86</w:t>
+        <w:t>[16] The GNU MP developers. 2023g. GNU MP 6.3.0 source archive. Inspected mul_fft.c, mulmod_bnm1.c, nussbaumer_mul.c, gmp-impl.h and tal-reent.c. https://ftp.gnu.org/gnu/gmp/gmp-6.3.0.tar.xz</w:t>
+      </w:r>
+    </w:p>
+    <w:p>
+      <w:pPr>
+        <w:keepLines/>
+        <w:spacing w:after="80"/>
+        <w:jc w:val="left"/>
+      </w:pPr>
+      <w:r>
+        <w:t>[17] Smith AM, Katz DS, Niemeyer KE, FORCE11 Software Citation Working Group. 2016. Software citation principles. PeerJ Computer Science 2:e86. https://doi.org/10.7717/peerj-cs.86</w:t>
       </w:r>
     </w:p>
     <w:sectPr>

</xml_diff>